<commit_message>
Business analysts: Business Requirements Document, Process Flow Document, refreshed product functionality, compliance matrix and fit-gap register
New 05_Delivery/BrokerVerse_Business_Requirements_Document (source brd.md): business context, stakeholders and
personas, scope, 163 requirements BR-xx-nnn over the 15 process areas with priority, regulatory source and the
screen that meets each, non-functional requirements and the functional specification by module.
New 05_Delivery/BrokerVerse_Process_Flow_Document (source process-flows.md): 19 end-to-end flows with swimlane
diagrams drawn by tools/process-flows/render.py from flows.py.
Product Functionality 1.1 and Regulatory Compliance Matrix 1.1 cover the IC, NPC and AML compliance, BIR, operations,
distribution, integrations, branding and go-live modules. Fit-Gap Register: sheet Product Gaps Closed.
</commit_message>
<xml_diff>
--- a/docs/package/05_Delivery/BrokerVerse_Philippine_Regulatory_Compliance_Matrix.docx
+++ b/docs/package/05_Delivery/BrokerVerse_Philippine_Regulatory_Compliance_Matrix.docx
@@ -10,7 +10,7 @@
       <w:r>
         <w:rPr/>
         <w:drawing>
-          <wp:anchor behindDoc="1" distT="0" distB="0" distL="0" distR="0" simplePos="0" locked="0" layoutInCell="0" allowOverlap="1" relativeHeight="22">
+          <wp:anchor behindDoc="1" distT="0" distB="0" distL="0" distR="0" simplePos="0" locked="0" layoutInCell="0" allowOverlap="1" relativeHeight="28">
             <wp:simplePos x="0" y="0"/>
             <wp:positionH relativeFrom="margin">
               <wp:posOffset>-914400</wp:posOffset>
@@ -55,7 +55,7 @@
           </wp:anchor>
         </w:drawing>
         <w:drawing>
-          <wp:anchor behindDoc="1" distT="0" distB="0" distL="0" distR="0" simplePos="0" locked="0" layoutInCell="0" allowOverlap="1" relativeHeight="33">
+          <wp:anchor behindDoc="1" distT="0" distB="0" distL="0" distR="0" simplePos="0" locked="0" layoutInCell="0" allowOverlap="1" relativeHeight="39">
             <wp:simplePos x="0" y="0"/>
             <wp:positionH relativeFrom="margin">
               <wp:align>center</wp:align>
@@ -111,7 +111,7 @@
         <mc:AlternateContent>
           <mc:Choice Requires="wps">
             <w:drawing>
-              <wp:anchor behindDoc="0" distT="45720" distB="45720" distL="114300" distR="114300" simplePos="0" locked="0" layoutInCell="0" allowOverlap="1" relativeHeight="23" wp14:anchorId="3D43415C">
+              <wp:anchor behindDoc="0" distT="45720" distB="45720" distL="114300" distR="114300" simplePos="0" locked="0" layoutInCell="0" allowOverlap="1" relativeHeight="29" wp14:anchorId="3D43415C">
                 <wp:simplePos x="0" y="0"/>
                 <wp:positionH relativeFrom="page">
                   <wp:posOffset>194310</wp:posOffset>
@@ -226,7 +226,7 @@
         <mc:AlternateContent>
           <mc:Choice Requires="wps">
             <w:drawing>
-              <wp:anchor behindDoc="0" distT="45720" distB="45720" distL="113030" distR="114935" simplePos="0" locked="0" layoutInCell="0" allowOverlap="1" relativeHeight="25" wp14:anchorId="58C23128">
+              <wp:anchor behindDoc="0" distT="45720" distB="45720" distL="113030" distR="114935" simplePos="0" locked="0" layoutInCell="0" allowOverlap="1" relativeHeight="31" wp14:anchorId="58C23128">
                 <wp:simplePos x="0" y="0"/>
                 <wp:positionH relativeFrom="page">
                   <wp:posOffset>3094990</wp:posOffset>
@@ -285,7 +285,7 @@
                                 <w:bCs/>
                                 <w:color w:val="1D74BA"/>
                               </w:rPr>
-                              <w:t>1.0</w:t>
+                              <w:t>1.1</w:t>
                             </w:r>
                           </w:p>
                         </w:txbxContent>
@@ -328,7 +328,7 @@
                           <w:bCs/>
                           <w:color w:val="1D74BA"/>
                         </w:rPr>
-                        <w:t>1.0</w:t>
+                        <w:t>1.1</w:t>
                       </w:r>
                     </w:p>
                   </w:txbxContent>
@@ -341,7 +341,7 @@
         <mc:AlternateContent>
           <mc:Choice Requires="wps">
             <w:drawing>
-              <wp:anchor behindDoc="0" distT="45720" distB="45720" distL="114300" distR="113665" simplePos="0" locked="0" layoutInCell="0" allowOverlap="1" relativeHeight="27" wp14:anchorId="1BF25123">
+              <wp:anchor behindDoc="0" distT="45720" distB="45720" distL="114300" distR="113665" simplePos="0" locked="0" layoutInCell="0" allowOverlap="1" relativeHeight="33" wp14:anchorId="1BF25123">
                 <wp:simplePos x="0" y="0"/>
                 <wp:positionH relativeFrom="page">
                   <wp:posOffset>4992370</wp:posOffset>
@@ -400,7 +400,7 @@
                                 <w:bCs/>
                                 <w:color w:val="1D74BA"/>
                               </w:rPr>
-                              <w:t>03 October 2026</w:t>
+                              <w:t>04 October 2026</w:t>
                             </w:r>
                           </w:p>
                         </w:txbxContent>
@@ -443,7 +443,7 @@
                           <w:bCs/>
                           <w:color w:val="1D74BA"/>
                         </w:rPr>
-                        <w:t>03 October 2026</w:t>
+                        <w:t>04 October 2026</w:t>
                       </w:r>
                     </w:p>
                   </w:txbxContent>
@@ -456,7 +456,7 @@
         <mc:AlternateContent>
           <mc:Choice Requires="wps">
             <w:drawing>
-              <wp:anchor behindDoc="0" distT="45720" distB="46355" distL="114300" distR="114300" simplePos="0" locked="0" layoutInCell="0" allowOverlap="1" relativeHeight="29" wp14:anchorId="01DE2BF4">
+              <wp:anchor behindDoc="0" distT="45720" distB="46355" distL="114300" distR="114300" simplePos="0" locked="0" layoutInCell="0" allowOverlap="1" relativeHeight="35" wp14:anchorId="01DE2BF4">
                 <wp:simplePos x="0" y="0"/>
                 <wp:positionH relativeFrom="margin">
                   <wp:align>center</wp:align>
@@ -601,7 +601,7 @@
         <mc:AlternateContent>
           <mc:Choice Requires="wps">
             <w:drawing>
-              <wp:anchor behindDoc="0" distT="45720" distB="50800" distL="114300" distR="114300" simplePos="0" locked="0" layoutInCell="0" allowOverlap="1" relativeHeight="31" wp14:anchorId="204C02CC">
+              <wp:anchor behindDoc="0" distT="45720" distB="50800" distL="114300" distR="114300" simplePos="0" locked="0" layoutInCell="0" allowOverlap="1" relativeHeight="37" wp14:anchorId="204C02CC">
                 <wp:simplePos x="0" y="0"/>
                 <wp:positionH relativeFrom="margin">
                   <wp:align>center</wp:align>
@@ -789,7 +789,7 @@
             </w:rPr>
             <w:fldChar w:fldCharType="separate"/>
           </w:r>
-          <w:hyperlink w:anchor="__RefHeading___Toc144145_3199679052">
+          <w:hyperlink w:anchor="__RefHeading___Toc12242_3960898926">
             <w:r>
               <w:rPr>
                 <w:webHidden/>
@@ -824,7 +824,7 @@
             </w:tabs>
             <w:rPr/>
           </w:pPr>
-          <w:hyperlink w:anchor="__RefHeading___Toc144147_3199679052">
+          <w:hyperlink w:anchor="__RefHeading___Toc12244_3960898926">
             <w:r>
               <w:rPr>
                 <w:webHidden/>
@@ -853,7 +853,7 @@
             </w:tabs>
             <w:rPr/>
           </w:pPr>
-          <w:hyperlink w:anchor="__RefHeading___Toc144149_3199679052">
+          <w:hyperlink w:anchor="__RefHeading___Toc12246_3960898926">
             <w:r>
               <w:rPr>
                 <w:webHidden/>
@@ -875,7 +875,7 @@
             </w:tabs>
             <w:rPr/>
           </w:pPr>
-          <w:hyperlink w:anchor="__RefHeading___Toc144151_3199679052">
+          <w:hyperlink w:anchor="__RefHeading___Toc12248_3960898926">
             <w:r>
               <w:rPr>
                 <w:webHidden/>
@@ -897,7 +897,7 @@
             </w:tabs>
             <w:rPr/>
           </w:pPr>
-          <w:hyperlink w:anchor="__RefHeading___Toc144153_3199679052">
+          <w:hyperlink w:anchor="__RefHeading___Toc12250_3960898926">
             <w:r>
               <w:rPr>
                 <w:webHidden/>
@@ -905,7 +905,29 @@
               </w:rPr>
               <w:t>3.2 How to read this matrix</w:t>
               <w:tab/>
-              <w:t>4</w:t>
+              <w:t>5</w:t>
+            </w:r>
+          </w:hyperlink>
+        </w:p>
+        <w:p>
+          <w:pPr>
+            <w:pStyle w:val="TOC2"/>
+            <w:tabs>
+              <w:tab w:val="clear" w:pos="900"/>
+              <w:tab w:val="clear" w:pos="9350"/>
+              <w:tab w:val="right" w:pos="9025" w:leader="dot"/>
+            </w:tabs>
+            <w:rPr/>
+          </w:pPr>
+          <w:hyperlink w:anchor="__RefHeading___Toc12252_3960898926">
+            <w:r>
+              <w:rPr>
+                <w:webHidden/>
+                <w:rStyle w:val="IndexLink"/>
+              </w:rPr>
+              <w:t>3.3 Version history</w:t>
+              <w:tab/>
+              <w:t>5</w:t>
             </w:r>
           </w:hyperlink>
         </w:p>
@@ -919,7 +941,7 @@
             </w:tabs>
             <w:rPr/>
           </w:pPr>
-          <w:hyperlink w:anchor="__RefHeading___Toc144155_3199679052">
+          <w:hyperlink w:anchor="__RefHeading___Toc12254_3960898926">
             <w:r>
               <w:rPr>
                 <w:webHidden/>
@@ -941,7 +963,7 @@
             </w:tabs>
             <w:rPr/>
           </w:pPr>
-          <w:hyperlink w:anchor="__RefHeading___Toc144157_3199679052">
+          <w:hyperlink w:anchor="__RefHeading___Toc12256_3960898926">
             <w:r>
               <w:rPr>
                 <w:webHidden/>
@@ -963,7 +985,7 @@
             </w:tabs>
             <w:rPr/>
           </w:pPr>
-          <w:hyperlink w:anchor="__RefHeading___Toc144159_3199679052">
+          <w:hyperlink w:anchor="__RefHeading___Toc12258_3960898926">
             <w:r>
               <w:rPr>
                 <w:webHidden/>
@@ -971,7 +993,7 @@
               </w:rPr>
               <w:t>6. BIR: taxes, receipts and books</w:t>
               <w:tab/>
-              <w:t>9</w:t>
+              <w:t>11</w:t>
             </w:r>
           </w:hyperlink>
         </w:p>
@@ -985,7 +1007,7 @@
             </w:tabs>
             <w:rPr/>
           </w:pPr>
-          <w:hyperlink w:anchor="__RefHeading___Toc144161_3199679052">
+          <w:hyperlink w:anchor="__RefHeading___Toc12260_3960898926">
             <w:r>
               <w:rPr>
                 <w:webHidden/>
@@ -993,7 +1015,7 @@
               </w:rPr>
               <w:t>6.1 Books of accounts and Computerized Accounting System</w:t>
               <w:tab/>
-              <w:t>9</w:t>
+              <w:t>11</w:t>
             </w:r>
           </w:hyperlink>
         </w:p>
@@ -1007,7 +1029,7 @@
             </w:tabs>
             <w:rPr/>
           </w:pPr>
-          <w:hyperlink w:anchor="__RefHeading___Toc144163_3199679052">
+          <w:hyperlink w:anchor="__RefHeading___Toc12262_3960898926">
             <w:r>
               <w:rPr>
                 <w:webHidden/>
@@ -1015,7 +1037,7 @@
               </w:rPr>
               <w:t>6.2 Invoices and receipts</w:t>
               <w:tab/>
-              <w:t>9</w:t>
+              <w:t>12</w:t>
             </w:r>
           </w:hyperlink>
         </w:p>
@@ -1029,7 +1051,7 @@
             </w:tabs>
             <w:rPr/>
           </w:pPr>
-          <w:hyperlink w:anchor="__RefHeading___Toc144165_3199679052">
+          <w:hyperlink w:anchor="__RefHeading___Toc12264_3960898926">
             <w:r>
               <w:rPr>
                 <w:webHidden/>
@@ -1037,7 +1059,7 @@
               </w:rPr>
               <w:t>6.3 VAT or percentage tax on commission</w:t>
               <w:tab/>
-              <w:t>10</w:t>
+              <w:t>12</w:t>
             </w:r>
           </w:hyperlink>
         </w:p>
@@ -1051,7 +1073,7 @@
             </w:tabs>
             <w:rPr/>
           </w:pPr>
-          <w:hyperlink w:anchor="__RefHeading___Toc144167_3199679052">
+          <w:hyperlink w:anchor="__RefHeading___Toc12266_3960898926">
             <w:r>
               <w:rPr>
                 <w:webHidden/>
@@ -1059,7 +1081,7 @@
               </w:rPr>
               <w:t>6.4 Withholding taxes</w:t>
               <w:tab/>
-              <w:t>10</w:t>
+              <w:t>13</w:t>
             </w:r>
           </w:hyperlink>
         </w:p>
@@ -1073,7 +1095,7 @@
             </w:tabs>
             <w:rPr/>
           </w:pPr>
-          <w:hyperlink w:anchor="__RefHeading___Toc144169_3199679052">
+          <w:hyperlink w:anchor="__RefHeading___Toc12268_3960898926">
             <w:r>
               <w:rPr>
                 <w:webHidden/>
@@ -1081,7 +1103,7 @@
               </w:rPr>
               <w:t>6.5 Summary lists and alphalists</w:t>
               <w:tab/>
-              <w:t>11</w:t>
+              <w:t>14</w:t>
             </w:r>
           </w:hyperlink>
         </w:p>
@@ -1095,7 +1117,7 @@
             </w:tabs>
             <w:rPr/>
           </w:pPr>
-          <w:hyperlink w:anchor="__RefHeading___Toc144171_3199679052">
+          <w:hyperlink w:anchor="__RefHeading___Toc12270_3960898926">
             <w:r>
               <w:rPr>
                 <w:webHidden/>
@@ -1103,7 +1125,7 @@
               </w:rPr>
               <w:t>7. Taxes and charges on premium</w:t>
               <w:tab/>
-              <w:t>12</w:t>
+              <w:t>15</w:t>
             </w:r>
           </w:hyperlink>
         </w:p>
@@ -1117,7 +1139,7 @@
             </w:tabs>
             <w:rPr/>
           </w:pPr>
-          <w:hyperlink w:anchor="__RefHeading___Toc144173_3199679052">
+          <w:hyperlink w:anchor="__RefHeading___Toc12272_3960898926">
             <w:r>
               <w:rPr>
                 <w:webHidden/>
@@ -1125,7 +1147,7 @@
               </w:rPr>
               <w:t>8. CTPL and motor rules</w:t>
               <w:tab/>
-              <w:t>13</w:t>
+              <w:t>16</w:t>
             </w:r>
           </w:hyperlink>
         </w:p>
@@ -1139,7 +1161,7 @@
             </w:tabs>
             <w:rPr/>
           </w:pPr>
-          <w:hyperlink w:anchor="__RefHeading___Toc144175_3199679052">
+          <w:hyperlink w:anchor="__RefHeading___Toc12274_3960898926">
             <w:r>
               <w:rPr>
                 <w:webHidden/>
@@ -1147,7 +1169,7 @@
               </w:rPr>
               <w:t>9. Data Privacy Act (RA 10173)</w:t>
               <w:tab/>
-              <w:t>14</w:t>
+              <w:t>17</w:t>
             </w:r>
           </w:hyperlink>
         </w:p>
@@ -1161,7 +1183,7 @@
             </w:tabs>
             <w:rPr/>
           </w:pPr>
-          <w:hyperlink w:anchor="__RefHeading___Toc144177_3199679052">
+          <w:hyperlink w:anchor="__RefHeading___Toc12276_3960898926">
             <w:r>
               <w:rPr>
                 <w:webHidden/>
@@ -1169,7 +1191,7 @@
               </w:rPr>
               <w:t>10. Anti-Money Laundering Act (where applicable)</w:t>
               <w:tab/>
-              <w:t>16</w:t>
+              <w:t>20</w:t>
             </w:r>
           </w:hyperlink>
         </w:p>
@@ -1183,7 +1205,7 @@
             </w:tabs>
             <w:rPr/>
           </w:pPr>
-          <w:hyperlink w:anchor="__RefHeading___Toc144179_3199679052">
+          <w:hyperlink w:anchor="__RefHeading___Toc12278_3960898926">
             <w:r>
               <w:rPr>
                 <w:webHidden/>
@@ -1191,7 +1213,7 @@
               </w:rPr>
               <w:t>11. Summary of what remains with the broker</w:t>
               <w:tab/>
-              <w:t>17</w:t>
+              <w:t>23</w:t>
             </w:r>
           </w:hyperlink>
         </w:p>
@@ -1205,7 +1227,7 @@
             </w:tabs>
             <w:rPr/>
           </w:pPr>
-          <w:hyperlink w:anchor="__RefHeading___Toc144181_3199679052">
+          <w:hyperlink w:anchor="__RefHeading___Toc12280_3960898926">
             <w:r>
               <w:rPr>
                 <w:webHidden/>
@@ -1220,7 +1242,7 @@
                 <w:rStyle w:val="IndexLink"/>
               </w:rPr>
               <w:tab/>
-              <w:t>18</w:t>
+              <w:t>24</w:t>
             </w:r>
           </w:hyperlink>
           <w:r>
@@ -1253,7 +1275,7 @@
       <w:r>
         <w:br w:type="page"/>
       </w:r>
-      <w:bookmarkStart w:id="0" w:name="__RefHeading___Toc144145_3199679052"/>
+      <w:bookmarkStart w:id="0" w:name="__RefHeading___Toc12242_3960898926"/>
       <w:bookmarkStart w:id="1" w:name="_Toc48319687"/>
       <w:bookmarkStart w:id="2" w:name="_Toc11824118"/>
       <w:bookmarkEnd w:id="0"/>
@@ -1610,7 +1632,7 @@
                 <w:szCs w:val="24"/>
                 <w:lang w:val="en-US" w:eastAsia="ja-JP" w:bidi="ar-SA"/>
               </w:rPr>
-              <w:t>03 October 2026</w:t>
+              <w:t>04 October 2026</w:t>
             </w:r>
           </w:p>
         </w:tc>
@@ -1647,7 +1669,7 @@
                 <w:szCs w:val="24"/>
                 <w:lang w:val="en-US" w:eastAsia="ja-JP" w:bidi="ar-SA"/>
               </w:rPr>
-              <w:t>1.0</w:t>
+              <w:t>1.1</w:t>
             </w:r>
           </w:p>
         </w:tc>
@@ -1793,7 +1815,7 @@
                 <w:szCs w:val="24"/>
                 <w:lang w:val="en-US" w:eastAsia="ja-JP" w:bidi="ar-SA"/>
               </w:rPr>
-              <w:t>Initial issue</w:t>
+              <w:t>Version 1.1: IC licences, fit and proper, insurer authority, complaints and IC reports; NPC breach register, masking and encryption; masking of test copies</w:t>
             </w:r>
           </w:p>
         </w:tc>
@@ -1896,7 +1918,7 @@
           <w:spacing w:val="0"/>
         </w:rPr>
       </w:pPr>
-      <w:bookmarkStart w:id="4" w:name="__RefHeading___Toc144147_3199679052"/>
+      <w:bookmarkStart w:id="4" w:name="__RefHeading___Toc12244_3960898926"/>
       <w:bookmarkStart w:id="5" w:name="_Toc233203388"/>
       <w:bookmarkEnd w:id="4"/>
       <w:r>
@@ -4166,6 +4188,164 @@
                 <w:lang w:val="en-US" w:eastAsia="ja-JP" w:bidi="ar-SA"/>
               </w:rPr>
               <w:t>Official receipt</w:t>
+            </w:r>
+          </w:p>
+        </w:tc>
+      </w:tr>
+      <w:tr>
+        <w:trPr>
+          <w:trHeight w:val="449" w:hRule="atLeast"/>
+        </w:trPr>
+        <w:tc>
+          <w:tcPr>
+            <w:tcW w:w="2514" w:type="dxa"/>
+            <w:tcBorders>
+              <w:top w:val="single" w:sz="4" w:space="0" w:color="808080"/>
+              <w:left w:val="single" w:sz="4" w:space="0" w:color="808080"/>
+              <w:bottom w:val="single" w:sz="4" w:space="0" w:color="808080"/>
+              <w:right w:val="single" w:sz="4" w:space="0" w:color="808080"/>
+            </w:tcBorders>
+            <w:vAlign w:val="center"/>
+          </w:tcPr>
+          <w:p>
+            <w:pPr>
+              <w:pStyle w:val="Normal"/>
+              <w:widowControl/>
+              <w:spacing w:lineRule="auto" w:line="240" w:before="60" w:after="0"/>
+              <w:jc w:val="left"/>
+              <w:rPr>
+                <w:rFonts w:ascii="Segoe UI" w:hAnsi="Segoe UI" w:eastAsia="Arial" w:cs="Segoe UI"/>
+                <w:color w:val="101820"/>
+                <w:sz w:val="16"/>
+                <w:szCs w:val="16"/>
+              </w:rPr>
+            </w:pPr>
+            <w:r>
+              <w:rPr>
+                <w:rFonts w:eastAsia="Segoe UI" w:cs="Segoe UI" w:ascii="Segoe UI" w:hAnsi="Segoe UI"/>
+                <w:color w:val="101820"/>
+                <w:kern w:val="0"/>
+                <w:sz w:val="16"/>
+                <w:szCs w:val="24"/>
+                <w:lang w:val="en-US" w:eastAsia="ja-JP" w:bidi="ar-SA"/>
+              </w:rPr>
+              <w:t>PII</w:t>
+            </w:r>
+          </w:p>
+        </w:tc>
+        <w:tc>
+          <w:tcPr>
+            <w:tcW w:w="3712" w:type="dxa"/>
+            <w:tcBorders>
+              <w:top w:val="single" w:sz="4" w:space="0" w:color="808080"/>
+              <w:left w:val="single" w:sz="4" w:space="0" w:color="808080"/>
+              <w:bottom w:val="single" w:sz="4" w:space="0" w:color="808080"/>
+              <w:right w:val="single" w:sz="4" w:space="0" w:color="808080"/>
+            </w:tcBorders>
+            <w:vAlign w:val="center"/>
+          </w:tcPr>
+          <w:p>
+            <w:pPr>
+              <w:pStyle w:val="Normal"/>
+              <w:widowControl/>
+              <w:spacing w:lineRule="auto" w:line="240" w:before="60" w:after="0"/>
+              <w:jc w:val="left"/>
+              <w:rPr>
+                <w:rFonts w:ascii="Segoe UI" w:hAnsi="Segoe UI" w:eastAsia="Arial" w:cs="Segoe UI"/>
+                <w:color w:val="101820"/>
+                <w:sz w:val="16"/>
+                <w:szCs w:val="16"/>
+              </w:rPr>
+            </w:pPr>
+            <w:r>
+              <w:rPr>
+                <w:rFonts w:eastAsia="Segoe UI" w:cs="Segoe UI" w:ascii="Segoe UI" w:hAnsi="Segoe UI"/>
+                <w:color w:val="101820"/>
+                <w:kern w:val="0"/>
+                <w:sz w:val="16"/>
+                <w:szCs w:val="24"/>
+                <w:lang w:val="en-US" w:eastAsia="ja-JP" w:bidi="ar-SA"/>
+              </w:rPr>
+              <w:t>Personal identifiable information</w:t>
+            </w:r>
+          </w:p>
+        </w:tc>
+      </w:tr>
+      <w:tr>
+        <w:trPr>
+          <w:trHeight w:val="449" w:hRule="atLeast"/>
+        </w:trPr>
+        <w:tc>
+          <w:tcPr>
+            <w:tcW w:w="2514" w:type="dxa"/>
+            <w:tcBorders>
+              <w:top w:val="single" w:sz="4" w:space="0" w:color="808080"/>
+              <w:left w:val="single" w:sz="4" w:space="0" w:color="808080"/>
+              <w:bottom w:val="single" w:sz="4" w:space="0" w:color="808080"/>
+              <w:right w:val="single" w:sz="4" w:space="0" w:color="808080"/>
+            </w:tcBorders>
+            <w:vAlign w:val="center"/>
+          </w:tcPr>
+          <w:p>
+            <w:pPr>
+              <w:pStyle w:val="Normal"/>
+              <w:widowControl/>
+              <w:spacing w:lineRule="auto" w:line="240" w:before="60" w:after="0"/>
+              <w:jc w:val="left"/>
+              <w:rPr>
+                <w:rFonts w:ascii="Segoe UI" w:hAnsi="Segoe UI" w:eastAsia="Arial" w:cs="Segoe UI"/>
+                <w:color w:val="101820"/>
+                <w:sz w:val="16"/>
+                <w:szCs w:val="16"/>
+              </w:rPr>
+            </w:pPr>
+            <w:r>
+              <w:rPr>
+                <w:rFonts w:eastAsia="Segoe UI" w:cs="Segoe UI" w:ascii="Segoe UI" w:hAnsi="Segoe UI"/>
+                <w:color w:val="101820"/>
+                <w:kern w:val="0"/>
+                <w:sz w:val="16"/>
+                <w:szCs w:val="24"/>
+                <w:lang w:val="en-US" w:eastAsia="ja-JP" w:bidi="ar-SA"/>
+              </w:rPr>
+              <w:t>PSGC</w:t>
+            </w:r>
+          </w:p>
+        </w:tc>
+        <w:tc>
+          <w:tcPr>
+            <w:tcW w:w="3712" w:type="dxa"/>
+            <w:tcBorders>
+              <w:top w:val="single" w:sz="4" w:space="0" w:color="808080"/>
+              <w:left w:val="single" w:sz="4" w:space="0" w:color="808080"/>
+              <w:bottom w:val="single" w:sz="4" w:space="0" w:color="808080"/>
+              <w:right w:val="single" w:sz="4" w:space="0" w:color="808080"/>
+            </w:tcBorders>
+            <w:vAlign w:val="center"/>
+          </w:tcPr>
+          <w:p>
+            <w:pPr>
+              <w:pStyle w:val="Normal"/>
+              <w:widowControl/>
+              <w:spacing w:lineRule="auto" w:line="240" w:before="60" w:after="0"/>
+              <w:jc w:val="left"/>
+              <w:rPr>
+                <w:rFonts w:ascii="Segoe UI" w:hAnsi="Segoe UI" w:eastAsia="Arial" w:cs="Segoe UI"/>
+                <w:color w:val="101820"/>
+                <w:sz w:val="16"/>
+                <w:szCs w:val="16"/>
+              </w:rPr>
+            </w:pPr>
+            <w:r>
+              <w:rPr>
+                <w:rFonts w:eastAsia="Segoe UI" w:cs="Segoe UI" w:ascii="Segoe UI" w:hAnsi="Segoe UI"/>
+                <w:color w:val="101820"/>
+                <w:kern w:val="0"/>
+                <w:sz w:val="16"/>
+                <w:szCs w:val="24"/>
+                <w:lang w:val="en-US" w:eastAsia="ja-JP" w:bidi="ar-SA"/>
+              </w:rPr>
+              <w:t>Philippine Standard Geographic Code</w:t>
             </w:r>
           </w:p>
         </w:tc>
@@ -4386,7 +4566,7 @@
         <w:pageBreakBefore w:val="false"/>
         <w:rPr/>
       </w:pPr>
-      <w:bookmarkStart w:id="6" w:name="__RefHeading___Toc144149_3199679052"/>
+      <w:bookmarkStart w:id="6" w:name="__RefHeading___Toc12246_3960898926"/>
       <w:bookmarkEnd w:id="6"/>
       <w:r>
         <w:rPr>
@@ -4403,7 +4583,7 @@
         <w:pStyle w:val="Heading2"/>
         <w:rPr/>
       </w:pPr>
-      <w:bookmarkStart w:id="7" w:name="__RefHeading___Toc144151_3199679052"/>
+      <w:bookmarkStart w:id="7" w:name="__RefHeading___Toc12248_3960898926"/>
       <w:bookmarkEnd w:id="7"/>
       <w:r>
         <w:rPr>
@@ -4435,7 +4615,7 @@
         <w:pStyle w:val="Heading2"/>
         <w:rPr/>
       </w:pPr>
-      <w:bookmarkStart w:id="8" w:name="__RefHeading___Toc144153_3199679052"/>
+      <w:bookmarkStart w:id="8" w:name="__RefHeading___Toc12250_3960898926"/>
       <w:bookmarkEnd w:id="8"/>
       <w:r>
         <w:rPr>
@@ -4547,17 +4727,405 @@
         </w:rPr>
         <w:t>This document is not legal or tax advice. The system produces records, working papers and controls. Registrations, filings, payments to government, notifications and the interpretation of the law remain with the broker.</w:t>
       </w:r>
+    </w:p>
+    <w:p>
+      <w:pPr>
+        <w:pStyle w:val="Heading2"/>
+        <w:rPr/>
+      </w:pPr>
+      <w:bookmarkStart w:id="9" w:name="__RefHeading___Toc12252_3960898926"/>
+      <w:bookmarkEnd w:id="9"/>
       <w:r>
-        <w:br w:type="page"/>
+        <w:rPr>
+          <w:rFonts w:eastAsia="Segoe UI" w:cs="Segoe UI"/>
+          <w:b/>
+          <w:color w:val="0F4761"/>
+          <w:sz w:val="26"/>
+        </w:rPr>
+        <w:t>3.3  Version history</w:t>
       </w:r>
     </w:p>
+    <w:tbl>
+      <w:tblPr>
+        <w:tblStyle w:val="TableGrid"/>
+        <w:tblW w:w="9014" w:type="dxa"/>
+        <w:jc w:val="left"/>
+        <w:tblInd w:w="0" w:type="dxa"/>
+        <w:tblLayout w:type="fixed"/>
+        <w:tblCellMar>
+          <w:top w:w="0" w:type="dxa"/>
+          <w:left w:w="108" w:type="dxa"/>
+          <w:bottom w:w="0" w:type="dxa"/>
+          <w:right w:w="108" w:type="dxa"/>
+        </w:tblCellMar>
+        <w:tblLook w:val="04a0" w:noHBand="0" w:noVBand="1" w:firstColumn="1" w:lastRow="0" w:lastColumn="0" w:firstRow="1"/>
+      </w:tblPr>
+      <w:tblGrid>
+        <w:gridCol w:w="1003"/>
+        <w:gridCol w:w="1913"/>
+        <w:gridCol w:w="6098"/>
+      </w:tblGrid>
+      <w:tr>
+        <w:trPr>
+          <w:tblHeader w:val="true"/>
+        </w:trPr>
+        <w:tc>
+          <w:tcPr>
+            <w:tcW w:w="1003" w:type="dxa"/>
+            <w:tcBorders>
+              <w:top w:val="single" w:sz="4" w:space="0" w:color="BFC7D1"/>
+              <w:left w:val="single" w:sz="4" w:space="0" w:color="BFC7D1"/>
+              <w:bottom w:val="single" w:sz="4" w:space="0" w:color="BFC7D1"/>
+              <w:right w:val="single" w:sz="4" w:space="0" w:color="BFC7D1"/>
+            </w:tcBorders>
+            <w:shd w:color="auto" w:fill="DCE9F7" w:val="clear"/>
+          </w:tcPr>
+          <w:p>
+            <w:pPr>
+              <w:pStyle w:val="Normal"/>
+              <w:widowControl/>
+              <w:spacing w:lineRule="auto" w:line="240" w:before="0" w:after="20"/>
+              <w:jc w:val="left"/>
+              <w:rPr>
+                <w:rFonts w:ascii="Aptos" w:hAnsi="Aptos" w:eastAsia="ＭＳ 明朝" w:cs="Arial"/>
+                <w:kern w:val="0"/>
+                <w:sz w:val="24"/>
+                <w:szCs w:val="24"/>
+                <w:lang w:val="en-US" w:eastAsia="ja-JP" w:bidi="ar-SA"/>
+              </w:rPr>
+            </w:pPr>
+            <w:r>
+              <w:rPr>
+                <w:rFonts w:eastAsia="Segoe UI" w:cs="Segoe UI" w:ascii="Segoe UI" w:hAnsi="Segoe UI"/>
+                <w:b/>
+                <w:color w:val="0F4761"/>
+                <w:kern w:val="0"/>
+                <w:sz w:val="18"/>
+                <w:szCs w:val="24"/>
+                <w:lang w:val="en-US" w:eastAsia="ja-JP" w:bidi="ar-SA"/>
+              </w:rPr>
+              <w:t>Version</w:t>
+            </w:r>
+          </w:p>
+        </w:tc>
+        <w:tc>
+          <w:tcPr>
+            <w:tcW w:w="1913" w:type="dxa"/>
+            <w:tcBorders>
+              <w:top w:val="single" w:sz="4" w:space="0" w:color="BFC7D1"/>
+              <w:left w:val="single" w:sz="4" w:space="0" w:color="BFC7D1"/>
+              <w:bottom w:val="single" w:sz="4" w:space="0" w:color="BFC7D1"/>
+              <w:right w:val="single" w:sz="4" w:space="0" w:color="BFC7D1"/>
+            </w:tcBorders>
+            <w:shd w:color="auto" w:fill="DCE9F7" w:val="clear"/>
+          </w:tcPr>
+          <w:p>
+            <w:pPr>
+              <w:pStyle w:val="Normal"/>
+              <w:widowControl/>
+              <w:spacing w:lineRule="auto" w:line="240" w:before="0" w:after="20"/>
+              <w:jc w:val="left"/>
+              <w:rPr>
+                <w:rFonts w:ascii="Aptos" w:hAnsi="Aptos" w:eastAsia="ＭＳ 明朝" w:cs="Arial"/>
+                <w:kern w:val="0"/>
+                <w:sz w:val="24"/>
+                <w:szCs w:val="24"/>
+                <w:lang w:val="en-US" w:eastAsia="ja-JP" w:bidi="ar-SA"/>
+              </w:rPr>
+            </w:pPr>
+            <w:r>
+              <w:rPr>
+                <w:rFonts w:eastAsia="Segoe UI" w:cs="Segoe UI" w:ascii="Segoe UI" w:hAnsi="Segoe UI"/>
+                <w:b/>
+                <w:color w:val="0F4761"/>
+                <w:kern w:val="0"/>
+                <w:sz w:val="18"/>
+                <w:szCs w:val="24"/>
+                <w:lang w:val="en-US" w:eastAsia="ja-JP" w:bidi="ar-SA"/>
+              </w:rPr>
+              <w:t>Date</w:t>
+            </w:r>
+          </w:p>
+        </w:tc>
+        <w:tc>
+          <w:tcPr>
+            <w:tcW w:w="6098" w:type="dxa"/>
+            <w:tcBorders>
+              <w:top w:val="single" w:sz="4" w:space="0" w:color="BFC7D1"/>
+              <w:left w:val="single" w:sz="4" w:space="0" w:color="BFC7D1"/>
+              <w:bottom w:val="single" w:sz="4" w:space="0" w:color="BFC7D1"/>
+              <w:right w:val="single" w:sz="4" w:space="0" w:color="BFC7D1"/>
+            </w:tcBorders>
+            <w:shd w:color="auto" w:fill="DCE9F7" w:val="clear"/>
+          </w:tcPr>
+          <w:p>
+            <w:pPr>
+              <w:pStyle w:val="Normal"/>
+              <w:widowControl/>
+              <w:spacing w:lineRule="auto" w:line="240" w:before="0" w:after="20"/>
+              <w:jc w:val="left"/>
+              <w:rPr>
+                <w:rFonts w:ascii="Aptos" w:hAnsi="Aptos" w:eastAsia="ＭＳ 明朝" w:cs="Arial"/>
+                <w:kern w:val="0"/>
+                <w:sz w:val="24"/>
+                <w:szCs w:val="24"/>
+                <w:lang w:val="en-US" w:eastAsia="ja-JP" w:bidi="ar-SA"/>
+              </w:rPr>
+            </w:pPr>
+            <w:r>
+              <w:rPr>
+                <w:rFonts w:eastAsia="Segoe UI" w:cs="Segoe UI" w:ascii="Segoe UI" w:hAnsi="Segoe UI"/>
+                <w:b/>
+                <w:color w:val="0F4761"/>
+                <w:kern w:val="0"/>
+                <w:sz w:val="18"/>
+                <w:szCs w:val="24"/>
+                <w:lang w:val="en-US" w:eastAsia="ja-JP" w:bidi="ar-SA"/>
+              </w:rPr>
+              <w:t>Change</w:t>
+            </w:r>
+          </w:p>
+        </w:tc>
+      </w:tr>
+      <w:tr>
+        <w:trPr/>
+        <w:tc>
+          <w:tcPr>
+            <w:tcW w:w="1003" w:type="dxa"/>
+            <w:tcBorders>
+              <w:top w:val="single" w:sz="4" w:space="0" w:color="BFC7D1"/>
+              <w:left w:val="single" w:sz="4" w:space="0" w:color="BFC7D1"/>
+              <w:bottom w:val="single" w:sz="4" w:space="0" w:color="BFC7D1"/>
+              <w:right w:val="single" w:sz="4" w:space="0" w:color="BFC7D1"/>
+            </w:tcBorders>
+          </w:tcPr>
+          <w:p>
+            <w:pPr>
+              <w:pStyle w:val="Normal"/>
+              <w:widowControl/>
+              <w:spacing w:lineRule="auto" w:line="240" w:before="0" w:after="20"/>
+              <w:jc w:val="left"/>
+              <w:rPr>
+                <w:rFonts w:ascii="Aptos" w:hAnsi="Aptos" w:eastAsia="ＭＳ 明朝" w:cs="Arial"/>
+                <w:kern w:val="0"/>
+                <w:sz w:val="24"/>
+                <w:szCs w:val="24"/>
+                <w:lang w:val="en-US" w:eastAsia="ja-JP" w:bidi="ar-SA"/>
+              </w:rPr>
+            </w:pPr>
+            <w:r>
+              <w:rPr>
+                <w:rFonts w:eastAsia="Segoe UI" w:cs="Segoe UI" w:ascii="Segoe UI" w:hAnsi="Segoe UI"/>
+                <w:color w:val="101820"/>
+                <w:kern w:val="0"/>
+                <w:sz w:val="18"/>
+                <w:szCs w:val="24"/>
+                <w:lang w:val="en-US" w:eastAsia="ja-JP" w:bidi="ar-SA"/>
+              </w:rPr>
+              <w:t>1.0</w:t>
+            </w:r>
+          </w:p>
+        </w:tc>
+        <w:tc>
+          <w:tcPr>
+            <w:tcW w:w="1913" w:type="dxa"/>
+            <w:tcBorders>
+              <w:top w:val="single" w:sz="4" w:space="0" w:color="BFC7D1"/>
+              <w:left w:val="single" w:sz="4" w:space="0" w:color="BFC7D1"/>
+              <w:bottom w:val="single" w:sz="4" w:space="0" w:color="BFC7D1"/>
+              <w:right w:val="single" w:sz="4" w:space="0" w:color="BFC7D1"/>
+            </w:tcBorders>
+          </w:tcPr>
+          <w:p>
+            <w:pPr>
+              <w:pStyle w:val="Normal"/>
+              <w:widowControl/>
+              <w:spacing w:lineRule="auto" w:line="240" w:before="0" w:after="20"/>
+              <w:jc w:val="left"/>
+              <w:rPr>
+                <w:rFonts w:ascii="Aptos" w:hAnsi="Aptos" w:eastAsia="ＭＳ 明朝" w:cs="Arial"/>
+                <w:kern w:val="0"/>
+                <w:sz w:val="24"/>
+                <w:szCs w:val="24"/>
+                <w:lang w:val="en-US" w:eastAsia="ja-JP" w:bidi="ar-SA"/>
+              </w:rPr>
+            </w:pPr>
+            <w:r>
+              <w:rPr>
+                <w:rFonts w:eastAsia="Segoe UI" w:cs="Segoe UI" w:ascii="Segoe UI" w:hAnsi="Segoe UI"/>
+                <w:color w:val="101820"/>
+                <w:kern w:val="0"/>
+                <w:sz w:val="18"/>
+                <w:szCs w:val="24"/>
+                <w:lang w:val="en-US" w:eastAsia="ja-JP" w:bidi="ar-SA"/>
+              </w:rPr>
+              <w:t>03 October 2026</w:t>
+            </w:r>
+          </w:p>
+        </w:tc>
+        <w:tc>
+          <w:tcPr>
+            <w:tcW w:w="6098" w:type="dxa"/>
+            <w:tcBorders>
+              <w:top w:val="single" w:sz="4" w:space="0" w:color="BFC7D1"/>
+              <w:left w:val="single" w:sz="4" w:space="0" w:color="BFC7D1"/>
+              <w:bottom w:val="single" w:sz="4" w:space="0" w:color="BFC7D1"/>
+              <w:right w:val="single" w:sz="4" w:space="0" w:color="BFC7D1"/>
+            </w:tcBorders>
+          </w:tcPr>
+          <w:p>
+            <w:pPr>
+              <w:pStyle w:val="Normal"/>
+              <w:widowControl/>
+              <w:spacing w:lineRule="auto" w:line="240" w:before="0" w:after="20"/>
+              <w:jc w:val="left"/>
+              <w:rPr>
+                <w:rFonts w:ascii="Aptos" w:hAnsi="Aptos" w:eastAsia="ＭＳ 明朝" w:cs="Arial"/>
+                <w:kern w:val="0"/>
+                <w:sz w:val="24"/>
+                <w:szCs w:val="24"/>
+                <w:lang w:val="en-US" w:eastAsia="ja-JP" w:bidi="ar-SA"/>
+              </w:rPr>
+            </w:pPr>
+            <w:r>
+              <w:rPr>
+                <w:rFonts w:eastAsia="Segoe UI" w:cs="Segoe UI" w:ascii="Segoe UI" w:hAnsi="Segoe UI"/>
+                <w:color w:val="101820"/>
+                <w:kern w:val="0"/>
+                <w:sz w:val="18"/>
+                <w:szCs w:val="24"/>
+                <w:lang w:val="en-US" w:eastAsia="ja-JP" w:bidi="ar-SA"/>
+              </w:rPr>
+              <w:t>Initial issue</w:t>
+            </w:r>
+          </w:p>
+        </w:tc>
+      </w:tr>
+      <w:tr>
+        <w:trPr/>
+        <w:tc>
+          <w:tcPr>
+            <w:tcW w:w="1003" w:type="dxa"/>
+            <w:tcBorders>
+              <w:top w:val="single" w:sz="4" w:space="0" w:color="BFC7D1"/>
+              <w:left w:val="single" w:sz="4" w:space="0" w:color="BFC7D1"/>
+              <w:bottom w:val="single" w:sz="4" w:space="0" w:color="BFC7D1"/>
+              <w:right w:val="single" w:sz="4" w:space="0" w:color="BFC7D1"/>
+            </w:tcBorders>
+          </w:tcPr>
+          <w:p>
+            <w:pPr>
+              <w:pStyle w:val="Normal"/>
+              <w:widowControl/>
+              <w:spacing w:lineRule="auto" w:line="240" w:before="0" w:after="20"/>
+              <w:jc w:val="left"/>
+              <w:rPr>
+                <w:rFonts w:ascii="Aptos" w:hAnsi="Aptos" w:eastAsia="ＭＳ 明朝" w:cs="Arial"/>
+                <w:kern w:val="0"/>
+                <w:sz w:val="24"/>
+                <w:szCs w:val="24"/>
+                <w:lang w:val="en-US" w:eastAsia="ja-JP" w:bidi="ar-SA"/>
+              </w:rPr>
+            </w:pPr>
+            <w:r>
+              <w:rPr>
+                <w:rFonts w:eastAsia="Segoe UI" w:cs="Segoe UI" w:ascii="Segoe UI" w:hAnsi="Segoe UI"/>
+                <w:color w:val="101820"/>
+                <w:kern w:val="0"/>
+                <w:sz w:val="18"/>
+                <w:szCs w:val="24"/>
+                <w:lang w:val="en-US" w:eastAsia="ja-JP" w:bidi="ar-SA"/>
+              </w:rPr>
+              <w:t>1.1</w:t>
+            </w:r>
+          </w:p>
+        </w:tc>
+        <w:tc>
+          <w:tcPr>
+            <w:tcW w:w="1913" w:type="dxa"/>
+            <w:tcBorders>
+              <w:top w:val="single" w:sz="4" w:space="0" w:color="BFC7D1"/>
+              <w:left w:val="single" w:sz="4" w:space="0" w:color="BFC7D1"/>
+              <w:bottom w:val="single" w:sz="4" w:space="0" w:color="BFC7D1"/>
+              <w:right w:val="single" w:sz="4" w:space="0" w:color="BFC7D1"/>
+            </w:tcBorders>
+          </w:tcPr>
+          <w:p>
+            <w:pPr>
+              <w:pStyle w:val="Normal"/>
+              <w:widowControl/>
+              <w:spacing w:lineRule="auto" w:line="240" w:before="0" w:after="20"/>
+              <w:jc w:val="left"/>
+              <w:rPr>
+                <w:rFonts w:ascii="Aptos" w:hAnsi="Aptos" w:eastAsia="ＭＳ 明朝" w:cs="Arial"/>
+                <w:kern w:val="0"/>
+                <w:sz w:val="24"/>
+                <w:szCs w:val="24"/>
+                <w:lang w:val="en-US" w:eastAsia="ja-JP" w:bidi="ar-SA"/>
+              </w:rPr>
+            </w:pPr>
+            <w:r>
+              <w:rPr>
+                <w:rFonts w:eastAsia="Segoe UI" w:cs="Segoe UI" w:ascii="Segoe UI" w:hAnsi="Segoe UI"/>
+                <w:color w:val="101820"/>
+                <w:kern w:val="0"/>
+                <w:sz w:val="18"/>
+                <w:szCs w:val="24"/>
+                <w:lang w:val="en-US" w:eastAsia="ja-JP" w:bidi="ar-SA"/>
+              </w:rPr>
+              <w:t>04 October 2026</w:t>
+            </w:r>
+          </w:p>
+        </w:tc>
+        <w:tc>
+          <w:tcPr>
+            <w:tcW w:w="6098" w:type="dxa"/>
+            <w:tcBorders>
+              <w:top w:val="single" w:sz="4" w:space="0" w:color="BFC7D1"/>
+              <w:left w:val="single" w:sz="4" w:space="0" w:color="BFC7D1"/>
+              <w:bottom w:val="single" w:sz="4" w:space="0" w:color="BFC7D1"/>
+              <w:right w:val="single" w:sz="4" w:space="0" w:color="BFC7D1"/>
+            </w:tcBorders>
+          </w:tcPr>
+          <w:p>
+            <w:pPr>
+              <w:pStyle w:val="Normal"/>
+              <w:widowControl/>
+              <w:spacing w:lineRule="auto" w:line="240" w:before="0" w:after="20"/>
+              <w:jc w:val="left"/>
+              <w:rPr>
+                <w:rFonts w:ascii="Aptos" w:hAnsi="Aptos" w:eastAsia="ＭＳ 明朝" w:cs="Arial"/>
+                <w:kern w:val="0"/>
+                <w:sz w:val="24"/>
+                <w:szCs w:val="24"/>
+                <w:lang w:val="en-US" w:eastAsia="ja-JP" w:bidi="ar-SA"/>
+              </w:rPr>
+            </w:pPr>
+            <w:r>
+              <w:rPr>
+                <w:rFonts w:eastAsia="Segoe UI" w:cs="Segoe UI" w:ascii="Segoe UI" w:hAnsi="Segoe UI"/>
+                <w:color w:val="101820"/>
+                <w:kern w:val="0"/>
+                <w:sz w:val="18"/>
+                <w:szCs w:val="24"/>
+                <w:lang w:val="en-US" w:eastAsia="ja-JP" w:bidi="ar-SA"/>
+              </w:rPr>
+              <w:t>Insurance Code chapter: licence register and commission block, fit and proper records, insurer certificate of authority check, complaints register (RA 11765), IC annual statement and production report. Data Privacy Act chapter: masking by role, field encryption, breach register with the 72-hour clock, masking of production copies used outside production. Menu paths updated to the new menu; eight roles</w:t>
+            </w:r>
+          </w:p>
+        </w:tc>
+      </w:tr>
+    </w:tbl>
     <w:p>
       <w:pPr>
         <w:pStyle w:val="Heading1"/>
         <w:rPr/>
       </w:pPr>
-      <w:bookmarkStart w:id="9" w:name="__RefHeading___Toc144155_3199679052"/>
-      <w:bookmarkEnd w:id="9"/>
+      <w:r>
+        <w:br w:type="page"/>
+      </w:r>
+      <w:bookmarkStart w:id="10" w:name="__RefHeading___Toc12254_3960898926"/>
+      <w:bookmarkEnd w:id="10"/>
       <w:r>
         <w:rPr>
           <w:rFonts w:eastAsia="Segoe UI" w:cs="Segoe UI" w:ascii="Segoe UI" w:hAnsi="Segoe UI"/>
@@ -4757,7 +5325,7 @@
                 <w:szCs w:val="24"/>
                 <w:lang w:val="en-US" w:eastAsia="ja-JP" w:bidi="ar-SA"/>
               </w:rPr>
-              <w:t>Seven roles; deny by default; menus and every API action checked against the role's permissions (Master &gt; Generals &gt; User Management)</w:t>
+              <w:t>Eight roles (including the Compliance Officer (AML/CFT)); deny by default; menus and every API action checked against the role's permissions (Master &gt; Users and Access)</w:t>
             </w:r>
           </w:p>
         </w:tc>
@@ -4911,7 +5479,7 @@
                 <w:szCs w:val="24"/>
                 <w:lang w:val="en-US" w:eastAsia="ja-JP" w:bidi="ar-SA"/>
               </w:rPr>
-              <w:t>Master &gt; Audit Trail: every create, update, approval, report run and sign-in, with before and after values; entries are kept (</w:t>
+              <w:t>Master &gt; System &gt; Audit Trail: every create, update, approval, report run and sign-in, with before and after values; entries are kept (</w:t>
             </w:r>
             <w:r>
               <w:rPr>
@@ -5164,7 +5732,84 @@
                 <w:szCs w:val="24"/>
                 <w:lang w:val="en-US" w:eastAsia="ja-JP" w:bidi="ar-SA"/>
               </w:rPr>
-              <w:t>Every document and report PDF carries the letterhead of the primary company (name, address, TIN, contact details) from the Company master</w:t>
+              <w:t>Every document and report PDF carries the letterhead of the primary company (name, address, TIN, IC licence, contact details) from the Company master, with the footer line of Theme and Branding</w:t>
+            </w:r>
+          </w:p>
+        </w:tc>
+      </w:tr>
+      <w:tr>
+        <w:trPr/>
+        <w:tc>
+          <w:tcPr>
+            <w:tcW w:w="4040" w:type="dxa"/>
+            <w:tcBorders>
+              <w:top w:val="single" w:sz="4" w:space="0" w:color="BFC7D1"/>
+              <w:left w:val="single" w:sz="4" w:space="0" w:color="BFC7D1"/>
+              <w:bottom w:val="single" w:sz="4" w:space="0" w:color="BFC7D1"/>
+              <w:right w:val="single" w:sz="4" w:space="0" w:color="BFC7D1"/>
+            </w:tcBorders>
+          </w:tcPr>
+          <w:p>
+            <w:pPr>
+              <w:pStyle w:val="Normal"/>
+              <w:widowControl/>
+              <w:spacing w:lineRule="auto" w:line="240" w:before="0" w:after="20"/>
+              <w:jc w:val="left"/>
+              <w:rPr>
+                <w:rFonts w:ascii="Aptos" w:hAnsi="Aptos" w:eastAsia="ＭＳ 明朝" w:cs="Arial"/>
+                <w:kern w:val="0"/>
+                <w:sz w:val="24"/>
+                <w:szCs w:val="24"/>
+                <w:lang w:val="en-US" w:eastAsia="ja-JP" w:bidi="ar-SA"/>
+              </w:rPr>
+            </w:pPr>
+            <w:r>
+              <w:rPr>
+                <w:rFonts w:eastAsia="Segoe UI" w:cs="Segoe UI" w:ascii="Segoe UI" w:hAnsi="Segoe UI"/>
+                <w:color w:val="101820"/>
+                <w:kern w:val="0"/>
+                <w:sz w:val="18"/>
+                <w:szCs w:val="24"/>
+                <w:lang w:val="en-US" w:eastAsia="ja-JP" w:bidi="ar-SA"/>
+              </w:rPr>
+              <w:t>Electronic signatures</w:t>
+            </w:r>
+          </w:p>
+        </w:tc>
+        <w:tc>
+          <w:tcPr>
+            <w:tcW w:w="4973" w:type="dxa"/>
+            <w:tcBorders>
+              <w:top w:val="single" w:sz="4" w:space="0" w:color="BFC7D1"/>
+              <w:left w:val="single" w:sz="4" w:space="0" w:color="BFC7D1"/>
+              <w:bottom w:val="single" w:sz="4" w:space="0" w:color="BFC7D1"/>
+              <w:right w:val="single" w:sz="4" w:space="0" w:color="BFC7D1"/>
+            </w:tcBorders>
+          </w:tcPr>
+          <w:p>
+            <w:pPr>
+              <w:pStyle w:val="Normal"/>
+              <w:widowControl/>
+              <w:spacing w:lineRule="auto" w:line="240" w:before="0" w:after="20"/>
+              <w:jc w:val="left"/>
+              <w:rPr>
+                <w:rFonts w:ascii="Aptos" w:hAnsi="Aptos" w:eastAsia="ＭＳ 明朝" w:cs="Arial"/>
+                <w:kern w:val="0"/>
+                <w:sz w:val="24"/>
+                <w:szCs w:val="24"/>
+                <w:lang w:val="en-US" w:eastAsia="ja-JP" w:bidi="ar-SA"/>
+              </w:rPr>
+            </w:pPr>
+            <w:r>
+              <w:rPr>
+                <w:rFonts w:eastAsia="Segoe UI" w:cs="Segoe UI" w:ascii="Segoe UI" w:hAnsi="Segoe UI"/>
+                <w:color w:val="101820"/>
+                <w:kern w:val="0"/>
+                <w:sz w:val="18"/>
+                <w:szCs w:val="24"/>
+                <w:lang w:val="en-US" w:eastAsia="ja-JP" w:bidi="ar-SA"/>
+              </w:rPr>
+              <w:t>Signatures of company signatories and users captured with a consent statement, versioned, revocable, mapped per document type; capture and revocation in the audit trail with a hash of the image (Master &gt; System Settings &gt; Theme and Branding &gt; Document signatures)</w:t>
             </w:r>
           </w:p>
         </w:tc>
@@ -5178,8 +5823,8 @@
       <w:r>
         <w:br w:type="page"/>
       </w:r>
-      <w:bookmarkStart w:id="10" w:name="__RefHeading___Toc144157_3199679052"/>
-      <w:bookmarkEnd w:id="10"/>
+      <w:bookmarkStart w:id="11" w:name="__RefHeading___Toc12256_3960898926"/>
+      <w:bookmarkEnd w:id="11"/>
       <w:r>
         <w:rPr>
           <w:rFonts w:eastAsia="Segoe UI" w:cs="Segoe UI" w:ascii="Segoe UI" w:hAnsi="Segoe UI"/>
@@ -5441,7 +6086,7 @@
                 <w:szCs w:val="24"/>
                 <w:lang w:val="en-US" w:eastAsia="ja-JP" w:bidi="ar-SA"/>
               </w:rPr>
-              <w:t>Keep records for the period the IC requires, including records of the old system; provide them on examination; keep the IC licence current (licence number held on the Company master)</w:t>
+              <w:t>Keep records for the period the IC requires, including records of the old system; provide them on examination; keep the IC licence current (licence number on the Company master and the Licence Register)</w:t>
             </w:r>
           </w:p>
         </w:tc>
@@ -5676,7 +6321,7 @@
                 <w:szCs w:val="24"/>
                 <w:lang w:val="en-US" w:eastAsia="ja-JP" w:bidi="ar-SA"/>
               </w:rPr>
-              <w:t xml:space="preserve"> (delivered 30). Accounts &gt; Remittance: Automated Processing builds the remittance per insurer net of commission, approved within the approver's limit in Master &gt; Generals &gt; User Management &gt; Authority Matrix (Remittance approval and Remittance settlement; delivered limits: Accounting up to PHP 1,000,000.00, Accounting Manager without limit), settlement by payment voucher, Electronic Transfer records, Tracking, Statements and Reconciliation. Accounts &gt; Credit Control &gt; Remittance Ageing; Aged Payables to Insurers</w:t>
+              <w:t xml:space="preserve"> (delivered 30). Accounts &gt; Remittance: Automated Processing builds the remittance per insurer net of commission, approved within the approver's limit in Master &gt; Users and Access &gt; Authority Matrix (Remittance approval and Remittance settlement; delivered limits: Accounting up to PHP 1,000,000.00, Accounting Manager without limit), settlement by payment voucher, Electronic Transfer records, Tracking, Statements and Reconciliation. Accounts &gt; Credit Control &gt; Remittance Ageing; Aged Payables to Insurers</w:t>
             </w:r>
           </w:p>
         </w:tc>
@@ -6198,7 +6843,119 @@
                 <w:szCs w:val="24"/>
                 <w:lang w:val="en-US" w:eastAsia="ja-JP" w:bidi="ar-SA"/>
               </w:rPr>
-              <w:t>Policies are placed with and issued for insurers kept in the Insurance Company master (Master &gt; Generals &gt; Insurance Management)</w:t>
+              <w:t xml:space="preserve">The IC certificate of authority number and validity are fields of the insurer (Master &gt; Insurance &gt; Insurance Company). They are checked when a request for quotation is sent, when the firm order of a placement slip is sent and when a policy is issued: </w:t>
+            </w:r>
+            <w:r>
+              <w:rPr>
+                <w:rFonts w:eastAsia="Consolas" w:cs="Consolas" w:ascii="Consolas" w:hAnsi="Consolas"/>
+                <w:color w:val="101820"/>
+                <w:kern w:val="0"/>
+                <w:sz w:val="16"/>
+                <w:szCs w:val="24"/>
+                <w:lang w:val="en-US" w:eastAsia="ja-JP" w:bidi="ar-SA"/>
+              </w:rPr>
+              <w:t>compliance.insurer_authority_check</w:t>
+            </w:r>
+            <w:r>
+              <w:rPr>
+                <w:rFonts w:eastAsia="Segoe UI" w:cs="Segoe UI" w:ascii="Segoe UI" w:hAnsi="Segoe UI"/>
+                <w:color w:val="101820"/>
+                <w:kern w:val="0"/>
+                <w:sz w:val="18"/>
+                <w:szCs w:val="24"/>
+                <w:lang w:val="en-US" w:eastAsia="ja-JP" w:bidi="ar-SA"/>
+              </w:rPr>
+              <w:t xml:space="preserve"> </w:t>
+            </w:r>
+            <w:r>
+              <w:rPr>
+                <w:rFonts w:eastAsia="Segoe UI" w:cs="Segoe UI" w:ascii="Segoe UI" w:hAnsi="Segoe UI"/>
+                <w:b/>
+                <w:color w:val="101820"/>
+                <w:kern w:val="0"/>
+                <w:sz w:val="18"/>
+                <w:szCs w:val="24"/>
+                <w:lang w:val="en-US" w:eastAsia="ja-JP" w:bidi="ar-SA"/>
+              </w:rPr>
+              <w:t>warn</w:t>
+            </w:r>
+            <w:r>
+              <w:rPr>
+                <w:rFonts w:eastAsia="Segoe UI" w:cs="Segoe UI" w:ascii="Segoe UI" w:hAnsi="Segoe UI"/>
+                <w:color w:val="101820"/>
+                <w:kern w:val="0"/>
+                <w:sz w:val="18"/>
+                <w:szCs w:val="24"/>
+                <w:lang w:val="en-US" w:eastAsia="ja-JP" w:bidi="ar-SA"/>
+              </w:rPr>
+              <w:t xml:space="preserve"> (delivered: allowed, warning shown and recorded in the audit trail) or </w:t>
+            </w:r>
+            <w:r>
+              <w:rPr>
+                <w:rFonts w:eastAsia="Segoe UI" w:cs="Segoe UI" w:ascii="Segoe UI" w:hAnsi="Segoe UI"/>
+                <w:b/>
+                <w:color w:val="101820"/>
+                <w:kern w:val="0"/>
+                <w:sz w:val="18"/>
+                <w:szCs w:val="24"/>
+                <w:lang w:val="en-US" w:eastAsia="ja-JP" w:bidi="ar-SA"/>
+              </w:rPr>
+              <w:t>block</w:t>
+            </w:r>
+            <w:r>
+              <w:rPr>
+                <w:rFonts w:eastAsia="Segoe UI" w:cs="Segoe UI" w:ascii="Segoe UI" w:hAnsi="Segoe UI"/>
+                <w:color w:val="101820"/>
+                <w:kern w:val="0"/>
+                <w:sz w:val="18"/>
+                <w:szCs w:val="24"/>
+                <w:lang w:val="en-US" w:eastAsia="ja-JP" w:bidi="ar-SA"/>
+              </w:rPr>
+              <w:t xml:space="preserve"> (refused). Compliance &gt; Insurance Commission &gt; Insurer Authority reports every insurer's certificate (valid, expiring within </w:t>
+            </w:r>
+            <w:r>
+              <w:rPr>
+                <w:rFonts w:eastAsia="Consolas" w:cs="Consolas" w:ascii="Consolas" w:hAnsi="Consolas"/>
+                <w:color w:val="101820"/>
+                <w:kern w:val="0"/>
+                <w:sz w:val="16"/>
+                <w:szCs w:val="24"/>
+                <w:lang w:val="en-US" w:eastAsia="ja-JP" w:bidi="ar-SA"/>
+              </w:rPr>
+              <w:t>compliance.insurer_authority_expiring_days</w:t>
+            </w:r>
+            <w:r>
+              <w:rPr>
+                <w:rFonts w:eastAsia="Segoe UI" w:cs="Segoe UI" w:ascii="Segoe UI" w:hAnsi="Segoe UI"/>
+                <w:color w:val="101820"/>
+                <w:kern w:val="0"/>
+                <w:sz w:val="18"/>
+                <w:szCs w:val="24"/>
+                <w:lang w:val="en-US" w:eastAsia="ja-JP" w:bidi="ar-SA"/>
+              </w:rPr>
+              <w:t xml:space="preserve">, expired, missing; Excel); the </w:t>
+            </w:r>
+            <w:r>
+              <w:rPr>
+                <w:rFonts w:eastAsia="Consolas" w:cs="Consolas" w:ascii="Consolas" w:hAnsi="Consolas"/>
+                <w:color w:val="101820"/>
+                <w:kern w:val="0"/>
+                <w:sz w:val="16"/>
+                <w:szCs w:val="24"/>
+                <w:lang w:val="en-US" w:eastAsia="ja-JP" w:bidi="ar-SA"/>
+              </w:rPr>
+              <w:t>compliance-reminders</w:t>
+            </w:r>
+            <w:r>
+              <w:rPr>
+                <w:rFonts w:eastAsia="Segoe UI" w:cs="Segoe UI" w:ascii="Segoe UI" w:hAnsi="Segoe UI"/>
+                <w:color w:val="101820"/>
+                <w:kern w:val="0"/>
+                <w:sz w:val="18"/>
+                <w:szCs w:val="24"/>
+                <w:lang w:val="en-US" w:eastAsia="ja-JP" w:bidi="ar-SA"/>
+              </w:rPr>
+              <w:t xml:space="preserve"> job reminds the compliance team of expiring certificates</w:t>
             </w:r>
           </w:p>
         </w:tc>
@@ -6235,7 +6992,30 @@
                 <w:szCs w:val="24"/>
                 <w:lang w:val="en-US" w:eastAsia="ja-JP" w:bidi="ar-SA"/>
               </w:rPr>
-              <w:t>Keep the insurer master to authorised insurers; check the status of each insurer's certificate of authority</w:t>
+              <w:t xml:space="preserve">Enter and keep current the certificate number and validity of each insurer from the IC list; switch the check to </w:t>
+            </w:r>
+            <w:r>
+              <w:rPr>
+                <w:rFonts w:eastAsia="Segoe UI" w:cs="Segoe UI" w:ascii="Segoe UI" w:hAnsi="Segoe UI"/>
+                <w:b/>
+                <w:color w:val="101820"/>
+                <w:kern w:val="0"/>
+                <w:sz w:val="18"/>
+                <w:szCs w:val="24"/>
+                <w:lang w:val="en-US" w:eastAsia="ja-JP" w:bidi="ar-SA"/>
+              </w:rPr>
+              <w:t>block</w:t>
+            </w:r>
+            <w:r>
+              <w:rPr>
+                <w:rFonts w:eastAsia="Segoe UI" w:cs="Segoe UI" w:ascii="Segoe UI" w:hAnsi="Segoe UI"/>
+                <w:color w:val="101820"/>
+                <w:kern w:val="0"/>
+                <w:sz w:val="18"/>
+                <w:szCs w:val="24"/>
+                <w:lang w:val="en-US" w:eastAsia="ja-JP" w:bidi="ar-SA"/>
+              </w:rPr>
+              <w:t xml:space="preserve"> once they are entered</w:t>
             </w:r>
           </w:p>
         </w:tc>
@@ -6275,6 +7055,568 @@
                 <w:szCs w:val="24"/>
                 <w:lang w:val="en-US" w:eastAsia="ja-JP" w:bidi="ar-SA"/>
               </w:rPr>
+              <w:t>Licences of the broker, its officers and its agents. The broker and the persons who solicit or negotiate insurance for it hold a licence from the IC in force, renewed before it expires; commission is shared only with licensed persons.</w:t>
+            </w:r>
+          </w:p>
+        </w:tc>
+        <w:tc>
+          <w:tcPr>
+            <w:tcW w:w="3005" w:type="dxa"/>
+            <w:tcBorders>
+              <w:top w:val="single" w:sz="4" w:space="0" w:color="BFC7D1"/>
+              <w:left w:val="single" w:sz="4" w:space="0" w:color="BFC7D1"/>
+              <w:bottom w:val="single" w:sz="4" w:space="0" w:color="BFC7D1"/>
+              <w:right w:val="single" w:sz="4" w:space="0" w:color="BFC7D1"/>
+            </w:tcBorders>
+          </w:tcPr>
+          <w:p>
+            <w:pPr>
+              <w:pStyle w:val="Normal"/>
+              <w:widowControl/>
+              <w:spacing w:lineRule="auto" w:line="240" w:before="0" w:after="20"/>
+              <w:jc w:val="left"/>
+              <w:rPr>
+                <w:rFonts w:ascii="Aptos" w:hAnsi="Aptos" w:eastAsia="ＭＳ 明朝" w:cs="Arial"/>
+                <w:kern w:val="0"/>
+                <w:sz w:val="24"/>
+                <w:szCs w:val="24"/>
+                <w:lang w:val="en-US" w:eastAsia="ja-JP" w:bidi="ar-SA"/>
+              </w:rPr>
+            </w:pPr>
+            <w:r>
+              <w:rPr>
+                <w:rFonts w:eastAsia="Segoe UI" w:cs="Segoe UI" w:ascii="Segoe UI" w:hAnsi="Segoe UI"/>
+                <w:color w:val="101820"/>
+                <w:kern w:val="0"/>
+                <w:sz w:val="18"/>
+                <w:szCs w:val="24"/>
+                <w:lang w:val="en-US" w:eastAsia="ja-JP" w:bidi="ar-SA"/>
+              </w:rPr>
+              <w:t xml:space="preserve">Compliance &gt; Insurance Commission &gt; Licence Register: licences of the firm, officers, licensed individuals, agents, sub-agents and referrers (type, number, issue and expiry, renewal status, documents), renewal recorded as a new licence term, expiry calendar for twelve months, reminders at </w:t>
+            </w:r>
+            <w:r>
+              <w:rPr>
+                <w:rFonts w:eastAsia="Consolas" w:cs="Consolas" w:ascii="Consolas" w:hAnsi="Consolas"/>
+                <w:color w:val="101820"/>
+                <w:kern w:val="0"/>
+                <w:sz w:val="16"/>
+                <w:szCs w:val="24"/>
+                <w:lang w:val="en-US" w:eastAsia="ja-JP" w:bidi="ar-SA"/>
+              </w:rPr>
+              <w:t>compliance.licence_reminder_days</w:t>
+            </w:r>
+            <w:r>
+              <w:rPr>
+                <w:rFonts w:eastAsia="Segoe UI" w:cs="Segoe UI" w:ascii="Segoe UI" w:hAnsi="Segoe UI"/>
+                <w:color w:val="101820"/>
+                <w:kern w:val="0"/>
+                <w:sz w:val="18"/>
+                <w:szCs w:val="24"/>
+                <w:lang w:val="en-US" w:eastAsia="ja-JP" w:bidi="ar-SA"/>
+              </w:rPr>
+              <w:t xml:space="preserve"> (90, 60, 30, 15, 7 days). Commission to a referrer whose type is in </w:t>
+            </w:r>
+            <w:r>
+              <w:rPr>
+                <w:rFonts w:eastAsia="Consolas" w:cs="Consolas" w:ascii="Consolas" w:hAnsi="Consolas"/>
+                <w:color w:val="101820"/>
+                <w:kern w:val="0"/>
+                <w:sz w:val="16"/>
+                <w:szCs w:val="24"/>
+                <w:lang w:val="en-US" w:eastAsia="ja-JP" w:bidi="ar-SA"/>
+              </w:rPr>
+              <w:t>compliance.licence_required_referrer_types</w:t>
+            </w:r>
+            <w:r>
+              <w:rPr>
+                <w:rFonts w:eastAsia="Segoe UI" w:cs="Segoe UI" w:ascii="Segoe UI" w:hAnsi="Segoe UI"/>
+                <w:color w:val="101820"/>
+                <w:kern w:val="0"/>
+                <w:sz w:val="18"/>
+                <w:szCs w:val="24"/>
+                <w:lang w:val="en-US" w:eastAsia="ja-JP" w:bidi="ar-SA"/>
+              </w:rPr>
+              <w:t xml:space="preserve"> is not approved or paid without a licence in force (</w:t>
+            </w:r>
+            <w:r>
+              <w:rPr>
+                <w:rFonts w:eastAsia="Consolas" w:cs="Consolas" w:ascii="Consolas" w:hAnsi="Consolas"/>
+                <w:color w:val="101820"/>
+                <w:kern w:val="0"/>
+                <w:sz w:val="16"/>
+                <w:szCs w:val="24"/>
+                <w:lang w:val="en-US" w:eastAsia="ja-JP" w:bidi="ar-SA"/>
+              </w:rPr>
+              <w:t>compliance.referrer_licence_check</w:t>
+            </w:r>
+            <w:r>
+              <w:rPr>
+                <w:rFonts w:eastAsia="Segoe UI" w:cs="Segoe UI" w:ascii="Segoe UI" w:hAnsi="Segoe UI"/>
+                <w:color w:val="101820"/>
+                <w:kern w:val="0"/>
+                <w:sz w:val="18"/>
+                <w:szCs w:val="24"/>
+                <w:lang w:val="en-US" w:eastAsia="ja-JP" w:bidi="ar-SA"/>
+              </w:rPr>
+              <w:t>: block, warn or off)</w:t>
+            </w:r>
+          </w:p>
+        </w:tc>
+        <w:tc>
+          <w:tcPr>
+            <w:tcW w:w="3005" w:type="dxa"/>
+            <w:tcBorders>
+              <w:top w:val="single" w:sz="4" w:space="0" w:color="BFC7D1"/>
+              <w:left w:val="single" w:sz="4" w:space="0" w:color="BFC7D1"/>
+              <w:bottom w:val="single" w:sz="4" w:space="0" w:color="BFC7D1"/>
+              <w:right w:val="single" w:sz="4" w:space="0" w:color="BFC7D1"/>
+            </w:tcBorders>
+          </w:tcPr>
+          <w:p>
+            <w:pPr>
+              <w:pStyle w:val="Normal"/>
+              <w:widowControl/>
+              <w:spacing w:lineRule="auto" w:line="240" w:before="0" w:after="20"/>
+              <w:jc w:val="left"/>
+              <w:rPr>
+                <w:rFonts w:ascii="Aptos" w:hAnsi="Aptos" w:eastAsia="ＭＳ 明朝" w:cs="Arial"/>
+                <w:kern w:val="0"/>
+                <w:sz w:val="24"/>
+                <w:szCs w:val="24"/>
+                <w:lang w:val="en-US" w:eastAsia="ja-JP" w:bidi="ar-SA"/>
+              </w:rPr>
+            </w:pPr>
+            <w:r>
+              <w:rPr>
+                <w:rFonts w:eastAsia="Segoe UI" w:cs="Segoe UI" w:ascii="Segoe UI" w:hAnsi="Segoe UI"/>
+                <w:color w:val="101820"/>
+                <w:kern w:val="0"/>
+                <w:sz w:val="18"/>
+                <w:szCs w:val="24"/>
+                <w:lang w:val="en-US" w:eastAsia="ja-JP" w:bidi="ar-SA"/>
+              </w:rPr>
+              <w:t>File the renewals with the IC on time; record each licence and renewal; decide which referrer types need a licence</w:t>
+            </w:r>
+          </w:p>
+        </w:tc>
+      </w:tr>
+      <w:tr>
+        <w:trPr/>
+        <w:tc>
+          <w:tcPr>
+            <w:tcW w:w="3005" w:type="dxa"/>
+            <w:tcBorders>
+              <w:top w:val="single" w:sz="4" w:space="0" w:color="BFC7D1"/>
+              <w:left w:val="single" w:sz="4" w:space="0" w:color="BFC7D1"/>
+              <w:bottom w:val="single" w:sz="4" w:space="0" w:color="BFC7D1"/>
+              <w:right w:val="single" w:sz="4" w:space="0" w:color="BFC7D1"/>
+            </w:tcBorders>
+          </w:tcPr>
+          <w:p>
+            <w:pPr>
+              <w:pStyle w:val="Normal"/>
+              <w:widowControl/>
+              <w:spacing w:lineRule="auto" w:line="240" w:before="0" w:after="20"/>
+              <w:jc w:val="left"/>
+              <w:rPr>
+                <w:rFonts w:ascii="Aptos" w:hAnsi="Aptos" w:eastAsia="ＭＳ 明朝" w:cs="Arial"/>
+                <w:kern w:val="0"/>
+                <w:sz w:val="24"/>
+                <w:szCs w:val="24"/>
+                <w:lang w:val="en-US" w:eastAsia="ja-JP" w:bidi="ar-SA"/>
+              </w:rPr>
+            </w:pPr>
+            <w:r>
+              <w:rPr>
+                <w:rFonts w:eastAsia="Segoe UI" w:cs="Segoe UI" w:ascii="Segoe UI" w:hAnsi="Segoe UI"/>
+                <w:color w:val="101820"/>
+                <w:kern w:val="0"/>
+                <w:sz w:val="18"/>
+                <w:szCs w:val="24"/>
+                <w:lang w:val="en-US" w:eastAsia="ja-JP" w:bidi="ar-SA"/>
+              </w:rPr>
+              <w:t>Fit and proper directors and officers. Directors and officers of an IC-regulated entity meet the IC's fit and proper requirements.</w:t>
+            </w:r>
+          </w:p>
+        </w:tc>
+        <w:tc>
+          <w:tcPr>
+            <w:tcW w:w="3005" w:type="dxa"/>
+            <w:tcBorders>
+              <w:top w:val="single" w:sz="4" w:space="0" w:color="BFC7D1"/>
+              <w:left w:val="single" w:sz="4" w:space="0" w:color="BFC7D1"/>
+              <w:bottom w:val="single" w:sz="4" w:space="0" w:color="BFC7D1"/>
+              <w:right w:val="single" w:sz="4" w:space="0" w:color="BFC7D1"/>
+            </w:tcBorders>
+          </w:tcPr>
+          <w:p>
+            <w:pPr>
+              <w:pStyle w:val="Normal"/>
+              <w:widowControl/>
+              <w:spacing w:lineRule="auto" w:line="240" w:before="0" w:after="20"/>
+              <w:jc w:val="left"/>
+              <w:rPr>
+                <w:rFonts w:ascii="Aptos" w:hAnsi="Aptos" w:eastAsia="ＭＳ 明朝" w:cs="Arial"/>
+                <w:kern w:val="0"/>
+                <w:sz w:val="24"/>
+                <w:szCs w:val="24"/>
+                <w:lang w:val="en-US" w:eastAsia="ja-JP" w:bidi="ar-SA"/>
+              </w:rPr>
+            </w:pPr>
+            <w:r>
+              <w:rPr>
+                <w:rFonts w:eastAsia="Segoe UI" w:cs="Segoe UI" w:ascii="Segoe UI" w:hAnsi="Segoe UI"/>
+                <w:color w:val="101820"/>
+                <w:kern w:val="0"/>
+                <w:sz w:val="18"/>
+                <w:szCs w:val="24"/>
+                <w:lang w:val="en-US" w:eastAsia="ja-JP" w:bidi="ar-SA"/>
+              </w:rPr>
+              <w:t xml:space="preserve">Compliance &gt; Insurance Commission &gt; Fit and Proper: declarations answered (list in </w:t>
+            </w:r>
+            <w:r>
+              <w:rPr>
+                <w:rFonts w:eastAsia="Consolas" w:cs="Consolas" w:ascii="Consolas" w:hAnsi="Consolas"/>
+                <w:color w:val="101820"/>
+                <w:kern w:val="0"/>
+                <w:sz w:val="16"/>
+                <w:szCs w:val="24"/>
+                <w:lang w:val="en-US" w:eastAsia="ja-JP" w:bidi="ar-SA"/>
+              </w:rPr>
+              <w:t>compliance.fit_proper_declarations</w:t>
+            </w:r>
+            <w:r>
+              <w:rPr>
+                <w:rFonts w:eastAsia="Segoe UI" w:cs="Segoe UI" w:ascii="Segoe UI" w:hAnsi="Segoe UI"/>
+                <w:color w:val="101820"/>
+                <w:kern w:val="0"/>
+                <w:sz w:val="18"/>
+                <w:szCs w:val="24"/>
+                <w:lang w:val="en-US" w:eastAsia="ja-JP" w:bidi="ar-SA"/>
+              </w:rPr>
+              <w:t xml:space="preserve">), documents, review outcome, next review </w:t>
+            </w:r>
+            <w:r>
+              <w:rPr>
+                <w:rFonts w:eastAsia="Consolas" w:cs="Consolas" w:ascii="Consolas" w:hAnsi="Consolas"/>
+                <w:color w:val="101820"/>
+                <w:kern w:val="0"/>
+                <w:sz w:val="16"/>
+                <w:szCs w:val="24"/>
+                <w:lang w:val="en-US" w:eastAsia="ja-JP" w:bidi="ar-SA"/>
+              </w:rPr>
+              <w:t>compliance.fit_proper_review_months</w:t>
+            </w:r>
+            <w:r>
+              <w:rPr>
+                <w:rFonts w:eastAsia="Segoe UI" w:cs="Segoe UI" w:ascii="Segoe UI" w:hAnsi="Segoe UI"/>
+                <w:color w:val="101820"/>
+                <w:kern w:val="0"/>
+                <w:sz w:val="18"/>
+                <w:szCs w:val="24"/>
+                <w:lang w:val="en-US" w:eastAsia="ja-JP" w:bidi="ar-SA"/>
+              </w:rPr>
+              <w:t xml:space="preserve"> (12) later, reminders</w:t>
+            </w:r>
+          </w:p>
+        </w:tc>
+        <w:tc>
+          <w:tcPr>
+            <w:tcW w:w="3005" w:type="dxa"/>
+            <w:tcBorders>
+              <w:top w:val="single" w:sz="4" w:space="0" w:color="BFC7D1"/>
+              <w:left w:val="single" w:sz="4" w:space="0" w:color="BFC7D1"/>
+              <w:bottom w:val="single" w:sz="4" w:space="0" w:color="BFC7D1"/>
+              <w:right w:val="single" w:sz="4" w:space="0" w:color="BFC7D1"/>
+            </w:tcBorders>
+          </w:tcPr>
+          <w:p>
+            <w:pPr>
+              <w:pStyle w:val="Normal"/>
+              <w:widowControl/>
+              <w:spacing w:lineRule="auto" w:line="240" w:before="0" w:after="20"/>
+              <w:jc w:val="left"/>
+              <w:rPr>
+                <w:rFonts w:ascii="Aptos" w:hAnsi="Aptos" w:eastAsia="ＭＳ 明朝" w:cs="Arial"/>
+                <w:kern w:val="0"/>
+                <w:sz w:val="24"/>
+                <w:szCs w:val="24"/>
+                <w:lang w:val="en-US" w:eastAsia="ja-JP" w:bidi="ar-SA"/>
+              </w:rPr>
+            </w:pPr>
+            <w:r>
+              <w:rPr>
+                <w:rFonts w:eastAsia="Segoe UI" w:cs="Segoe UI" w:ascii="Segoe UI" w:hAnsi="Segoe UI"/>
+                <w:color w:val="101820"/>
+                <w:kern w:val="0"/>
+                <w:sz w:val="18"/>
+                <w:szCs w:val="24"/>
+                <w:lang w:val="en-US" w:eastAsia="ja-JP" w:bidi="ar-SA"/>
+              </w:rPr>
+              <w:t>Confirm the declarations against the IC rules in force; obtain the clearances; submit what the IC requires on election or appointment</w:t>
+            </w:r>
+          </w:p>
+        </w:tc>
+      </w:tr>
+      <w:tr>
+        <w:trPr/>
+        <w:tc>
+          <w:tcPr>
+            <w:tcW w:w="3005" w:type="dxa"/>
+            <w:tcBorders>
+              <w:top w:val="single" w:sz="4" w:space="0" w:color="BFC7D1"/>
+              <w:left w:val="single" w:sz="4" w:space="0" w:color="BFC7D1"/>
+              <w:bottom w:val="single" w:sz="4" w:space="0" w:color="BFC7D1"/>
+              <w:right w:val="single" w:sz="4" w:space="0" w:color="BFC7D1"/>
+            </w:tcBorders>
+          </w:tcPr>
+          <w:p>
+            <w:pPr>
+              <w:pStyle w:val="Normal"/>
+              <w:widowControl/>
+              <w:spacing w:lineRule="auto" w:line="240" w:before="0" w:after="20"/>
+              <w:jc w:val="left"/>
+              <w:rPr>
+                <w:rFonts w:ascii="Aptos" w:hAnsi="Aptos" w:eastAsia="ＭＳ 明朝" w:cs="Arial"/>
+                <w:kern w:val="0"/>
+                <w:sz w:val="24"/>
+                <w:szCs w:val="24"/>
+                <w:lang w:val="en-US" w:eastAsia="ja-JP" w:bidi="ar-SA"/>
+              </w:rPr>
+            </w:pPr>
+            <w:r>
+              <w:rPr>
+                <w:rFonts w:eastAsia="Segoe UI" w:cs="Segoe UI" w:ascii="Segoe UI" w:hAnsi="Segoe UI"/>
+                <w:color w:val="101820"/>
+                <w:kern w:val="0"/>
+                <w:sz w:val="18"/>
+                <w:szCs w:val="24"/>
+                <w:lang w:val="en-US" w:eastAsia="ja-JP" w:bidi="ar-SA"/>
+              </w:rPr>
+              <w:t>Complaints handling. A financial service provider has a complaints handling mechanism and resolves complaints within set periods (RA 11765 and the IC rules).</w:t>
+            </w:r>
+          </w:p>
+        </w:tc>
+        <w:tc>
+          <w:tcPr>
+            <w:tcW w:w="3005" w:type="dxa"/>
+            <w:tcBorders>
+              <w:top w:val="single" w:sz="4" w:space="0" w:color="BFC7D1"/>
+              <w:left w:val="single" w:sz="4" w:space="0" w:color="BFC7D1"/>
+              <w:bottom w:val="single" w:sz="4" w:space="0" w:color="BFC7D1"/>
+              <w:right w:val="single" w:sz="4" w:space="0" w:color="BFC7D1"/>
+            </w:tcBorders>
+          </w:tcPr>
+          <w:p>
+            <w:pPr>
+              <w:pStyle w:val="Normal"/>
+              <w:widowControl/>
+              <w:spacing w:lineRule="auto" w:line="240" w:before="0" w:after="20"/>
+              <w:jc w:val="left"/>
+              <w:rPr>
+                <w:rFonts w:ascii="Aptos" w:hAnsi="Aptos" w:eastAsia="ＭＳ 明朝" w:cs="Arial"/>
+                <w:kern w:val="0"/>
+                <w:sz w:val="24"/>
+                <w:szCs w:val="24"/>
+                <w:lang w:val="en-US" w:eastAsia="ja-JP" w:bidi="ar-SA"/>
+              </w:rPr>
+            </w:pPr>
+            <w:r>
+              <w:rPr>
+                <w:rFonts w:eastAsia="Segoe UI" w:cs="Segoe UI" w:ascii="Segoe UI" w:hAnsi="Segoe UI"/>
+                <w:color w:val="101820"/>
+                <w:kern w:val="0"/>
+                <w:sz w:val="18"/>
+                <w:szCs w:val="24"/>
+                <w:lang w:val="en-US" w:eastAsia="ja-JP" w:bidi="ar-SA"/>
+              </w:rPr>
+              <w:t>Compliance &gt; Insurance Commission &gt; Complaints: intake (channel, complainant, policy or claim, category), acknowledgement and resolution deadlines (</w:t>
+            </w:r>
+            <w:r>
+              <w:rPr>
+                <w:rFonts w:eastAsia="Consolas" w:cs="Consolas" w:ascii="Consolas" w:hAnsi="Consolas"/>
+                <w:color w:val="101820"/>
+                <w:kern w:val="0"/>
+                <w:sz w:val="16"/>
+                <w:szCs w:val="24"/>
+                <w:lang w:val="en-US" w:eastAsia="ja-JP" w:bidi="ar-SA"/>
+              </w:rPr>
+              <w:t>complaints.ack_days</w:t>
+            </w:r>
+            <w:r>
+              <w:rPr>
+                <w:rFonts w:eastAsia="Segoe UI" w:cs="Segoe UI" w:ascii="Segoe UI" w:hAnsi="Segoe UI"/>
+                <w:color w:val="101820"/>
+                <w:kern w:val="0"/>
+                <w:sz w:val="18"/>
+                <w:szCs w:val="24"/>
+                <w:lang w:val="en-US" w:eastAsia="ja-JP" w:bidi="ar-SA"/>
+              </w:rPr>
+              <w:t xml:space="preserve"> 2, </w:t>
+            </w:r>
+            <w:r>
+              <w:rPr>
+                <w:rFonts w:eastAsia="Consolas" w:cs="Consolas" w:ascii="Consolas" w:hAnsi="Consolas"/>
+                <w:color w:val="101820"/>
+                <w:kern w:val="0"/>
+                <w:sz w:val="16"/>
+                <w:szCs w:val="24"/>
+                <w:lang w:val="en-US" w:eastAsia="ja-JP" w:bidi="ar-SA"/>
+              </w:rPr>
+              <w:t>complaints.resolution_days_simple</w:t>
+            </w:r>
+            <w:r>
+              <w:rPr>
+                <w:rFonts w:eastAsia="Segoe UI" w:cs="Segoe UI" w:ascii="Segoe UI" w:hAnsi="Segoe UI"/>
+                <w:color w:val="101820"/>
+                <w:kern w:val="0"/>
+                <w:sz w:val="18"/>
+                <w:szCs w:val="24"/>
+                <w:lang w:val="en-US" w:eastAsia="ja-JP" w:bidi="ar-SA"/>
+              </w:rPr>
+              <w:t xml:space="preserve"> 7, </w:t>
+            </w:r>
+            <w:r>
+              <w:rPr>
+                <w:rFonts w:eastAsia="Consolas" w:cs="Consolas" w:ascii="Consolas" w:hAnsi="Consolas"/>
+                <w:color w:val="101820"/>
+                <w:kern w:val="0"/>
+                <w:sz w:val="16"/>
+                <w:szCs w:val="24"/>
+                <w:lang w:val="en-US" w:eastAsia="ja-JP" w:bidi="ar-SA"/>
+              </w:rPr>
+              <w:t>complaints.resolution_days_complex</w:t>
+            </w:r>
+            <w:r>
+              <w:rPr>
+                <w:rFonts w:eastAsia="Segoe UI" w:cs="Segoe UI" w:ascii="Segoe UI" w:hAnsi="Segoe UI"/>
+                <w:color w:val="101820"/>
+                <w:kern w:val="0"/>
+                <w:sz w:val="18"/>
+                <w:szCs w:val="24"/>
+                <w:lang w:val="en-US" w:eastAsia="ja-JP" w:bidi="ar-SA"/>
+              </w:rPr>
+              <w:t xml:space="preserve"> 45), assignment, escalation (automatic when overdue, </w:t>
+            </w:r>
+            <w:r>
+              <w:rPr>
+                <w:rFonts w:eastAsia="Consolas" w:cs="Consolas" w:ascii="Consolas" w:hAnsi="Consolas"/>
+                <w:color w:val="101820"/>
+                <w:kern w:val="0"/>
+                <w:sz w:val="16"/>
+                <w:szCs w:val="24"/>
+                <w:lang w:val="en-US" w:eastAsia="ja-JP" w:bidi="ar-SA"/>
+              </w:rPr>
+              <w:t>complaints.auto_escalate</w:t>
+            </w:r>
+            <w:r>
+              <w:rPr>
+                <w:rFonts w:eastAsia="Segoe UI" w:cs="Segoe UI" w:ascii="Segoe UI" w:hAnsi="Segoe UI"/>
+                <w:color w:val="101820"/>
+                <w:kern w:val="0"/>
+                <w:sz w:val="18"/>
+                <w:szCs w:val="24"/>
+                <w:lang w:val="en-US" w:eastAsia="ja-JP" w:bidi="ar-SA"/>
+              </w:rPr>
+              <w:t>), acknowledgement and resolution letters, referral to the IC, ageing, report for the regulator (Excel), audit trail</w:t>
+            </w:r>
+          </w:p>
+        </w:tc>
+        <w:tc>
+          <w:tcPr>
+            <w:tcW w:w="3005" w:type="dxa"/>
+            <w:tcBorders>
+              <w:top w:val="single" w:sz="4" w:space="0" w:color="BFC7D1"/>
+              <w:left w:val="single" w:sz="4" w:space="0" w:color="BFC7D1"/>
+              <w:bottom w:val="single" w:sz="4" w:space="0" w:color="BFC7D1"/>
+              <w:right w:val="single" w:sz="4" w:space="0" w:color="BFC7D1"/>
+            </w:tcBorders>
+          </w:tcPr>
+          <w:p>
+            <w:pPr>
+              <w:pStyle w:val="Normal"/>
+              <w:widowControl/>
+              <w:spacing w:lineRule="auto" w:line="240" w:before="0" w:after="20"/>
+              <w:jc w:val="left"/>
+              <w:rPr>
+                <w:rFonts w:ascii="Aptos" w:hAnsi="Aptos" w:eastAsia="ＭＳ 明朝" w:cs="Arial"/>
+                <w:kern w:val="0"/>
+                <w:sz w:val="24"/>
+                <w:szCs w:val="24"/>
+                <w:lang w:val="en-US" w:eastAsia="ja-JP" w:bidi="ar-SA"/>
+              </w:rPr>
+            </w:pPr>
+            <w:r>
+              <w:rPr>
+                <w:rFonts w:eastAsia="Segoe UI" w:cs="Segoe UI" w:ascii="Segoe UI" w:hAnsi="Segoe UI"/>
+                <w:color w:val="101820"/>
+                <w:kern w:val="0"/>
+                <w:sz w:val="18"/>
+                <w:szCs w:val="24"/>
+                <w:lang w:val="en-US" w:eastAsia="ja-JP" w:bidi="ar-SA"/>
+              </w:rPr>
+              <w:t>Confirm the deadlines and letter texts against the IC rules in force; designate the complaints officers (</w:t>
+            </w:r>
+            <w:r>
+              <w:rPr>
+                <w:rFonts w:eastAsia="Consolas" w:cs="Consolas" w:ascii="Consolas" w:hAnsi="Consolas"/>
+                <w:color w:val="101820"/>
+                <w:kern w:val="0"/>
+                <w:sz w:val="16"/>
+                <w:szCs w:val="24"/>
+                <w:lang w:val="en-US" w:eastAsia="ja-JP" w:bidi="ar-SA"/>
+              </w:rPr>
+              <w:t>approve:complaints</w:t>
+            </w:r>
+            <w:r>
+              <w:rPr>
+                <w:rFonts w:eastAsia="Segoe UI" w:cs="Segoe UI" w:ascii="Segoe UI" w:hAnsi="Segoe UI"/>
+                <w:color w:val="101820"/>
+                <w:kern w:val="0"/>
+                <w:sz w:val="18"/>
+                <w:szCs w:val="24"/>
+                <w:lang w:val="en-US" w:eastAsia="ja-JP" w:bidi="ar-SA"/>
+              </w:rPr>
+              <w:t>); file the reports the IC requires</w:t>
+            </w:r>
+          </w:p>
+        </w:tc>
+      </w:tr>
+      <w:tr>
+        <w:trPr/>
+        <w:tc>
+          <w:tcPr>
+            <w:tcW w:w="3005" w:type="dxa"/>
+            <w:tcBorders>
+              <w:top w:val="single" w:sz="4" w:space="0" w:color="BFC7D1"/>
+              <w:left w:val="single" w:sz="4" w:space="0" w:color="BFC7D1"/>
+              <w:bottom w:val="single" w:sz="4" w:space="0" w:color="BFC7D1"/>
+              <w:right w:val="single" w:sz="4" w:space="0" w:color="BFC7D1"/>
+            </w:tcBorders>
+          </w:tcPr>
+          <w:p>
+            <w:pPr>
+              <w:pStyle w:val="Normal"/>
+              <w:widowControl/>
+              <w:spacing w:lineRule="auto" w:line="240" w:before="0" w:after="20"/>
+              <w:jc w:val="left"/>
+              <w:rPr>
+                <w:rFonts w:ascii="Aptos" w:hAnsi="Aptos" w:eastAsia="ＭＳ 明朝" w:cs="Arial"/>
+                <w:kern w:val="0"/>
+                <w:sz w:val="24"/>
+                <w:szCs w:val="24"/>
+                <w:lang w:val="en-US" w:eastAsia="ja-JP" w:bidi="ar-SA"/>
+              </w:rPr>
+            </w:pPr>
+            <w:r>
+              <w:rPr>
+                <w:rFonts w:eastAsia="Segoe UI" w:cs="Segoe UI" w:ascii="Segoe UI" w:hAnsi="Segoe UI"/>
+                <w:color w:val="101820"/>
+                <w:kern w:val="0"/>
+                <w:sz w:val="18"/>
+                <w:szCs w:val="24"/>
+                <w:lang w:val="en-US" w:eastAsia="ja-JP" w:bidi="ar-SA"/>
+              </w:rPr>
               <w:t>Reports to the IC. The broker submits the reports and financial statements the IC requires.</w:t>
             </w:r>
           </w:p>
@@ -6312,7 +7654,29 @@
                 <w:szCs w:val="24"/>
                 <w:lang w:val="en-US" w:eastAsia="ja-JP" w:bidi="ar-SA"/>
               </w:rPr>
-              <w:t>Financial statements (Accounts &gt; Period End &gt; Financial Statements; Income Statement, Balance Sheet, Trial Balance reports) and production reports provide the figures</w:t>
+              <w:t xml:space="preserve">Compliance &gt; Insurance Commission &gt; IC Annual Statement: workbook of the broker's annual statement from the ledger and production (cover, balance sheet, income statement, premiums and commission by insurer and line, premiums held in trust, accountant confirmation sheet, unmapped accounts), with checks; the ledger mapping is configurable (Account mapping) and the form set followed is named in </w:t>
+            </w:r>
+            <w:r>
+              <w:rPr>
+                <w:rFonts w:eastAsia="Consolas" w:cs="Consolas" w:ascii="Consolas" w:hAnsi="Consolas"/>
+                <w:color w:val="101820"/>
+                <w:kern w:val="0"/>
+                <w:sz w:val="16"/>
+                <w:szCs w:val="24"/>
+                <w:lang w:val="en-US" w:eastAsia="ja-JP" w:bidi="ar-SA"/>
+              </w:rPr>
+              <w:t>compliance.ic_statement_form</w:t>
+            </w:r>
+            <w:r>
+              <w:rPr>
+                <w:rFonts w:eastAsia="Segoe UI" w:cs="Segoe UI" w:ascii="Segoe UI" w:hAnsi="Segoe UI"/>
+                <w:color w:val="101820"/>
+                <w:kern w:val="0"/>
+                <w:sz w:val="18"/>
+                <w:szCs w:val="24"/>
+                <w:lang w:val="en-US" w:eastAsia="ja-JP" w:bidi="ar-SA"/>
+              </w:rPr>
+              <w:t>. Compliance &gt; Insurance Commission &gt; IC Production Report: premiums placed by insurer and IC line by month, quarter or year (Excel). Financial statements (Accounts &gt; Period End &gt; Financial Statements)</w:t>
             </w:r>
           </w:p>
         </w:tc>
@@ -6349,7 +7713,7 @@
                 <w:szCs w:val="24"/>
                 <w:lang w:val="en-US" w:eastAsia="ja-JP" w:bidi="ar-SA"/>
               </w:rPr>
-              <w:t>Prepare and file the IC reports in the IC's format; the system has no IC-format report</w:t>
+              <w:t>The accountant confirms the lines marked on the Accountant confirmation sheet and transcribes the figures onto the IC form set in force; the auditor's report and the filing remain with the broker</w:t>
             </w:r>
           </w:p>
         </w:tc>
@@ -6363,8 +7727,8 @@
       <w:r>
         <w:br w:type="page"/>
       </w:r>
-      <w:bookmarkStart w:id="11" w:name="__RefHeading___Toc144159_3199679052"/>
-      <w:bookmarkEnd w:id="11"/>
+      <w:bookmarkStart w:id="12" w:name="__RefHeading___Toc12258_3960898926"/>
+      <w:bookmarkEnd w:id="12"/>
       <w:r>
         <w:rPr>
           <w:rFonts w:eastAsia="Segoe UI" w:cs="Segoe UI" w:ascii="Segoe UI" w:hAnsi="Segoe UI"/>
@@ -6380,8 +7744,8 @@
         <w:pStyle w:val="Heading2"/>
         <w:rPr/>
       </w:pPr>
-      <w:bookmarkStart w:id="12" w:name="__RefHeading___Toc144161_3199679052"/>
-      <w:bookmarkEnd w:id="12"/>
+      <w:bookmarkStart w:id="13" w:name="__RefHeading___Toc12260_3960898926"/>
+      <w:bookmarkEnd w:id="13"/>
       <w:r>
         <w:rPr>
           <w:rFonts w:eastAsia="Segoe UI" w:cs="Segoe UI"/>
@@ -6606,7 +7970,51 @@
                 <w:szCs w:val="24"/>
                 <w:lang w:val="en-US" w:eastAsia="ja-JP" w:bidi="ar-SA"/>
               </w:rPr>
-              <w:t>Double-entry general ledger: every operational event posts a journal from its posting rule (Master &gt; Finance &gt; Posting Rules); Journal Voucher, Correction JV, Reversal JV; General Ledger Detail, Journal Register, Trial Balance, Trial Balance (Opening / Movement / Closing), Income Statement, Balance Sheet. Journals cannot be posted unbalanced, on inactive accounts or into closed periods; each journal points back to its source document</w:t>
+              <w:t>Double-entry general ledger: every operational event posts a journal from its posting rule (Master &gt; Finance &gt; Posting Rules); Journal Voucher, Correction JV, Reversal JV; General Ledger Detail, Journal Register, Trial Balance, Income Statement, Balance Sheet. Journals cannot be posted unbalanced, on inactive accounts or into closed periods. Accounts &gt; Tax &gt; CAS Books and Documents prints the loose-leaf books per month (general journal, general ledger, cash receipts book, cash disbursements book, sales book, purchase book) with page numbers that run on through the year, a print register, reprints marked REPRINT and voids with a reason (</w:t>
+            </w:r>
+            <w:r>
+              <w:rPr>
+                <w:rFonts w:eastAsia="Consolas" w:cs="Consolas" w:ascii="Consolas" w:hAnsi="Consolas"/>
+                <w:color w:val="101820"/>
+                <w:kern w:val="0"/>
+                <w:sz w:val="16"/>
+                <w:szCs w:val="24"/>
+                <w:lang w:val="en-US" w:eastAsia="ja-JP" w:bidi="ar-SA"/>
+              </w:rPr>
+              <w:t>cas.books_form</w:t>
+            </w:r>
+            <w:r>
+              <w:rPr>
+                <w:rFonts w:eastAsia="Segoe UI" w:cs="Segoe UI" w:ascii="Segoe UI" w:hAnsi="Segoe UI"/>
+                <w:color w:val="101820"/>
+                <w:kern w:val="0"/>
+                <w:sz w:val="18"/>
+                <w:szCs w:val="24"/>
+                <w:lang w:val="en-US" w:eastAsia="ja-JP" w:bidi="ar-SA"/>
+              </w:rPr>
+              <w:t xml:space="preserve">, </w:t>
+            </w:r>
+            <w:r>
+              <w:rPr>
+                <w:rFonts w:eastAsia="Consolas" w:cs="Consolas" w:ascii="Consolas" w:hAnsi="Consolas"/>
+                <w:color w:val="101820"/>
+                <w:kern w:val="0"/>
+                <w:sz w:val="16"/>
+                <w:szCs w:val="24"/>
+                <w:lang w:val="en-US" w:eastAsia="ja-JP" w:bidi="ar-SA"/>
+              </w:rPr>
+              <w:t>cas.enforce_print_order</w:t>
+            </w:r>
+            <w:r>
+              <w:rPr>
+                <w:rFonts w:eastAsia="Segoe UI" w:cs="Segoe UI" w:ascii="Segoe UI" w:hAnsi="Segoe UI"/>
+                <w:color w:val="101820"/>
+                <w:kern w:val="0"/>
+                <w:sz w:val="18"/>
+                <w:szCs w:val="24"/>
+                <w:lang w:val="en-US" w:eastAsia="ja-JP" w:bidi="ar-SA"/>
+              </w:rPr>
+              <w:t>)</w:t>
             </w:r>
           </w:p>
         </w:tc>
@@ -6643,7 +8051,7 @@
                 <w:szCs w:val="24"/>
                 <w:lang w:val="en-US" w:eastAsia="ja-JP" w:bidi="ar-SA"/>
               </w:rPr>
-              <w:t>Decide the form of the books (computerized books, or printed loose-leaf books) with the tax adviser; print, bind or submit them as the BIR requires; preserve them for the required period</w:t>
+              <w:t>Decide the form of the books (loose-leaf or computerized) with the tax adviser; print and bind the loose-leaf books every month, or keep the computerized books on storage media; preserve them for the required period</w:t>
             </w:r>
           </w:p>
         </w:tc>
@@ -6720,7 +8128,51 @@
                 <w:szCs w:val="24"/>
                 <w:lang w:val="en-US" w:eastAsia="ja-JP" w:bidi="ar-SA"/>
               </w:rPr>
-              <w:t>The system provides what a registration file typically needs: a description of the modules and controls (this documentation package and the user manual), sample outputs of journals, ledgers, trial balance and receipts, the number series with their counters, the audit trail, user access controls and period locks</w:t>
+              <w:t>Accounts &gt; Tax &gt; CAS Books and Documents produces the registration pack: system description and controls (modules, books, access, segregation of duties, numbering series, period control, audit trail, backup), backup and restore procedure (</w:t>
+            </w:r>
+            <w:r>
+              <w:rPr>
+                <w:rFonts w:eastAsia="Consolas" w:cs="Consolas" w:ascii="Consolas" w:hAnsi="Consolas"/>
+                <w:color w:val="101820"/>
+                <w:kern w:val="0"/>
+                <w:sz w:val="16"/>
+                <w:szCs w:val="24"/>
+                <w:lang w:val="en-US" w:eastAsia="ja-JP" w:bidi="ar-SA"/>
+              </w:rPr>
+              <w:t>cas.backup_*</w:t>
+            </w:r>
+            <w:r>
+              <w:rPr>
+                <w:rFonts w:eastAsia="Segoe UI" w:cs="Segoe UI" w:ascii="Segoe UI" w:hAnsi="Segoe UI"/>
+                <w:color w:val="101820"/>
+                <w:kern w:val="0"/>
+                <w:sz w:val="18"/>
+                <w:szCs w:val="24"/>
+                <w:lang w:val="en-US" w:eastAsia="ja-JP" w:bidi="ar-SA"/>
+              </w:rPr>
+              <w:t xml:space="preserve">), audit trail extract (Excel / PDF) for any date range, sample book prints, and a readiness checklist (taxpayer details, RDO, </w:t>
+            </w:r>
+            <w:r>
+              <w:rPr>
+                <w:rFonts w:eastAsia="Consolas" w:cs="Consolas" w:ascii="Consolas" w:hAnsi="Consolas"/>
+                <w:color w:val="101820"/>
+                <w:kern w:val="0"/>
+                <w:sz w:val="16"/>
+                <w:szCs w:val="24"/>
+                <w:lang w:val="en-US" w:eastAsia="ja-JP" w:bidi="ar-SA"/>
+              </w:rPr>
+              <w:t>cas.permit_number</w:t>
+            </w:r>
+            <w:r>
+              <w:rPr>
+                <w:rFonts w:eastAsia="Segoe UI" w:cs="Segoe UI" w:ascii="Segoe UI" w:hAnsi="Segoe UI"/>
+                <w:color w:val="101820"/>
+                <w:kern w:val="0"/>
+                <w:sz w:val="18"/>
+                <w:szCs w:val="24"/>
+                <w:lang w:val="en-US" w:eastAsia="ja-JP" w:bidi="ar-SA"/>
+              </w:rPr>
+              <w:t>, invoice permit, custodian, contact)</w:t>
             </w:r>
           </w:p>
         </w:tc>
@@ -6757,7 +8209,51 @@
                 <w:szCs w:val="24"/>
                 <w:lang w:val="en-US" w:eastAsia="ja-JP" w:bidi="ar-SA"/>
               </w:rPr>
-              <w:t>File the registration or acknowledgement application under the current BIR rules, with the system description and sample outputs; register any change the BIR requires to be registered; keep the system version on record</w:t>
+              <w:t xml:space="preserve">File the registration or acknowledgement application under the current BIR rules with the pack; record the permit number in </w:t>
+            </w:r>
+            <w:r>
+              <w:rPr>
+                <w:rFonts w:eastAsia="Consolas" w:cs="Consolas" w:ascii="Consolas" w:hAnsi="Consolas"/>
+                <w:color w:val="101820"/>
+                <w:kern w:val="0"/>
+                <w:sz w:val="16"/>
+                <w:szCs w:val="24"/>
+                <w:lang w:val="en-US" w:eastAsia="ja-JP" w:bidi="ar-SA"/>
+              </w:rPr>
+              <w:t>cas.permit_number</w:t>
+            </w:r>
+            <w:r>
+              <w:rPr>
+                <w:rFonts w:eastAsia="Segoe UI" w:cs="Segoe UI" w:ascii="Segoe UI" w:hAnsi="Segoe UI"/>
+                <w:color w:val="101820"/>
+                <w:kern w:val="0"/>
+                <w:sz w:val="18"/>
+                <w:szCs w:val="24"/>
+                <w:lang w:val="en-US" w:eastAsia="ja-JP" w:bidi="ar-SA"/>
+              </w:rPr>
+              <w:t xml:space="preserve"> and </w:t>
+            </w:r>
+            <w:r>
+              <w:rPr>
+                <w:rFonts w:eastAsia="Consolas" w:cs="Consolas" w:ascii="Consolas" w:hAnsi="Consolas"/>
+                <w:color w:val="101820"/>
+                <w:kern w:val="0"/>
+                <w:sz w:val="16"/>
+                <w:szCs w:val="24"/>
+                <w:lang w:val="en-US" w:eastAsia="ja-JP" w:bidi="ar-SA"/>
+              </w:rPr>
+              <w:t>invoice.cas_permit_number</w:t>
+            </w:r>
+            <w:r>
+              <w:rPr>
+                <w:rFonts w:eastAsia="Segoe UI" w:cs="Segoe UI" w:ascii="Segoe UI" w:hAnsi="Segoe UI"/>
+                <w:color w:val="101820"/>
+                <w:kern w:val="0"/>
+                <w:sz w:val="18"/>
+                <w:szCs w:val="24"/>
+                <w:lang w:val="en-US" w:eastAsia="ja-JP" w:bidi="ar-SA"/>
+              </w:rPr>
+              <w:t>; register any change the BIR requires to be registered</w:t>
             </w:r>
           </w:p>
         </w:tc>
@@ -6980,8 +8476,8 @@
         <w:pStyle w:val="Heading2"/>
         <w:rPr/>
       </w:pPr>
-      <w:bookmarkStart w:id="13" w:name="__RefHeading___Toc144163_3199679052"/>
-      <w:bookmarkEnd w:id="13"/>
+      <w:bookmarkStart w:id="14" w:name="__RefHeading___Toc12262_3960898926"/>
+      <w:bookmarkEnd w:id="14"/>
       <w:r>
         <w:rPr>
           <w:rFonts w:eastAsia="Segoe UI" w:cs="Segoe UI"/>
@@ -7206,7 +8702,128 @@
                 <w:szCs w:val="24"/>
                 <w:lang w:val="en-US" w:eastAsia="ja-JP" w:bidi="ar-SA"/>
               </w:rPr>
-              <w:t>Number series for the documents the broker issues: invoice / bill (INV), official receipt (OR, RT), commission debit note to insurers (DN), payment voucher (PV), BIR Form 2307 (CWT) and others; next numbers can continue the old system's numbering; printed on the letterhead with TIN</w:t>
+              <w:t>Accounts &gt; Tax &gt; Sales Invoices: sales invoices for commission debit notes, overriding commission, broker-billed commission and fees, with the seller's registered name, trade name, TIN with branch code, address and VAT status, ATP / CAS acknowledgement and serial range (</w:t>
+            </w:r>
+            <w:r>
+              <w:rPr>
+                <w:rFonts w:eastAsia="Consolas" w:cs="Consolas" w:ascii="Consolas" w:hAnsi="Consolas"/>
+                <w:color w:val="101820"/>
+                <w:kern w:val="0"/>
+                <w:sz w:val="16"/>
+                <w:szCs w:val="24"/>
+                <w:lang w:val="en-US" w:eastAsia="ja-JP" w:bidi="ar-SA"/>
+              </w:rPr>
+              <w:t>invoice.*</w:t>
+            </w:r>
+            <w:r>
+              <w:rPr>
+                <w:rFonts w:eastAsia="Segoe UI" w:cs="Segoe UI" w:ascii="Segoe UI" w:hAnsi="Segoe UI"/>
+                <w:color w:val="101820"/>
+                <w:kern w:val="0"/>
+                <w:sz w:val="18"/>
+                <w:szCs w:val="24"/>
+                <w:lang w:val="en-US" w:eastAsia="ja-JP" w:bidi="ar-SA"/>
+              </w:rPr>
+              <w:t xml:space="preserve">), buyer name, TIN and address (required for business buyers and from </w:t>
+            </w:r>
+            <w:r>
+              <w:rPr>
+                <w:rFonts w:eastAsia="Consolas" w:cs="Consolas" w:ascii="Consolas" w:hAnsi="Consolas"/>
+                <w:color w:val="101820"/>
+                <w:kern w:val="0"/>
+                <w:sz w:val="16"/>
+                <w:szCs w:val="24"/>
+                <w:lang w:val="en-US" w:eastAsia="ja-JP" w:bidi="ar-SA"/>
+              </w:rPr>
+              <w:t>invoice.buyer_details_threshold</w:t>
+            </w:r>
+            <w:r>
+              <w:rPr>
+                <w:rFonts w:eastAsia="Segoe UI" w:cs="Segoe UI" w:ascii="Segoe UI" w:hAnsi="Segoe UI"/>
+                <w:color w:val="101820"/>
+                <w:kern w:val="0"/>
+                <w:sz w:val="18"/>
+                <w:szCs w:val="24"/>
+                <w:lang w:val="en-US" w:eastAsia="ja-JP" w:bidi="ar-SA"/>
+              </w:rPr>
+              <w:t xml:space="preserve">), VATable / exempt / zero-rated breakdown and VAT; series SI- sequential, never reset, stopped at </w:t>
+            </w:r>
+            <w:r>
+              <w:rPr>
+                <w:rFonts w:eastAsia="Consolas" w:cs="Consolas" w:ascii="Consolas" w:hAnsi="Consolas"/>
+                <w:color w:val="101820"/>
+                <w:kern w:val="0"/>
+                <w:sz w:val="16"/>
+                <w:szCs w:val="24"/>
+                <w:lang w:val="en-US" w:eastAsia="ja-JP" w:bidi="ar-SA"/>
+              </w:rPr>
+              <w:t>invoice.serial_to</w:t>
+            </w:r>
+            <w:r>
+              <w:rPr>
+                <w:rFonts w:eastAsia="Segoe UI" w:cs="Segoe UI" w:ascii="Segoe UI" w:hAnsi="Segoe UI"/>
+                <w:color w:val="101820"/>
+                <w:kern w:val="0"/>
+                <w:sz w:val="18"/>
+                <w:szCs w:val="24"/>
+                <w:lang w:val="en-US" w:eastAsia="ja-JP" w:bidi="ar-SA"/>
+              </w:rPr>
+              <w:t>; cancellation with a reason (journal reversed); payments acknowledged by a supplementary document (</w:t>
+            </w:r>
+            <w:r>
+              <w:rPr>
+                <w:rFonts w:eastAsia="Consolas" w:cs="Consolas" w:ascii="Consolas" w:hAnsi="Consolas"/>
+                <w:color w:val="101820"/>
+                <w:kern w:val="0"/>
+                <w:sz w:val="16"/>
+                <w:szCs w:val="24"/>
+                <w:lang w:val="en-US" w:eastAsia="ja-JP" w:bidi="ar-SA"/>
+              </w:rPr>
+              <w:t>invoice.payment_document_title</w:t>
+            </w:r>
+            <w:r>
+              <w:rPr>
+                <w:rFonts w:eastAsia="Segoe UI" w:cs="Segoe UI" w:ascii="Segoe UI" w:hAnsi="Segoe UI"/>
+                <w:color w:val="101820"/>
+                <w:kern w:val="0"/>
+                <w:sz w:val="18"/>
+                <w:szCs w:val="24"/>
+                <w:lang w:val="en-US" w:eastAsia="ja-JP" w:bidi="ar-SA"/>
+              </w:rPr>
+              <w:t xml:space="preserve">, </w:t>
+            </w:r>
+            <w:r>
+              <w:rPr>
+                <w:rFonts w:eastAsia="Consolas" w:cs="Consolas" w:ascii="Consolas" w:hAnsi="Consolas"/>
+                <w:color w:val="101820"/>
+                <w:kern w:val="0"/>
+                <w:sz w:val="16"/>
+                <w:szCs w:val="24"/>
+                <w:lang w:val="en-US" w:eastAsia="ja-JP" w:bidi="ar-SA"/>
+              </w:rPr>
+              <w:t>invoice.supplementary_note</w:t>
+            </w:r>
+            <w:r>
+              <w:rPr>
+                <w:rFonts w:eastAsia="Segoe UI" w:cs="Segoe UI" w:ascii="Segoe UI" w:hAnsi="Segoe UI"/>
+                <w:color w:val="101820"/>
+                <w:kern w:val="0"/>
+                <w:sz w:val="18"/>
+                <w:szCs w:val="24"/>
+                <w:lang w:val="en-US" w:eastAsia="ja-JP" w:bidi="ar-SA"/>
+              </w:rPr>
+              <w:t xml:space="preserve">); premium collection receipts titled by </w:t>
+            </w:r>
+            <w:r>
+              <w:rPr>
+                <w:rFonts w:eastAsia="Consolas" w:cs="Consolas" w:ascii="Consolas" w:hAnsi="Consolas"/>
+                <w:color w:val="101820"/>
+                <w:kern w:val="0"/>
+                <w:sz w:val="16"/>
+                <w:szCs w:val="24"/>
+                <w:lang w:val="en-US" w:eastAsia="ja-JP" w:bidi="ar-SA"/>
+              </w:rPr>
+              <w:t>receipts.document_title</w:t>
             </w:r>
           </w:p>
         </w:tc>
@@ -7243,7 +8860,7 @@
                 <w:szCs w:val="24"/>
                 <w:lang w:val="en-US" w:eastAsia="ja-JP" w:bidi="ar-SA"/>
               </w:rPr>
-              <w:t>Decide with the tax adviser which BrokerVerse documents serve as the broker's registered invoices and receipts (for example the commission debit note or another invoice for commission income); register the series (ATP or the system-generated equivalent) and set the numbering to match; verify the printed layout carries every field the BIR requires; layout changes are outside the OOTB scope</w:t>
+              <w:t>Confirm with the tax adviser the documents registered as invoices, the supplementary document wording, the buyer threshold and the VAT treatment of each commission stream; register the series (ATP or system-generated) and set the serial range; layout changes beyond the settings are outside the OOTB scope</w:t>
             </w:r>
           </w:p>
         </w:tc>
@@ -7378,8 +8995,8 @@
         <w:pStyle w:val="Heading2"/>
         <w:rPr/>
       </w:pPr>
-      <w:bookmarkStart w:id="14" w:name="__RefHeading___Toc144165_3199679052"/>
-      <w:bookmarkEnd w:id="14"/>
+      <w:bookmarkStart w:id="15" w:name="__RefHeading___Toc12264_3960898926"/>
+      <w:bookmarkEnd w:id="15"/>
       <w:r>
         <w:rPr>
           <w:rFonts w:eastAsia="Segoe UI" w:cs="Segoe UI"/>
@@ -7773,7 +9390,51 @@
                 <w:szCs w:val="24"/>
                 <w:lang w:val="en-US" w:eastAsia="ja-JP" w:bidi="ar-SA"/>
               </w:rPr>
-              <w:t xml:space="preserve"> (delivered on) removes VAT from commission debit notes when switched off. Commission income is in the ledger by insurer (Income Statement, General Ledger Detail)</w:t>
+              <w:t xml:space="preserve"> off makes the broker non-VAT: no VAT on debit notes and invoices. Accounts &gt; Tax &gt; Percentage Tax 2551Q: gross sales per month from the ledger revenue accounts at </w:t>
+            </w:r>
+            <w:r>
+              <w:rPr>
+                <w:rFonts w:eastAsia="Consolas" w:cs="Consolas" w:ascii="Consolas" w:hAnsi="Consolas"/>
+                <w:color w:val="101820"/>
+                <w:kern w:val="0"/>
+                <w:sz w:val="16"/>
+                <w:szCs w:val="24"/>
+                <w:lang w:val="en-US" w:eastAsia="ja-JP" w:bidi="ar-SA"/>
+              </w:rPr>
+              <w:t>bir.percentage_tax_rate</w:t>
+            </w:r>
+            <w:r>
+              <w:rPr>
+                <w:rFonts w:eastAsia="Segoe UI" w:cs="Segoe UI" w:ascii="Segoe UI" w:hAnsi="Segoe UI"/>
+                <w:color w:val="101820"/>
+                <w:kern w:val="0"/>
+                <w:sz w:val="18"/>
+                <w:szCs w:val="24"/>
+                <w:lang w:val="en-US" w:eastAsia="ja-JP" w:bidi="ar-SA"/>
+              </w:rPr>
+              <w:t xml:space="preserve"> (default 3%, ATC </w:t>
+            </w:r>
+            <w:r>
+              <w:rPr>
+                <w:rFonts w:eastAsia="Consolas" w:cs="Consolas" w:ascii="Consolas" w:hAnsi="Consolas"/>
+                <w:color w:val="101820"/>
+                <w:kern w:val="0"/>
+                <w:sz w:val="16"/>
+                <w:szCs w:val="24"/>
+                <w:lang w:val="en-US" w:eastAsia="ja-JP" w:bidi="ar-SA"/>
+              </w:rPr>
+              <w:t>bir.percentage_tax_atc</w:t>
+            </w:r>
+            <w:r>
+              <w:rPr>
+                <w:rFonts w:eastAsia="Segoe UI" w:cs="Segoe UI" w:ascii="Segoe UI" w:hAnsi="Segoe UI"/>
+                <w:color w:val="101820"/>
+                <w:kern w:val="0"/>
+                <w:sz w:val="18"/>
+                <w:szCs w:val="24"/>
+                <w:lang w:val="en-US" w:eastAsia="ja-JP" w:bidi="ar-SA"/>
+              </w:rPr>
+              <w:t xml:space="preserve"> PT010), print and Excel, filing record</w:t>
             </w:r>
           </w:p>
         </w:tc>
@@ -7810,7 +9471,7 @@
                 <w:szCs w:val="24"/>
                 <w:lang w:val="en-US" w:eastAsia="ja-JP" w:bidi="ar-SA"/>
               </w:rPr>
-              <w:t>Compute and file the percentage tax return (BIR Form 2551Q); the system has no percentage tax working paper; add a tax code in Taxation only with the tax adviser</w:t>
+              <w:t>Confirm the rate and the basis (gross sales under the EOPT Act) with the tax adviser; file and pay the 2551Q</w:t>
             </w:r>
           </w:p>
         </w:tc>
@@ -7831,8 +9492,8 @@
         <w:pStyle w:val="Heading2"/>
         <w:rPr/>
       </w:pPr>
-      <w:bookmarkStart w:id="15" w:name="__RefHeading___Toc144167_3199679052"/>
-      <w:bookmarkEnd w:id="15"/>
+      <w:bookmarkStart w:id="16" w:name="__RefHeading___Toc12266_3960898926"/>
+      <w:bookmarkEnd w:id="16"/>
       <w:r>
         <w:rPr>
           <w:rFonts w:eastAsia="Segoe UI" w:cs="Segoe UI"/>
@@ -8057,7 +9718,7 @@
                 <w:szCs w:val="24"/>
                 <w:lang w:val="en-US" w:eastAsia="ja-JP" w:bidi="ar-SA"/>
               </w:rPr>
-              <w:t>Withholding on referrer commission at the rate of a tax code: the payee's own code, else the code of its type (</w:t>
+              <w:t>Withholding on referrer commission at the rate of a tax code (</w:t>
             </w:r>
             <w:r>
               <w:rPr>
@@ -8079,29 +9740,7 @@
                 <w:szCs w:val="24"/>
                 <w:lang w:val="en-US" w:eastAsia="ja-JP" w:bidi="ar-SA"/>
               </w:rPr>
-              <w:t xml:space="preserve">: Agent WI515 5%, Sub-agent WI515 5%, External WC515 10% delivered); EWT tax codes with ATC (for example WI139 and WC139 on broker commission, WI515 on commission of sales representatives and referrers; ATC per payee type in </w:t>
-            </w:r>
-            <w:r>
-              <w:rPr>
-                <w:rFonts w:eastAsia="Consolas" w:cs="Consolas" w:ascii="Consolas" w:hAnsi="Consolas"/>
-                <w:color w:val="101820"/>
-                <w:kern w:val="0"/>
-                <w:sz w:val="16"/>
-                <w:szCs w:val="24"/>
-                <w:lang w:val="en-US" w:eastAsia="ja-JP" w:bidi="ar-SA"/>
-              </w:rPr>
-              <w:t>bir.atc_by_payee</w:t>
-            </w:r>
-            <w:r>
-              <w:rPr>
-                <w:rFonts w:eastAsia="Segoe UI" w:cs="Segoe UI" w:ascii="Segoe UI" w:hAnsi="Segoe UI"/>
-                <w:color w:val="101820"/>
-                <w:kern w:val="0"/>
-                <w:sz w:val="18"/>
-                <w:szCs w:val="24"/>
-                <w:lang w:val="en-US" w:eastAsia="ja-JP" w:bidi="ar-SA"/>
-              </w:rPr>
-              <w:t>); payment vouchers post the tax withheld. Accounts &gt; Tax &gt; BIR Form 2307, Issued by us: certificates per payee and quarter with number series CWT; QAP: Quarterly Alphalist of Payees for the quarterly remittance return (BIR Form 1601-EQ)</w:t>
+              <w:t>); EWT tax codes with ATC; payment vouchers post the tax withheld. Accounts &gt; Tax &gt; BIR Form 2307 (Issued by us). Accounts &gt; Tax &gt; Withholding Returns: 0619-E per month and 1601-EQ per quarter per ATC on the BIR layout (PDF and Excel), reconciled with the QAP and the ledger withholding accounts, with the filing record (date filed, reference, amount paid, penalties, payment reference, amended returns). Annual Alphalist 1604-E with schedules 3 and 4</w:t>
             </w:r>
           </w:p>
         </w:tc>
@@ -8138,7 +9777,7 @@
                 <w:szCs w:val="24"/>
                 <w:lang w:val="en-US" w:eastAsia="ja-JP" w:bidi="ar-SA"/>
               </w:rPr>
-              <w:t>Confirm rates and ATC per payee with the tax adviser, including the payee's sworn declarations where rates depend on them; file and pay the monthly (BIR Form 0619-E) and quarterly (1601-EQ) returns with the QAP; issue Form 2307 to payees on time; prepare the annual information return and alphalist</w:t>
+              <w:t>Confirm rates and ATC per payee with the tax adviser; file and pay through eFPS / eBIRForms and record each filing; issue Form 2307 to payees on time</w:t>
             </w:r>
           </w:p>
         </w:tc>
@@ -8409,8 +10048,8 @@
         <w:pStyle w:val="Heading2"/>
         <w:rPr/>
       </w:pPr>
-      <w:bookmarkStart w:id="16" w:name="__RefHeading___Toc144169_3199679052"/>
-      <w:bookmarkEnd w:id="16"/>
+      <w:bookmarkStart w:id="17" w:name="__RefHeading___Toc12268_3960898926"/>
+      <w:bookmarkEnd w:id="17"/>
       <w:r>
         <w:rPr>
           <w:rFonts w:eastAsia="Segoe UI" w:cs="Segoe UI"/>
@@ -8635,7 +10274,7 @@
                 <w:szCs w:val="24"/>
                 <w:lang w:val="en-US" w:eastAsia="ja-JP" w:bidi="ar-SA"/>
               </w:rPr>
-              <w:t>Accounts &gt; Tax &gt; SLSP Sales and SLSP Purchases, in the BIR column order, as CSV, Excel or PDF</w:t>
+              <w:t>Accounts &gt; Tax &gt; SLSP Sales and SLSP Purchases, in the BIR column order, as CSV, Excel or PDF; Accounts &gt; Tax &gt; BIR DAT Files produces the RELIEF data files of the sales and purchases</w:t>
             </w:r>
           </w:p>
         </w:tc>
@@ -8672,7 +10311,7 @@
                 <w:szCs w:val="24"/>
                 <w:lang w:val="en-US" w:eastAsia="ja-JP" w:bidi="ar-SA"/>
               </w:rPr>
-              <w:t>Check whether the broker is required to submit; validate the files with the BIR's validation tools and current format before submission (user manual, chapter 18)</w:t>
+              <w:t>Check whether the broker is required to submit; validate the files with the current BIR validation module before submission</w:t>
             </w:r>
           </w:p>
         </w:tc>
@@ -8749,7 +10388,7 @@
                 <w:szCs w:val="24"/>
                 <w:lang w:val="en-US" w:eastAsia="ja-JP" w:bidi="ar-SA"/>
               </w:rPr>
-              <w:t>SAWT and QAP give the figures in the BIR column order</w:t>
+              <w:t>SAWT, QAP and the 1604-E alphalist in the BIR column order; Accounts &gt; Tax &gt; BIR DAT Files produces the DAT files of the QAP, SAWT and 1604-E (layout of the BIR Alphalist Data Entry and Validation Module v7.x, version shown on screen) with warnings for missing TINs</w:t>
             </w:r>
           </w:p>
         </w:tc>
@@ -8786,7 +10425,143 @@
                 <w:szCs w:val="24"/>
                 <w:lang w:val="en-US" w:eastAsia="ja-JP" w:bidi="ar-SA"/>
               </w:rPr>
-              <w:t>Validate against the current BIR format and the eFPS or eBIRForms validation before filing; the system does not file</w:t>
+              <w:t>Validate every DAT file with the current BIR validation module before submission; the system does not file</w:t>
+            </w:r>
+          </w:p>
+        </w:tc>
+      </w:tr>
+      <w:tr>
+        <w:trPr/>
+        <w:tc>
+          <w:tcPr>
+            <w:tcW w:w="3005" w:type="dxa"/>
+            <w:tcBorders>
+              <w:top w:val="single" w:sz="4" w:space="0" w:color="BFC7D1"/>
+              <w:left w:val="single" w:sz="4" w:space="0" w:color="BFC7D1"/>
+              <w:bottom w:val="single" w:sz="4" w:space="0" w:color="BFC7D1"/>
+              <w:right w:val="single" w:sz="4" w:space="0" w:color="BFC7D1"/>
+            </w:tcBorders>
+          </w:tcPr>
+          <w:p>
+            <w:pPr>
+              <w:pStyle w:val="Normal"/>
+              <w:widowControl/>
+              <w:spacing w:lineRule="auto" w:line="240" w:before="0" w:after="20"/>
+              <w:jc w:val="left"/>
+              <w:rPr>
+                <w:rFonts w:ascii="Aptos" w:hAnsi="Aptos" w:eastAsia="ＭＳ 明朝" w:cs="Arial"/>
+                <w:kern w:val="0"/>
+                <w:sz w:val="24"/>
+                <w:szCs w:val="24"/>
+                <w:lang w:val="en-US" w:eastAsia="ja-JP" w:bidi="ar-SA"/>
+              </w:rPr>
+            </w:pPr>
+            <w:r>
+              <w:rPr>
+                <w:rFonts w:eastAsia="Segoe UI" w:cs="Segoe UI" w:ascii="Segoe UI" w:hAnsi="Segoe UI"/>
+                <w:color w:val="101820"/>
+                <w:kern w:val="0"/>
+                <w:sz w:val="18"/>
+                <w:szCs w:val="24"/>
+                <w:lang w:val="en-US" w:eastAsia="ja-JP" w:bidi="ar-SA"/>
+              </w:rPr>
+              <w:t>Electronic invoicing (EIS). Taxpayers the BIR names report their invoices to the Electronic Invoicing System.</w:t>
+            </w:r>
+          </w:p>
+        </w:tc>
+        <w:tc>
+          <w:tcPr>
+            <w:tcW w:w="3005" w:type="dxa"/>
+            <w:tcBorders>
+              <w:top w:val="single" w:sz="4" w:space="0" w:color="BFC7D1"/>
+              <w:left w:val="single" w:sz="4" w:space="0" w:color="BFC7D1"/>
+              <w:bottom w:val="single" w:sz="4" w:space="0" w:color="BFC7D1"/>
+              <w:right w:val="single" w:sz="4" w:space="0" w:color="BFC7D1"/>
+            </w:tcBorders>
+          </w:tcPr>
+          <w:p>
+            <w:pPr>
+              <w:pStyle w:val="Normal"/>
+              <w:widowControl/>
+              <w:spacing w:lineRule="auto" w:line="240" w:before="0" w:after="20"/>
+              <w:jc w:val="left"/>
+              <w:rPr>
+                <w:rFonts w:ascii="Aptos" w:hAnsi="Aptos" w:eastAsia="ＭＳ 明朝" w:cs="Arial"/>
+                <w:kern w:val="0"/>
+                <w:sz w:val="24"/>
+                <w:szCs w:val="24"/>
+                <w:lang w:val="en-US" w:eastAsia="ja-JP" w:bidi="ar-SA"/>
+              </w:rPr>
+            </w:pPr>
+            <w:r>
+              <w:rPr>
+                <w:rFonts w:eastAsia="Segoe UI" w:cs="Segoe UI" w:ascii="Segoe UI" w:hAnsi="Segoe UI"/>
+                <w:color w:val="101820"/>
+                <w:kern w:val="0"/>
+                <w:sz w:val="18"/>
+                <w:szCs w:val="24"/>
+                <w:lang w:val="en-US" w:eastAsia="ja-JP" w:bidi="ar-SA"/>
+              </w:rPr>
+              <w:t xml:space="preserve">Accounts &gt; Tax &gt; E-Invoicing (EIS): e-invoice payload per invoice and cancellation, signing placeholder, outbox with status, attempts and retry, test mode with a built-in fake provider, live adapter with the endpoint and credential variable names in </w:t>
+            </w:r>
+            <w:r>
+              <w:rPr>
+                <w:rFonts w:eastAsia="Consolas" w:cs="Consolas" w:ascii="Consolas" w:hAnsi="Consolas"/>
+                <w:color w:val="101820"/>
+                <w:kern w:val="0"/>
+                <w:sz w:val="16"/>
+                <w:szCs w:val="24"/>
+                <w:lang w:val="en-US" w:eastAsia="ja-JP" w:bidi="ar-SA"/>
+              </w:rPr>
+              <w:t>eis.*</w:t>
+            </w:r>
+            <w:r>
+              <w:rPr>
+                <w:rFonts w:eastAsia="Segoe UI" w:cs="Segoe UI" w:ascii="Segoe UI" w:hAnsi="Segoe UI"/>
+                <w:color w:val="101820"/>
+                <w:kern w:val="0"/>
+                <w:sz w:val="18"/>
+                <w:szCs w:val="24"/>
+                <w:lang w:val="en-US" w:eastAsia="ja-JP" w:bidi="ar-SA"/>
+              </w:rPr>
+              <w:t xml:space="preserve"> (values never stored), export of the payloads and manual reference as fallback; switched off by default</w:t>
+            </w:r>
+          </w:p>
+        </w:tc>
+        <w:tc>
+          <w:tcPr>
+            <w:tcW w:w="3005" w:type="dxa"/>
+            <w:tcBorders>
+              <w:top w:val="single" w:sz="4" w:space="0" w:color="BFC7D1"/>
+              <w:left w:val="single" w:sz="4" w:space="0" w:color="BFC7D1"/>
+              <w:bottom w:val="single" w:sz="4" w:space="0" w:color="BFC7D1"/>
+              <w:right w:val="single" w:sz="4" w:space="0" w:color="BFC7D1"/>
+            </w:tcBorders>
+          </w:tcPr>
+          <w:p>
+            <w:pPr>
+              <w:pStyle w:val="Normal"/>
+              <w:widowControl/>
+              <w:spacing w:lineRule="auto" w:line="240" w:before="0" w:after="20"/>
+              <w:jc w:val="left"/>
+              <w:rPr>
+                <w:rFonts w:ascii="Aptos" w:hAnsi="Aptos" w:eastAsia="ＭＳ 明朝" w:cs="Arial"/>
+                <w:kern w:val="0"/>
+                <w:sz w:val="24"/>
+                <w:szCs w:val="24"/>
+                <w:lang w:val="en-US" w:eastAsia="ja-JP" w:bidi="ar-SA"/>
+              </w:rPr>
+            </w:pPr>
+            <w:r>
+              <w:rPr>
+                <w:rFonts w:eastAsia="Segoe UI" w:cs="Segoe UI" w:ascii="Segoe UI" w:hAnsi="Segoe UI"/>
+                <w:color w:val="101820"/>
+                <w:kern w:val="0"/>
+                <w:sz w:val="18"/>
+                <w:szCs w:val="24"/>
+                <w:lang w:val="en-US" w:eastAsia="ja-JP" w:bidi="ar-SA"/>
+              </w:rPr>
+              <w:t>Enrol with the EIS and complete the BIR certification (sandbox tests, final field list, signing certificate); set the endpoint and credentials on the server; switch the connector on</w:t>
             </w:r>
           </w:p>
         </w:tc>
@@ -8800,8 +10575,8 @@
       <w:r>
         <w:br w:type="page"/>
       </w:r>
-      <w:bookmarkStart w:id="17" w:name="__RefHeading___Toc144171_3199679052"/>
-      <w:bookmarkEnd w:id="17"/>
+      <w:bookmarkStart w:id="18" w:name="__RefHeading___Toc12270_3960898926"/>
+      <w:bookmarkEnd w:id="18"/>
       <w:r>
         <w:rPr>
           <w:rFonts w:eastAsia="Segoe UI" w:cs="Segoe UI" w:ascii="Segoe UI" w:hAnsi="Segoe UI"/>
@@ -9548,8 +11323,8 @@
       <w:r>
         <w:br w:type="page"/>
       </w:r>
-      <w:bookmarkStart w:id="18" w:name="__RefHeading___Toc144173_3199679052"/>
-      <w:bookmarkEnd w:id="18"/>
+      <w:bookmarkStart w:id="19" w:name="__RefHeading___Toc12272_3960898926"/>
+      <w:bookmarkEnd w:id="19"/>
       <w:r>
         <w:rPr>
           <w:rFonts w:eastAsia="Segoe UI" w:cs="Segoe UI" w:ascii="Segoe UI" w:hAnsi="Segoe UI"/>
@@ -9811,7 +11586,7 @@
                 <w:szCs w:val="24"/>
                 <w:lang w:val="en-US" w:eastAsia="ja-JP" w:bidi="ar-SA"/>
               </w:rPr>
-              <w:t>Keep the tariff equal to the current IC tariff and the insurers' rates (the delivered amounts were confirmed on 29 September 2026); complete the CTPL authentication and certificate in the insurer's or the government's system, which is outside BrokerVerse</w:t>
+              <w:t>Keep the tariff equal to the current IC tariff and the insurers' rates (the delivered amounts were confirmed on 29 September 2026); authenticate each COC through Operations &gt; CTPL Authentication (COC series per insurer, request to the IC-accredited provider, code printed on the schedule, LTO feed, manual entry of a code obtained on the provider portal); the provider and LTO interfaces are certified with the partner during onboarding</w:t>
             </w:r>
           </w:p>
         </w:tc>
@@ -10200,8 +11975,8 @@
       <w:r>
         <w:br w:type="page"/>
       </w:r>
-      <w:bookmarkStart w:id="19" w:name="__RefHeading___Toc144175_3199679052"/>
-      <w:bookmarkEnd w:id="19"/>
+      <w:bookmarkStart w:id="20" w:name="__RefHeading___Toc12274_3960898926"/>
+      <w:bookmarkEnd w:id="20"/>
       <w:r>
         <w:rPr>
           <w:rFonts w:eastAsia="Segoe UI" w:cs="Segoe UI" w:ascii="Segoe UI" w:hAnsi="Segoe UI"/>
@@ -10665,7 +12440,118 @@
                 <w:szCs w:val="24"/>
                 <w:lang w:val="en-US" w:eastAsia="ja-JP" w:bidi="ar-SA"/>
               </w:rPr>
-              <w:t>); passwords and tokens redacted from logs; HTTPS</w:t>
+              <w:t xml:space="preserve">); passwords and tokens redacted from logs; HTTPS. TIN, government ID numbers and bank account numbers are encrypted at rest (AES-256, key </w:t>
+            </w:r>
+            <w:r>
+              <w:rPr>
+                <w:rFonts w:eastAsia="Consolas" w:cs="Consolas" w:ascii="Consolas" w:hAnsi="Consolas"/>
+                <w:color w:val="101820"/>
+                <w:kern w:val="0"/>
+                <w:sz w:val="16"/>
+                <w:szCs w:val="24"/>
+                <w:lang w:val="en-US" w:eastAsia="ja-JP" w:bidi="ar-SA"/>
+              </w:rPr>
+              <w:t>PII_ENCRYPTION_KEY</w:t>
+            </w:r>
+            <w:r>
+              <w:rPr>
+                <w:rFonts w:eastAsia="Segoe UI" w:cs="Segoe UI" w:ascii="Segoe UI" w:hAnsi="Segoe UI"/>
+                <w:color w:val="101820"/>
+                <w:kern w:val="0"/>
+                <w:sz w:val="18"/>
+                <w:szCs w:val="24"/>
+                <w:lang w:val="en-US" w:eastAsia="ja-JP" w:bidi="ar-SA"/>
+              </w:rPr>
+              <w:t xml:space="preserve">, rotation procedure in deploy/REFERENCE.md) with search by exact value kept; users without </w:t>
+            </w:r>
+            <w:r>
+              <w:rPr>
+                <w:rFonts w:eastAsia="Segoe UI" w:cs="Segoe UI" w:ascii="Segoe UI" w:hAnsi="Segoe UI"/>
+                <w:b/>
+                <w:color w:val="101820"/>
+                <w:kern w:val="0"/>
+                <w:sz w:val="18"/>
+                <w:szCs w:val="24"/>
+                <w:lang w:val="en-US" w:eastAsia="ja-JP" w:bidi="ar-SA"/>
+              </w:rPr>
+              <w:t>View full personal identifiers</w:t>
+            </w:r>
+            <w:r>
+              <w:rPr>
+                <w:rFonts w:eastAsia="Segoe UI" w:cs="Segoe UI" w:ascii="Segoe UI" w:hAnsi="Segoe UI"/>
+                <w:color w:val="101820"/>
+                <w:kern w:val="0"/>
+                <w:sz w:val="18"/>
+                <w:szCs w:val="24"/>
+                <w:lang w:val="en-US" w:eastAsia="ja-JP" w:bidi="ar-SA"/>
+              </w:rPr>
+              <w:t xml:space="preserve"> (</w:t>
+            </w:r>
+            <w:r>
+              <w:rPr>
+                <w:rFonts w:eastAsia="Consolas" w:cs="Consolas" w:ascii="Consolas" w:hAnsi="Consolas"/>
+                <w:color w:val="101820"/>
+                <w:kern w:val="0"/>
+                <w:sz w:val="16"/>
+                <w:szCs w:val="24"/>
+                <w:lang w:val="en-US" w:eastAsia="ja-JP" w:bidi="ar-SA"/>
+              </w:rPr>
+              <w:t>view:pii</w:t>
+            </w:r>
+            <w:r>
+              <w:rPr>
+                <w:rFonts w:eastAsia="Segoe UI" w:cs="Segoe UI" w:ascii="Segoe UI" w:hAnsi="Segoe UI"/>
+                <w:color w:val="101820"/>
+                <w:kern w:val="0"/>
+                <w:sz w:val="18"/>
+                <w:szCs w:val="24"/>
+                <w:lang w:val="en-US" w:eastAsia="ja-JP" w:bidi="ar-SA"/>
+              </w:rPr>
+              <w:t>) see TIN, ID numbers, mobile, e-mail, bank account and birth date partially masked on screens and exports (</w:t>
+            </w:r>
+            <w:r>
+              <w:rPr>
+                <w:rFonts w:eastAsia="Consolas" w:cs="Consolas" w:ascii="Consolas" w:hAnsi="Consolas"/>
+                <w:color w:val="101820"/>
+                <w:kern w:val="0"/>
+                <w:sz w:val="16"/>
+                <w:szCs w:val="24"/>
+                <w:lang w:val="en-US" w:eastAsia="ja-JP" w:bidi="ar-SA"/>
+              </w:rPr>
+              <w:t>privacy.masking_enabled</w:t>
+            </w:r>
+            <w:r>
+              <w:rPr>
+                <w:rFonts w:eastAsia="Segoe UI" w:cs="Segoe UI" w:ascii="Segoe UI" w:hAnsi="Segoe UI"/>
+                <w:color w:val="101820"/>
+                <w:kern w:val="0"/>
+                <w:sz w:val="18"/>
+                <w:szCs w:val="24"/>
+                <w:lang w:val="en-US" w:eastAsia="ja-JP" w:bidi="ar-SA"/>
+              </w:rPr>
+              <w:t xml:space="preserve">, </w:t>
+            </w:r>
+            <w:r>
+              <w:rPr>
+                <w:rFonts w:eastAsia="Consolas" w:cs="Consolas" w:ascii="Consolas" w:hAnsi="Consolas"/>
+                <w:color w:val="101820"/>
+                <w:kern w:val="0"/>
+                <w:sz w:val="16"/>
+                <w:szCs w:val="24"/>
+                <w:lang w:val="en-US" w:eastAsia="ja-JP" w:bidi="ar-SA"/>
+              </w:rPr>
+              <w:t>privacy.pii_reveal_mode</w:t>
+            </w:r>
+            <w:r>
+              <w:rPr>
+                <w:rFonts w:eastAsia="Segoe UI" w:cs="Segoe UI" w:ascii="Segoe UI" w:hAnsi="Segoe UI"/>
+                <w:color w:val="101820"/>
+                <w:kern w:val="0"/>
+                <w:sz w:val="18"/>
+                <w:szCs w:val="24"/>
+                <w:lang w:val="en-US" w:eastAsia="ja-JP" w:bidi="ar-SA"/>
+              </w:rPr>
+              <w:t xml:space="preserve"> with unmasking recorded in the audit trail)</w:t>
             </w:r>
           </w:p>
         </w:tc>
@@ -10702,7 +12588,51 @@
                 <w:szCs w:val="24"/>
                 <w:lang w:val="en-US" w:eastAsia="ja-JP" w:bidi="ar-SA"/>
               </w:rPr>
-              <w:t>Set the two-step verification roles (recommended: system-admin, accounting, accounting-manager); grant roles on a need-to-know basis; keep devices and browsers secure; adopt the security policy the DPA and NPC rules require</w:t>
+              <w:t xml:space="preserve">Keep </w:t>
+            </w:r>
+            <w:r>
+              <w:rPr>
+                <w:rFonts w:eastAsia="Consolas" w:cs="Consolas" w:ascii="Consolas" w:hAnsi="Consolas"/>
+                <w:color w:val="101820"/>
+                <w:kern w:val="0"/>
+                <w:sz w:val="16"/>
+                <w:szCs w:val="24"/>
+                <w:lang w:val="en-US" w:eastAsia="ja-JP" w:bidi="ar-SA"/>
+              </w:rPr>
+              <w:t>PII_ENCRYPTION_KEY</w:t>
+            </w:r>
+            <w:r>
+              <w:rPr>
+                <w:rFonts w:eastAsia="Segoe UI" w:cs="Segoe UI" w:ascii="Segoe UI" w:hAnsi="Segoe UI"/>
+                <w:color w:val="101820"/>
+                <w:kern w:val="0"/>
+                <w:sz w:val="18"/>
+                <w:szCs w:val="24"/>
+                <w:lang w:val="en-US" w:eastAsia="ja-JP" w:bidi="ar-SA"/>
+              </w:rPr>
+              <w:t xml:space="preserve"> with the backups and rotate it under the key management policy; grant </w:t>
+            </w:r>
+            <w:r>
+              <w:rPr>
+                <w:rFonts w:eastAsia="Consolas" w:cs="Consolas" w:ascii="Consolas" w:hAnsi="Consolas"/>
+                <w:color w:val="101820"/>
+                <w:kern w:val="0"/>
+                <w:sz w:val="16"/>
+                <w:szCs w:val="24"/>
+                <w:lang w:val="en-US" w:eastAsia="ja-JP" w:bidi="ar-SA"/>
+              </w:rPr>
+              <w:t>view:pii</w:t>
+            </w:r>
+            <w:r>
+              <w:rPr>
+                <w:rFonts w:eastAsia="Segoe UI" w:cs="Segoe UI" w:ascii="Segoe UI" w:hAnsi="Segoe UI"/>
+                <w:color w:val="101820"/>
+                <w:kern w:val="0"/>
+                <w:sz w:val="18"/>
+                <w:szCs w:val="24"/>
+                <w:lang w:val="en-US" w:eastAsia="ja-JP" w:bidi="ar-SA"/>
+              </w:rPr>
+              <w:t xml:space="preserve"> only to roles that need it; set the two-step verification roles (recommended: system-admin, accounting, accounting-manager); grant roles on a need-to-know basis; keep devices and browsers secure; adopt the security policy the DPA and NPC rules require</w:t>
             </w:r>
           </w:p>
         </w:tc>
@@ -10779,7 +12709,7 @@
                 <w:szCs w:val="24"/>
                 <w:lang w:val="en-US" w:eastAsia="ja-JP" w:bidi="ar-SA"/>
               </w:rPr>
-              <w:t>Master &gt; Generals &gt; User Management: User Access Matrix, Segregation of Duties, Access Reviews; Audit Trail of sign-ins and changes; login history</w:t>
+              <w:t>Master &gt; Users and Access: User Access Matrix, Segregation of Duties, Access Reviews; Audit Trail of sign-ins and changes; login history</w:t>
             </w:r>
           </w:p>
         </w:tc>
@@ -11036,7 +12966,7 @@
                 <w:szCs w:val="24"/>
                 <w:lang w:val="en-US" w:eastAsia="ja-JP" w:bidi="ar-SA"/>
               </w:rPr>
-              <w:t>Retention and disposal. Personal data is kept only as long as needed for the purpose or as the law requires, then disposed of securely.</w:t>
+              <w:t>Direct marketing only with consent; the right to object to direct marketing.</w:t>
             </w:r>
           </w:p>
         </w:tc>
@@ -11073,7 +13003,44 @@
                 <w:szCs w:val="24"/>
                 <w:lang w:val="en-US" w:eastAsia="ja-JP" w:bidi="ar-SA"/>
               </w:rPr>
-              <w:t>Operational logs are deleted after their retention days (</w:t>
+              <w:t>Operations &gt; Sales &amp; Marketing &gt; Campaigns e-mails only clients and prospects whose marketing consent is in force in the consent register and who have an e-mail; everyone else is recorded as excluded with the reason. Every e-mail carries a personal opt-out link; confirming it records a refusal of the marketing purpose (channel E-mail) and later campaigns leave the person out. Campaign results show the opt-outs</w:t>
+            </w:r>
+          </w:p>
+        </w:tc>
+        <w:tc>
+          <w:tcPr>
+            <w:tcW w:w="3005" w:type="dxa"/>
+            <w:tcBorders>
+              <w:top w:val="single" w:sz="4" w:space="0" w:color="BFC7D1"/>
+              <w:left w:val="single" w:sz="4" w:space="0" w:color="BFC7D1"/>
+              <w:bottom w:val="single" w:sz="4" w:space="0" w:color="BFC7D1"/>
+              <w:right w:val="single" w:sz="4" w:space="0" w:color="BFC7D1"/>
+            </w:tcBorders>
+          </w:tcPr>
+          <w:p>
+            <w:pPr>
+              <w:pStyle w:val="Normal"/>
+              <w:widowControl/>
+              <w:spacing w:lineRule="auto" w:line="240" w:before="0" w:after="20"/>
+              <w:jc w:val="left"/>
+              <w:rPr>
+                <w:rFonts w:ascii="Aptos" w:hAnsi="Aptos" w:eastAsia="ＭＳ 明朝" w:cs="Arial"/>
+                <w:kern w:val="0"/>
+                <w:sz w:val="24"/>
+                <w:szCs w:val="24"/>
+                <w:lang w:val="en-US" w:eastAsia="ja-JP" w:bidi="ar-SA"/>
+              </w:rPr>
+            </w:pPr>
+            <w:r>
+              <w:rPr>
+                <w:rFonts w:eastAsia="Segoe UI" w:cs="Segoe UI" w:ascii="Segoe UI" w:hAnsi="Segoe UI"/>
+                <w:color w:val="101820"/>
+                <w:kern w:val="0"/>
+                <w:sz w:val="18"/>
+                <w:szCs w:val="24"/>
+                <w:lang w:val="en-US" w:eastAsia="ja-JP" w:bidi="ar-SA"/>
+              </w:rPr>
+              <w:t>Collect marketing consent with the privacy notice; word the opt-out text (</w:t>
             </w:r>
             <w:r>
               <w:rPr>
@@ -11084,77 +13051,18 @@
                 <w:szCs w:val="24"/>
                 <w:lang w:val="en-US" w:eastAsia="ja-JP" w:bidi="ar-SA"/>
               </w:rPr>
-              <w:t>housekeeping.*</w:t>
-            </w:r>
-            <w:r>
-              <w:rPr>
-                <w:rFonts w:eastAsia="Segoe UI" w:cs="Segoe UI" w:ascii="Segoe UI" w:hAnsi="Segoe UI"/>
-                <w:color w:val="101820"/>
-                <w:kern w:val="0"/>
-                <w:sz w:val="18"/>
-                <w:szCs w:val="24"/>
-                <w:lang w:val="en-US" w:eastAsia="ja-JP" w:bidi="ar-SA"/>
-              </w:rPr>
-              <w:t xml:space="preserve">: sign-in history 365 days, sent e-mails 180 days, read notifications 180 days); business records and the audit trail are kept; the personal data of a client or prospect can be anonymised once </w:t>
-            </w:r>
-            <w:r>
-              <w:rPr>
-                <w:rFonts w:eastAsia="Consolas" w:cs="Consolas" w:ascii="Consolas" w:hAnsi="Consolas"/>
-                <w:color w:val="101820"/>
-                <w:kern w:val="0"/>
-                <w:sz w:val="16"/>
-                <w:szCs w:val="24"/>
-                <w:lang w:val="en-US" w:eastAsia="ja-JP" w:bidi="ar-SA"/>
-              </w:rPr>
-              <w:t>privacy.retention_years</w:t>
-            </w:r>
-            <w:r>
-              <w:rPr>
-                <w:rFonts w:eastAsia="Segoe UI" w:cs="Segoe UI" w:ascii="Segoe UI" w:hAnsi="Segoe UI"/>
-                <w:color w:val="101820"/>
-                <w:kern w:val="0"/>
-                <w:sz w:val="18"/>
-                <w:szCs w:val="24"/>
-                <w:lang w:val="en-US" w:eastAsia="ja-JP" w:bidi="ar-SA"/>
-              </w:rPr>
-              <w:t xml:space="preserve"> has passed, keeping amounts, numbers and dates for the books. Proposed retention per record type in architecture document 10</w:t>
-            </w:r>
-          </w:p>
-        </w:tc>
-        <w:tc>
-          <w:tcPr>
-            <w:tcW w:w="3005" w:type="dxa"/>
-            <w:tcBorders>
-              <w:top w:val="single" w:sz="4" w:space="0" w:color="BFC7D1"/>
-              <w:left w:val="single" w:sz="4" w:space="0" w:color="BFC7D1"/>
-              <w:bottom w:val="single" w:sz="4" w:space="0" w:color="BFC7D1"/>
-              <w:right w:val="single" w:sz="4" w:space="0" w:color="BFC7D1"/>
-            </w:tcBorders>
-          </w:tcPr>
-          <w:p>
-            <w:pPr>
-              <w:pStyle w:val="Normal"/>
-              <w:widowControl/>
-              <w:spacing w:lineRule="auto" w:line="240" w:before="0" w:after="20"/>
-              <w:jc w:val="left"/>
-              <w:rPr>
-                <w:rFonts w:ascii="Aptos" w:hAnsi="Aptos" w:eastAsia="ＭＳ 明朝" w:cs="Arial"/>
-                <w:kern w:val="0"/>
-                <w:sz w:val="24"/>
-                <w:szCs w:val="24"/>
-                <w:lang w:val="en-US" w:eastAsia="ja-JP" w:bidi="ar-SA"/>
-              </w:rPr>
-            </w:pPr>
-            <w:r>
-              <w:rPr>
-                <w:rFonts w:eastAsia="Segoe UI" w:cs="Segoe UI" w:ascii="Segoe UI" w:hAnsi="Segoe UI"/>
-                <w:color w:val="101820"/>
-                <w:kern w:val="0"/>
-                <w:sz w:val="18"/>
-                <w:szCs w:val="24"/>
-                <w:lang w:val="en-US" w:eastAsia="ja-JP" w:bidi="ar-SA"/>
-              </w:rPr>
-              <w:t>Set the retention schedule with the compliance officer (insurance, tax and AMLA retention rules apply too); approve any disposal</w:t>
+              <w:t>campaigns.opt_out_text</w:t>
+            </w:r>
+            <w:r>
+              <w:rPr>
+                <w:rFonts w:eastAsia="Segoe UI" w:cs="Segoe UI" w:ascii="Segoe UI" w:hAnsi="Segoe UI"/>
+                <w:color w:val="101820"/>
+                <w:kern w:val="0"/>
+                <w:sz w:val="18"/>
+                <w:szCs w:val="24"/>
+                <w:lang w:val="en-US" w:eastAsia="ja-JP" w:bidi="ar-SA"/>
+              </w:rPr>
+              <w:t>); approve campaign content; honour objections received by other channels by recording them in the consent register</w:t>
             </w:r>
           </w:p>
         </w:tc>
@@ -11194,6 +13102,164 @@
                 <w:szCs w:val="24"/>
                 <w:lang w:val="en-US" w:eastAsia="ja-JP" w:bidi="ar-SA"/>
               </w:rPr>
+              <w:t>Retention and disposal. Personal data is kept only as long as needed for the purpose or as the law requires, then disposed of securely.</w:t>
+            </w:r>
+          </w:p>
+        </w:tc>
+        <w:tc>
+          <w:tcPr>
+            <w:tcW w:w="3005" w:type="dxa"/>
+            <w:tcBorders>
+              <w:top w:val="single" w:sz="4" w:space="0" w:color="BFC7D1"/>
+              <w:left w:val="single" w:sz="4" w:space="0" w:color="BFC7D1"/>
+              <w:bottom w:val="single" w:sz="4" w:space="0" w:color="BFC7D1"/>
+              <w:right w:val="single" w:sz="4" w:space="0" w:color="BFC7D1"/>
+            </w:tcBorders>
+          </w:tcPr>
+          <w:p>
+            <w:pPr>
+              <w:pStyle w:val="Normal"/>
+              <w:widowControl/>
+              <w:spacing w:lineRule="auto" w:line="240" w:before="0" w:after="20"/>
+              <w:jc w:val="left"/>
+              <w:rPr>
+                <w:rFonts w:ascii="Aptos" w:hAnsi="Aptos" w:eastAsia="ＭＳ 明朝" w:cs="Arial"/>
+                <w:kern w:val="0"/>
+                <w:sz w:val="24"/>
+                <w:szCs w:val="24"/>
+                <w:lang w:val="en-US" w:eastAsia="ja-JP" w:bidi="ar-SA"/>
+              </w:rPr>
+            </w:pPr>
+            <w:r>
+              <w:rPr>
+                <w:rFonts w:eastAsia="Segoe UI" w:cs="Segoe UI" w:ascii="Segoe UI" w:hAnsi="Segoe UI"/>
+                <w:color w:val="101820"/>
+                <w:kern w:val="0"/>
+                <w:sz w:val="18"/>
+                <w:szCs w:val="24"/>
+                <w:lang w:val="en-US" w:eastAsia="ja-JP" w:bidi="ar-SA"/>
+              </w:rPr>
+              <w:t>Operational logs are deleted after their retention days (</w:t>
+            </w:r>
+            <w:r>
+              <w:rPr>
+                <w:rFonts w:eastAsia="Consolas" w:cs="Consolas" w:ascii="Consolas" w:hAnsi="Consolas"/>
+                <w:color w:val="101820"/>
+                <w:kern w:val="0"/>
+                <w:sz w:val="16"/>
+                <w:szCs w:val="24"/>
+                <w:lang w:val="en-US" w:eastAsia="ja-JP" w:bidi="ar-SA"/>
+              </w:rPr>
+              <w:t>housekeeping.*</w:t>
+            </w:r>
+            <w:r>
+              <w:rPr>
+                <w:rFonts w:eastAsia="Segoe UI" w:cs="Segoe UI" w:ascii="Segoe UI" w:hAnsi="Segoe UI"/>
+                <w:color w:val="101820"/>
+                <w:kern w:val="0"/>
+                <w:sz w:val="18"/>
+                <w:szCs w:val="24"/>
+                <w:lang w:val="en-US" w:eastAsia="ja-JP" w:bidi="ar-SA"/>
+              </w:rPr>
+              <w:t xml:space="preserve">: sign-in history 365 days, sent e-mails 180 days, read notifications 180 days); business records and the audit trail are kept; the personal data of a client or prospect can be anonymised once </w:t>
+            </w:r>
+            <w:r>
+              <w:rPr>
+                <w:rFonts w:eastAsia="Consolas" w:cs="Consolas" w:ascii="Consolas" w:hAnsi="Consolas"/>
+                <w:color w:val="101820"/>
+                <w:kern w:val="0"/>
+                <w:sz w:val="16"/>
+                <w:szCs w:val="24"/>
+                <w:lang w:val="en-US" w:eastAsia="ja-JP" w:bidi="ar-SA"/>
+              </w:rPr>
+              <w:t>privacy.retention_years</w:t>
+            </w:r>
+            <w:r>
+              <w:rPr>
+                <w:rFonts w:eastAsia="Segoe UI" w:cs="Segoe UI" w:ascii="Segoe UI" w:hAnsi="Segoe UI"/>
+                <w:color w:val="101820"/>
+                <w:kern w:val="0"/>
+                <w:sz w:val="18"/>
+                <w:szCs w:val="24"/>
+                <w:lang w:val="en-US" w:eastAsia="ja-JP" w:bidi="ar-SA"/>
+              </w:rPr>
+              <w:t xml:space="preserve"> has passed, keeping amounts, numbers and dates for the books. Proposed retention per record type in architecture document 10</w:t>
+            </w:r>
+          </w:p>
+        </w:tc>
+        <w:tc>
+          <w:tcPr>
+            <w:tcW w:w="3005" w:type="dxa"/>
+            <w:tcBorders>
+              <w:top w:val="single" w:sz="4" w:space="0" w:color="BFC7D1"/>
+              <w:left w:val="single" w:sz="4" w:space="0" w:color="BFC7D1"/>
+              <w:bottom w:val="single" w:sz="4" w:space="0" w:color="BFC7D1"/>
+              <w:right w:val="single" w:sz="4" w:space="0" w:color="BFC7D1"/>
+            </w:tcBorders>
+          </w:tcPr>
+          <w:p>
+            <w:pPr>
+              <w:pStyle w:val="Normal"/>
+              <w:widowControl/>
+              <w:spacing w:lineRule="auto" w:line="240" w:before="0" w:after="20"/>
+              <w:jc w:val="left"/>
+              <w:rPr>
+                <w:rFonts w:ascii="Aptos" w:hAnsi="Aptos" w:eastAsia="ＭＳ 明朝" w:cs="Arial"/>
+                <w:kern w:val="0"/>
+                <w:sz w:val="24"/>
+                <w:szCs w:val="24"/>
+                <w:lang w:val="en-US" w:eastAsia="ja-JP" w:bidi="ar-SA"/>
+              </w:rPr>
+            </w:pPr>
+            <w:r>
+              <w:rPr>
+                <w:rFonts w:eastAsia="Segoe UI" w:cs="Segoe UI" w:ascii="Segoe UI" w:hAnsi="Segoe UI"/>
+                <w:color w:val="101820"/>
+                <w:kern w:val="0"/>
+                <w:sz w:val="18"/>
+                <w:szCs w:val="24"/>
+                <w:lang w:val="en-US" w:eastAsia="ja-JP" w:bidi="ar-SA"/>
+              </w:rPr>
+              <w:t>Set the retention schedule with the compliance officer (insurance, tax and AMLA retention rules apply too); approve any disposal</w:t>
+            </w:r>
+          </w:p>
+        </w:tc>
+      </w:tr>
+      <w:tr>
+        <w:trPr/>
+        <w:tc>
+          <w:tcPr>
+            <w:tcW w:w="3005" w:type="dxa"/>
+            <w:tcBorders>
+              <w:top w:val="single" w:sz="4" w:space="0" w:color="BFC7D1"/>
+              <w:left w:val="single" w:sz="4" w:space="0" w:color="BFC7D1"/>
+              <w:bottom w:val="single" w:sz="4" w:space="0" w:color="BFC7D1"/>
+              <w:right w:val="single" w:sz="4" w:space="0" w:color="BFC7D1"/>
+            </w:tcBorders>
+          </w:tcPr>
+          <w:p>
+            <w:pPr>
+              <w:pStyle w:val="Normal"/>
+              <w:widowControl/>
+              <w:spacing w:lineRule="auto" w:line="240" w:before="0" w:after="20"/>
+              <w:jc w:val="left"/>
+              <w:rPr>
+                <w:rFonts w:ascii="Aptos" w:hAnsi="Aptos" w:eastAsia="ＭＳ 明朝" w:cs="Arial"/>
+                <w:kern w:val="0"/>
+                <w:sz w:val="24"/>
+                <w:szCs w:val="24"/>
+                <w:lang w:val="en-US" w:eastAsia="ja-JP" w:bidi="ar-SA"/>
+              </w:rPr>
+            </w:pPr>
+            <w:r>
+              <w:rPr>
+                <w:rFonts w:eastAsia="Segoe UI" w:cs="Segoe UI" w:ascii="Segoe UI" w:hAnsi="Segoe UI"/>
+                <w:color w:val="101820"/>
+                <w:kern w:val="0"/>
+                <w:sz w:val="18"/>
+                <w:szCs w:val="24"/>
+                <w:lang w:val="en-US" w:eastAsia="ja-JP" w:bidi="ar-SA"/>
+              </w:rPr>
               <w:t>Personal data breach management. Breaches that meet the NPC criteria are notified to the NPC and the affected data subjects within 72 hours of knowledge.</w:t>
             </w:r>
           </w:p>
@@ -11231,7 +13297,73 @@
                 <w:szCs w:val="24"/>
                 <w:lang w:val="en-US" w:eastAsia="ja-JP" w:bidi="ar-SA"/>
               </w:rPr>
-              <w:t>Detection support: login history, audit trail, monitoring alarms on failed sign-ins and locked accounts; iorta TechNXT informs the broker of a suspected breach without delay (Production Support Approach and Standards)</w:t>
+              <w:t>Compliance &gt; Data Privacy (NPC) &gt; Breach Register: incident log (PDB series), assessment against the NPC criteria, the 72-hour deadline (</w:t>
+            </w:r>
+            <w:r>
+              <w:rPr>
+                <w:rFonts w:eastAsia="Consolas" w:cs="Consolas" w:ascii="Consolas" w:hAnsi="Consolas"/>
+                <w:color w:val="101820"/>
+                <w:kern w:val="0"/>
+                <w:sz w:val="16"/>
+                <w:szCs w:val="24"/>
+                <w:lang w:val="en-US" w:eastAsia="ja-JP" w:bidi="ar-SA"/>
+              </w:rPr>
+              <w:t>privacy.breach_notify_hours</w:t>
+            </w:r>
+            <w:r>
+              <w:rPr>
+                <w:rFonts w:eastAsia="Segoe UI" w:cs="Segoe UI" w:ascii="Segoe UI" w:hAnsi="Segoe UI"/>
+                <w:color w:val="101820"/>
+                <w:kern w:val="0"/>
+                <w:sz w:val="18"/>
+                <w:szCs w:val="24"/>
+                <w:lang w:val="en-US" w:eastAsia="ja-JP" w:bidi="ar-SA"/>
+              </w:rPr>
+              <w:t>) with hours left and hourly reminders (</w:t>
+            </w:r>
+            <w:r>
+              <w:rPr>
+                <w:rFonts w:eastAsia="Consolas" w:cs="Consolas" w:ascii="Consolas" w:hAnsi="Consolas"/>
+                <w:color w:val="101820"/>
+                <w:kern w:val="0"/>
+                <w:sz w:val="16"/>
+                <w:szCs w:val="24"/>
+                <w:lang w:val="en-US" w:eastAsia="ja-JP" w:bidi="ar-SA"/>
+              </w:rPr>
+              <w:t>privacy-breach-deadlines</w:t>
+            </w:r>
+            <w:r>
+              <w:rPr>
+                <w:rFonts w:eastAsia="Segoe UI" w:cs="Segoe UI" w:ascii="Segoe UI" w:hAnsi="Segoe UI"/>
+                <w:color w:val="101820"/>
+                <w:kern w:val="0"/>
+                <w:sz w:val="18"/>
+                <w:szCs w:val="24"/>
+                <w:lang w:val="en-US" w:eastAsia="ja-JP" w:bidi="ar-SA"/>
+              </w:rPr>
+              <w:t xml:space="preserve">, </w:t>
+            </w:r>
+            <w:r>
+              <w:rPr>
+                <w:rFonts w:eastAsia="Consolas" w:cs="Consolas" w:ascii="Consolas" w:hAnsi="Consolas"/>
+                <w:color w:val="101820"/>
+                <w:kern w:val="0"/>
+                <w:sz w:val="16"/>
+                <w:szCs w:val="24"/>
+                <w:lang w:val="en-US" w:eastAsia="ja-JP" w:bidi="ar-SA"/>
+              </w:rPr>
+              <w:t>privacy.breach_reminder_hours</w:t>
+            </w:r>
+            <w:r>
+              <w:rPr>
+                <w:rFonts w:eastAsia="Segoe UI" w:cs="Segoe UI" w:ascii="Segoe UI" w:hAnsi="Segoe UI"/>
+                <w:color w:val="101820"/>
+                <w:kern w:val="0"/>
+                <w:sz w:val="18"/>
+                <w:szCs w:val="24"/>
+                <w:lang w:val="en-US" w:eastAsia="ja-JP" w:bidi="ar-SA"/>
+              </w:rPr>
+              <w:t>), the NPC notification (reference, reason for a late notification), the data subjects notified, documents, closure; annual security incident report (Excel). Detection support: login history, audit trail, monitoring alarms; iorta TechNXT informs the broker of a suspected breach without delay</w:t>
             </w:r>
           </w:p>
         </w:tc>
@@ -11268,7 +13400,143 @@
                 <w:szCs w:val="24"/>
                 <w:lang w:val="en-US" w:eastAsia="ja-JP" w:bidi="ar-SA"/>
               </w:rPr>
-              <w:t>Assess the breach, notify the NPC and data subjects, keep the breach register and file the reports the NPC requires; the DPO leads</w:t>
+              <w:t>Assess the breach, notify the NPC and data subjects through the NPC's channels, submit the annual security incident report; the DPO leads</w:t>
+            </w:r>
+          </w:p>
+        </w:tc>
+      </w:tr>
+      <w:tr>
+        <w:trPr/>
+        <w:tc>
+          <w:tcPr>
+            <w:tcW w:w="3005" w:type="dxa"/>
+            <w:tcBorders>
+              <w:top w:val="single" w:sz="4" w:space="0" w:color="BFC7D1"/>
+              <w:left w:val="single" w:sz="4" w:space="0" w:color="BFC7D1"/>
+              <w:bottom w:val="single" w:sz="4" w:space="0" w:color="BFC7D1"/>
+              <w:right w:val="single" w:sz="4" w:space="0" w:color="BFC7D1"/>
+            </w:tcBorders>
+          </w:tcPr>
+          <w:p>
+            <w:pPr>
+              <w:pStyle w:val="Normal"/>
+              <w:widowControl/>
+              <w:spacing w:lineRule="auto" w:line="240" w:before="0" w:after="20"/>
+              <w:jc w:val="left"/>
+              <w:rPr>
+                <w:rFonts w:ascii="Aptos" w:hAnsi="Aptos" w:eastAsia="ＭＳ 明朝" w:cs="Arial"/>
+                <w:kern w:val="0"/>
+                <w:sz w:val="24"/>
+                <w:szCs w:val="24"/>
+                <w:lang w:val="en-US" w:eastAsia="ja-JP" w:bidi="ar-SA"/>
+              </w:rPr>
+            </w:pPr>
+            <w:r>
+              <w:rPr>
+                <w:rFonts w:eastAsia="Segoe UI" w:cs="Segoe UI" w:ascii="Segoe UI" w:hAnsi="Segoe UI"/>
+                <w:color w:val="101820"/>
+                <w:kern w:val="0"/>
+                <w:sz w:val="18"/>
+                <w:szCs w:val="24"/>
+                <w:lang w:val="en-US" w:eastAsia="ja-JP" w:bidi="ar-SA"/>
+              </w:rPr>
+              <w:t>Personal data in test, training and support environments. Personal data is processed only for its declared purpose and protected against unauthorised access.</w:t>
+            </w:r>
+          </w:p>
+        </w:tc>
+        <w:tc>
+          <w:tcPr>
+            <w:tcW w:w="3005" w:type="dxa"/>
+            <w:tcBorders>
+              <w:top w:val="single" w:sz="4" w:space="0" w:color="BFC7D1"/>
+              <w:left w:val="single" w:sz="4" w:space="0" w:color="BFC7D1"/>
+              <w:bottom w:val="single" w:sz="4" w:space="0" w:color="BFC7D1"/>
+              <w:right w:val="single" w:sz="4" w:space="0" w:color="BFC7D1"/>
+            </w:tcBorders>
+          </w:tcPr>
+          <w:p>
+            <w:pPr>
+              <w:pStyle w:val="Normal"/>
+              <w:widowControl/>
+              <w:spacing w:lineRule="auto" w:line="240" w:before="0" w:after="20"/>
+              <w:jc w:val="left"/>
+              <w:rPr>
+                <w:rFonts w:ascii="Aptos" w:hAnsi="Aptos" w:eastAsia="ＭＳ 明朝" w:cs="Arial"/>
+                <w:kern w:val="0"/>
+                <w:sz w:val="24"/>
+                <w:szCs w:val="24"/>
+                <w:lang w:val="en-US" w:eastAsia="ja-JP" w:bidi="ar-SA"/>
+              </w:rPr>
+            </w:pPr>
+            <w:r>
+              <w:rPr>
+                <w:rFonts w:eastAsia="Segoe UI" w:cs="Segoe UI" w:ascii="Segoe UI" w:hAnsi="Segoe UI"/>
+                <w:color w:val="101820"/>
+                <w:kern w:val="0"/>
+                <w:sz w:val="18"/>
+                <w:szCs w:val="24"/>
+                <w:lang w:val="en-US" w:eastAsia="ja-JP" w:bidi="ar-SA"/>
+              </w:rPr>
+              <w:t xml:space="preserve">A copy of production used outside production is masked first with </w:t>
+            </w:r>
+            <w:r>
+              <w:rPr>
+                <w:rFonts w:eastAsia="Consolas" w:cs="Consolas" w:ascii="Consolas" w:hAnsi="Consolas"/>
+                <w:color w:val="101820"/>
+                <w:kern w:val="0"/>
+                <w:sz w:val="16"/>
+                <w:szCs w:val="24"/>
+                <w:lang w:val="en-US" w:eastAsia="ja-JP" w:bidi="ar-SA"/>
+              </w:rPr>
+              <w:t>npm run mask:data</w:t>
+            </w:r>
+            <w:r>
+              <w:rPr>
+                <w:rFonts w:eastAsia="Segoe UI" w:cs="Segoe UI" w:ascii="Segoe UI" w:hAnsi="Segoe UI"/>
+                <w:color w:val="101820"/>
+                <w:kern w:val="0"/>
+                <w:sz w:val="18"/>
+                <w:szCs w:val="24"/>
+                <w:lang w:val="en-US" w:eastAsia="ja-JP" w:bidi="ar-SA"/>
+              </w:rPr>
+              <w:t xml:space="preserve"> (consistent pseudonyms of names, e-mail addresses, mobile numbers, TINs, addresses, ID, vehicle and bank numbers; remarks cleared; files replaced; passwords reset; e-mail sending off), refused on the registered production database, verified, and recorded in the audit trail (docs/onboarding/DATA_MASKING.md)</w:t>
+            </w:r>
+          </w:p>
+        </w:tc>
+        <w:tc>
+          <w:tcPr>
+            <w:tcW w:w="3005" w:type="dxa"/>
+            <w:tcBorders>
+              <w:top w:val="single" w:sz="4" w:space="0" w:color="BFC7D1"/>
+              <w:left w:val="single" w:sz="4" w:space="0" w:color="BFC7D1"/>
+              <w:bottom w:val="single" w:sz="4" w:space="0" w:color="BFC7D1"/>
+              <w:right w:val="single" w:sz="4" w:space="0" w:color="BFC7D1"/>
+            </w:tcBorders>
+          </w:tcPr>
+          <w:p>
+            <w:pPr>
+              <w:pStyle w:val="Normal"/>
+              <w:widowControl/>
+              <w:spacing w:lineRule="auto" w:line="240" w:before="0" w:after="20"/>
+              <w:jc w:val="left"/>
+              <w:rPr>
+                <w:rFonts w:ascii="Aptos" w:hAnsi="Aptos" w:eastAsia="ＭＳ 明朝" w:cs="Arial"/>
+                <w:kern w:val="0"/>
+                <w:sz w:val="24"/>
+                <w:szCs w:val="24"/>
+                <w:lang w:val="en-US" w:eastAsia="ja-JP" w:bidi="ar-SA"/>
+              </w:rPr>
+            </w:pPr>
+            <w:r>
+              <w:rPr>
+                <w:rFonts w:eastAsia="Segoe UI" w:cs="Segoe UI" w:ascii="Segoe UI" w:hAnsi="Segoe UI"/>
+                <w:color w:val="101820"/>
+                <w:kern w:val="0"/>
+                <w:sz w:val="18"/>
+                <w:szCs w:val="24"/>
+                <w:lang w:val="en-US" w:eastAsia="ja-JP" w:bidi="ar-SA"/>
+              </w:rPr>
+              <w:t>Approve each refresh (DPO); keep the evidence; destroy copies after use; never copy a masked copy back to production</w:t>
             </w:r>
           </w:p>
         </w:tc>
@@ -11510,8 +13778,8 @@
       <w:r>
         <w:br w:type="page"/>
       </w:r>
-      <w:bookmarkStart w:id="20" w:name="__RefHeading___Toc144177_3199679052"/>
-      <w:bookmarkEnd w:id="20"/>
+      <w:bookmarkStart w:id="21" w:name="__RefHeading___Toc12276_3960898926"/>
+      <w:bookmarkEnd w:id="21"/>
       <w:r>
         <w:rPr>
           <w:rFonts w:eastAsia="Segoe UI" w:cs="Segoe UI" w:ascii="Segoe UI" w:hAnsi="Segoe UI"/>
@@ -11714,7 +13982,7 @@
                 <w:szCs w:val="24"/>
                 <w:lang w:val="en-US" w:eastAsia="ja-JP" w:bidi="ar-SA"/>
               </w:rPr>
-              <w:t>Customer due diligence. Identify and verify the customer and, for juridical persons, the entity and its authorised persons, before or during the business relationship.</w:t>
+              <w:t>Customer due diligence. Identify and verify the customer and, for juridical persons, the entity, its authorised signatories and its beneficial owners, before or during the business relationship.</w:t>
             </w:r>
           </w:p>
         </w:tc>
@@ -11751,7 +14019,30 @@
                 <w:szCs w:val="24"/>
                 <w:lang w:val="en-US" w:eastAsia="ja-JP" w:bidi="ar-SA"/>
               </w:rPr>
-              <w:t>Client and prospect records: name, birth date, gender, address, contact details, TIN (required for corporate prospects), company name; government ID type, number and image required for motor issue and configurable for other lines (</w:t>
+              <w:t xml:space="preserve">Operations &gt; Clients &gt; </w:t>
+            </w:r>
+            <w:r>
+              <w:rPr>
+                <w:rFonts w:eastAsia="Segoe UI" w:cs="Segoe UI" w:ascii="Segoe UI" w:hAnsi="Segoe UI"/>
+                <w:b/>
+                <w:color w:val="101820"/>
+                <w:kern w:val="0"/>
+                <w:sz w:val="18"/>
+                <w:szCs w:val="24"/>
+                <w:lang w:val="en-US" w:eastAsia="ja-JP" w:bidi="ar-SA"/>
+              </w:rPr>
+              <w:t>Onboard client</w:t>
+            </w:r>
+            <w:r>
+              <w:rPr>
+                <w:rFonts w:eastAsia="Segoe UI" w:cs="Segoe UI" w:ascii="Segoe UI" w:hAnsi="Segoe UI"/>
+                <w:color w:val="101820"/>
+                <w:kern w:val="0"/>
+                <w:sz w:val="18"/>
+                <w:szCs w:val="24"/>
+                <w:lang w:val="en-US" w:eastAsia="ja-JP" w:bidi="ar-SA"/>
+              </w:rPr>
+              <w:t xml:space="preserve"> creates the client before its first policy: individual (name, birth date and place, nationality, civil status, occupation, source of funds, government ID with expiry, Philippine mobile number and TIN checked, PSGC address) or juridical (registered and trade name, SEC / DTI / CDA registration, TIN, nature of business, authorised signatories with the board resolution or secretary's certificate, beneficial owners at or above </w:t>
             </w:r>
             <w:r>
               <w:rPr>
@@ -11762,40 +14053,18 @@
                 <w:szCs w:val="24"/>
                 <w:lang w:val="en-US" w:eastAsia="ja-JP" w:bidi="ar-SA"/>
               </w:rPr>
-              <w:t>policy.kyc_required_fields</w:t>
-            </w:r>
-            <w:r>
-              <w:rPr>
-                <w:rFonts w:eastAsia="Segoe UI" w:cs="Segoe UI" w:ascii="Segoe UI" w:hAnsi="Segoe UI"/>
-                <w:color w:val="101820"/>
-                <w:kern w:val="0"/>
-                <w:sz w:val="18"/>
-                <w:szCs w:val="24"/>
-                <w:lang w:val="en-US" w:eastAsia="ja-JP" w:bidi="ar-SA"/>
-              </w:rPr>
-              <w:t xml:space="preserve">); accepted IDs in </w:t>
-            </w:r>
-            <w:r>
-              <w:rPr>
-                <w:rFonts w:eastAsia="Consolas" w:cs="Consolas" w:ascii="Consolas" w:hAnsi="Consolas"/>
-                <w:color w:val="101820"/>
-                <w:kern w:val="0"/>
-                <w:sz w:val="16"/>
-                <w:szCs w:val="24"/>
-                <w:lang w:val="en-US" w:eastAsia="ja-JP" w:bidi="ar-SA"/>
-              </w:rPr>
-              <w:t>policy.kyc_id_types</w:t>
-            </w:r>
-            <w:r>
-              <w:rPr>
-                <w:rFonts w:eastAsia="Segoe UI" w:cs="Segoe UI" w:ascii="Segoe UI" w:hAnsi="Segoe UI"/>
-                <w:color w:val="101820"/>
-                <w:kern w:val="0"/>
-                <w:sz w:val="18"/>
-                <w:szCs w:val="24"/>
-                <w:lang w:val="en-US" w:eastAsia="ja-JP" w:bidi="ar-SA"/>
-              </w:rPr>
-              <w:t>; documents attached to the client and policy</w:t>
+              <w:t>aml.beneficial_owner_threshold</w:t>
+            </w:r>
+            <w:r>
+              <w:rPr>
+                <w:rFonts w:eastAsia="Segoe UI" w:cs="Segoe UI" w:ascii="Segoe UI" w:hAnsi="Segoe UI"/>
+                <w:color w:val="101820"/>
+                <w:kern w:val="0"/>
+                <w:sz w:val="18"/>
+                <w:szCs w:val="24"/>
+                <w:lang w:val="en-US" w:eastAsia="ja-JP" w:bidi="ar-SA"/>
+              </w:rPr>
+              <w:t>, 25%, or in control); KYC documents uploaded per client, signatory, owner or EDD review; the client created at policy issue is completed the same way; KYC status per client (Incomplete, Complete, EDD required, Refresh due, Blocked)</w:t>
             </w:r>
           </w:p>
         </w:tc>
@@ -11832,7 +14101,7 @@
                 <w:szCs w:val="24"/>
                 <w:lang w:val="en-US" w:eastAsia="ja-JP" w:bidi="ar-SA"/>
               </w:rPr>
-              <w:t>Adopt a money laundering and terrorist financing prevention programme; apply risk-based CDD, including enhanced due diligence where required and beneficial ownership for juridical persons; extend the KYC fields required to other lines in the setting if the programme requires it</w:t>
+              <w:t>Adopt the MTPP; decide which documents are accepted; verify the documents seen</w:t>
             </w:r>
           </w:p>
         </w:tc>
@@ -11872,7 +14141,7 @@
                 <w:szCs w:val="24"/>
                 <w:lang w:val="en-US" w:eastAsia="ja-JP" w:bidi="ar-SA"/>
               </w:rPr>
-              <w:t>Record keeping. Keep customer identification and transaction records for at least five years, or longer where a case is pending.</w:t>
+              <w:t>Risk-based CDD, enhanced due diligence and ongoing monitoring.</w:t>
             </w:r>
           </w:p>
         </w:tc>
@@ -11909,7 +14178,51 @@
                 <w:szCs w:val="24"/>
                 <w:lang w:val="en-US" w:eastAsia="ja-JP" w:bidi="ar-SA"/>
               </w:rPr>
-              <w:t>Business records, documents and the audit trail are kept; nothing is deleted by housekeeping except operational logs</w:t>
+              <w:t>Customer risk rating Low / Normal / High from configurable factors (client type, nationality, PEP, line of business, payment mode, premium size, geography) at onboarding, at every policy issue and at the KYC refresh, with history and a compliance officer override; an EDD review is opened for every High-risk client, prepared and submitted, then approved by a compliance officer other than the preparer (approve:aml), and no policy is issued to a High-risk client without it (</w:t>
+            </w:r>
+            <w:r>
+              <w:rPr>
+                <w:rFonts w:eastAsia="Consolas" w:cs="Consolas" w:ascii="Consolas" w:hAnsi="Consolas"/>
+                <w:color w:val="101820"/>
+                <w:kern w:val="0"/>
+                <w:sz w:val="16"/>
+                <w:szCs w:val="24"/>
+                <w:lang w:val="en-US" w:eastAsia="ja-JP" w:bidi="ar-SA"/>
+              </w:rPr>
+              <w:t>aml.block_issue_pending_edd</w:t>
+            </w:r>
+            <w:r>
+              <w:rPr>
+                <w:rFonts w:eastAsia="Segoe UI" w:cs="Segoe UI" w:ascii="Segoe UI" w:hAnsi="Segoe UI"/>
+                <w:color w:val="101820"/>
+                <w:kern w:val="0"/>
+                <w:sz w:val="18"/>
+                <w:szCs w:val="24"/>
+                <w:lang w:val="en-US" w:eastAsia="ja-JP" w:bidi="ar-SA"/>
+              </w:rPr>
+              <w:t>); periodic KYC refresh per rating (</w:t>
+            </w:r>
+            <w:r>
+              <w:rPr>
+                <w:rFonts w:eastAsia="Consolas" w:cs="Consolas" w:ascii="Consolas" w:hAnsi="Consolas"/>
+                <w:color w:val="101820"/>
+                <w:kern w:val="0"/>
+                <w:sz w:val="16"/>
+                <w:szCs w:val="24"/>
+                <w:lang w:val="en-US" w:eastAsia="ja-JP" w:bidi="ar-SA"/>
+              </w:rPr>
+              <w:t>aml.kyc_refresh_months</w:t>
+            </w:r>
+            <w:r>
+              <w:rPr>
+                <w:rFonts w:eastAsia="Segoe UI" w:cs="Segoe UI" w:ascii="Segoe UI" w:hAnsi="Segoe UI"/>
+                <w:color w:val="101820"/>
+                <w:kern w:val="0"/>
+                <w:sz w:val="18"/>
+                <w:szCs w:val="24"/>
+                <w:lang w:val="en-US" w:eastAsia="ja-JP" w:bidi="ar-SA"/>
+              </w:rPr>
+              <w:t>: Low 36, Normal 24, High 12) with the due list (Compliance &gt; KYC Refresh) and a weekly job</w:t>
             </w:r>
           </w:p>
         </w:tc>
@@ -11946,7 +14259,7 @@
                 <w:szCs w:val="24"/>
                 <w:lang w:val="en-US" w:eastAsia="ja-JP" w:bidi="ar-SA"/>
               </w:rPr>
-              <w:t>Set and enforce the retention; keep records of the old system for the remaining period</w:t>
+              <w:t>Set the risk factors, scores and refresh periods of the programme; approve the EDD reviews; decide the senior management approval of PEP relationships</w:t>
             </w:r>
           </w:p>
         </w:tc>
@@ -11986,6 +14299,300 @@
                 <w:szCs w:val="24"/>
                 <w:lang w:val="en-US" w:eastAsia="ja-JP" w:bidi="ar-SA"/>
               </w:rPr>
+              <w:t>Targeted financial sanctions, PEP and negative list screening.</w:t>
+            </w:r>
+          </w:p>
+        </w:tc>
+        <w:tc>
+          <w:tcPr>
+            <w:tcW w:w="3005" w:type="dxa"/>
+            <w:tcBorders>
+              <w:top w:val="single" w:sz="4" w:space="0" w:color="BFC7D1"/>
+              <w:left w:val="single" w:sz="4" w:space="0" w:color="BFC7D1"/>
+              <w:bottom w:val="single" w:sz="4" w:space="0" w:color="BFC7D1"/>
+              <w:right w:val="single" w:sz="4" w:space="0" w:color="BFC7D1"/>
+            </w:tcBorders>
+          </w:tcPr>
+          <w:p>
+            <w:pPr>
+              <w:pStyle w:val="Normal"/>
+              <w:widowControl/>
+              <w:spacing w:lineRule="auto" w:line="240" w:before="0" w:after="20"/>
+              <w:jc w:val="left"/>
+              <w:rPr>
+                <w:rFonts w:ascii="Aptos" w:hAnsi="Aptos" w:eastAsia="ＭＳ 明朝" w:cs="Arial"/>
+                <w:kern w:val="0"/>
+                <w:sz w:val="24"/>
+                <w:szCs w:val="24"/>
+                <w:lang w:val="en-US" w:eastAsia="ja-JP" w:bidi="ar-SA"/>
+              </w:rPr>
+            </w:pPr>
+            <w:r>
+              <w:rPr>
+                <w:rFonts w:eastAsia="Segoe UI" w:cs="Segoe UI" w:ascii="Segoe UI" w:hAnsi="Segoe UI"/>
+                <w:color w:val="101820"/>
+                <w:kern w:val="0"/>
+                <w:sz w:val="18"/>
+                <w:szCs w:val="24"/>
+                <w:lang w:val="en-US" w:eastAsia="ja-JP" w:bidi="ar-SA"/>
+              </w:rPr>
+              <w:t>Compliance &gt; Screening Lists: UN Security Council consolidated list (XML as published), AMLC / ATC designations, PEP list and internal negative list (CSV / XLSX), each upload a version with checksum and entries, followed by a rescreen of every client, owner and signatory; fuzzy name matching with a score threshold (</w:t>
+            </w:r>
+            <w:r>
+              <w:rPr>
+                <w:rFonts w:eastAsia="Consolas" w:cs="Consolas" w:ascii="Consolas" w:hAnsi="Consolas"/>
+                <w:color w:val="101820"/>
+                <w:kern w:val="0"/>
+                <w:sz w:val="16"/>
+                <w:szCs w:val="24"/>
+                <w:lang w:val="en-US" w:eastAsia="ja-JP" w:bidi="ar-SA"/>
+              </w:rPr>
+              <w:t>aml.match_threshold</w:t>
+            </w:r>
+            <w:r>
+              <w:rPr>
+                <w:rFonts w:eastAsia="Segoe UI" w:cs="Segoe UI" w:ascii="Segoe UI" w:hAnsi="Segoe UI"/>
+                <w:color w:val="101820"/>
+                <w:kern w:val="0"/>
+                <w:sz w:val="18"/>
+                <w:szCs w:val="24"/>
+                <w:lang w:val="en-US" w:eastAsia="ja-JP" w:bidi="ar-SA"/>
+              </w:rPr>
+              <w:t>); screening at onboarding, at policy issue and at refund and claim payouts; Compliance &gt; Screening Hits to clear, escalate or confirm with a reason (audited); policy issue and payouts refused while a hit is undecided or confirmed (</w:t>
+            </w:r>
+            <w:r>
+              <w:rPr>
+                <w:rFonts w:eastAsia="Consolas" w:cs="Consolas" w:ascii="Consolas" w:hAnsi="Consolas"/>
+                <w:color w:val="101820"/>
+                <w:kern w:val="0"/>
+                <w:sz w:val="16"/>
+                <w:szCs w:val="24"/>
+                <w:lang w:val="en-US" w:eastAsia="ja-JP" w:bidi="ar-SA"/>
+              </w:rPr>
+              <w:t>aml.screening_block_events</w:t>
+            </w:r>
+            <w:r>
+              <w:rPr>
+                <w:rFonts w:eastAsia="Segoe UI" w:cs="Segoe UI" w:ascii="Segoe UI" w:hAnsi="Segoe UI"/>
+                <w:color w:val="101820"/>
+                <w:kern w:val="0"/>
+                <w:sz w:val="18"/>
+                <w:szCs w:val="24"/>
+                <w:lang w:val="en-US" w:eastAsia="ja-JP" w:bidi="ar-SA"/>
+              </w:rPr>
+              <w:t>); adapter for a commercial screening provider (endpoint and API key by environment variable name, sandbox or live, request log with retry)</w:t>
+            </w:r>
+          </w:p>
+        </w:tc>
+        <w:tc>
+          <w:tcPr>
+            <w:tcW w:w="3005" w:type="dxa"/>
+            <w:tcBorders>
+              <w:top w:val="single" w:sz="4" w:space="0" w:color="BFC7D1"/>
+              <w:left w:val="single" w:sz="4" w:space="0" w:color="BFC7D1"/>
+              <w:bottom w:val="single" w:sz="4" w:space="0" w:color="BFC7D1"/>
+              <w:right w:val="single" w:sz="4" w:space="0" w:color="BFC7D1"/>
+            </w:tcBorders>
+          </w:tcPr>
+          <w:p>
+            <w:pPr>
+              <w:pStyle w:val="Normal"/>
+              <w:widowControl/>
+              <w:spacing w:lineRule="auto" w:line="240" w:before="0" w:after="20"/>
+              <w:jc w:val="left"/>
+              <w:rPr>
+                <w:rFonts w:ascii="Aptos" w:hAnsi="Aptos" w:eastAsia="ＭＳ 明朝" w:cs="Arial"/>
+                <w:kern w:val="0"/>
+                <w:sz w:val="24"/>
+                <w:szCs w:val="24"/>
+                <w:lang w:val="en-US" w:eastAsia="ja-JP" w:bidi="ar-SA"/>
+              </w:rPr>
+            </w:pPr>
+            <w:r>
+              <w:rPr>
+                <w:rFonts w:eastAsia="Segoe UI" w:cs="Segoe UI" w:ascii="Segoe UI" w:hAnsi="Segoe UI"/>
+                <w:color w:val="101820"/>
+                <w:kern w:val="0"/>
+                <w:sz w:val="18"/>
+                <w:szCs w:val="24"/>
+                <w:lang w:val="en-US" w:eastAsia="ja-JP" w:bidi="ar-SA"/>
+              </w:rPr>
+              <w:t>Obtain the lists and the PEP source it is entitled to use and upload each new publication; contract and certify the commercial provider if one is used; freeze and report as the AMLC and ATC require</w:t>
+            </w:r>
+          </w:p>
+        </w:tc>
+      </w:tr>
+      <w:tr>
+        <w:trPr/>
+        <w:tc>
+          <w:tcPr>
+            <w:tcW w:w="3005" w:type="dxa"/>
+            <w:tcBorders>
+              <w:top w:val="single" w:sz="4" w:space="0" w:color="BFC7D1"/>
+              <w:left w:val="single" w:sz="4" w:space="0" w:color="BFC7D1"/>
+              <w:bottom w:val="single" w:sz="4" w:space="0" w:color="BFC7D1"/>
+              <w:right w:val="single" w:sz="4" w:space="0" w:color="BFC7D1"/>
+            </w:tcBorders>
+          </w:tcPr>
+          <w:p>
+            <w:pPr>
+              <w:pStyle w:val="Normal"/>
+              <w:widowControl/>
+              <w:spacing w:lineRule="auto" w:line="240" w:before="0" w:after="20"/>
+              <w:jc w:val="left"/>
+              <w:rPr>
+                <w:rFonts w:ascii="Aptos" w:hAnsi="Aptos" w:eastAsia="ＭＳ 明朝" w:cs="Arial"/>
+                <w:kern w:val="0"/>
+                <w:sz w:val="24"/>
+                <w:szCs w:val="24"/>
+                <w:lang w:val="en-US" w:eastAsia="ja-JP" w:bidi="ar-SA"/>
+              </w:rPr>
+            </w:pPr>
+            <w:r>
+              <w:rPr>
+                <w:rFonts w:eastAsia="Segoe UI" w:cs="Segoe UI" w:ascii="Segoe UI" w:hAnsi="Segoe UI"/>
+                <w:color w:val="101820"/>
+                <w:kern w:val="0"/>
+                <w:sz w:val="18"/>
+                <w:szCs w:val="24"/>
+                <w:lang w:val="en-US" w:eastAsia="ja-JP" w:bidi="ar-SA"/>
+              </w:rPr>
+              <w:t>Record keeping. Keep customer identification and transaction records for at least five years, or longer where a case is pending.</w:t>
+            </w:r>
+          </w:p>
+        </w:tc>
+        <w:tc>
+          <w:tcPr>
+            <w:tcW w:w="3005" w:type="dxa"/>
+            <w:tcBorders>
+              <w:top w:val="single" w:sz="4" w:space="0" w:color="BFC7D1"/>
+              <w:left w:val="single" w:sz="4" w:space="0" w:color="BFC7D1"/>
+              <w:bottom w:val="single" w:sz="4" w:space="0" w:color="BFC7D1"/>
+              <w:right w:val="single" w:sz="4" w:space="0" w:color="BFC7D1"/>
+            </w:tcBorders>
+          </w:tcPr>
+          <w:p>
+            <w:pPr>
+              <w:pStyle w:val="Normal"/>
+              <w:widowControl/>
+              <w:spacing w:lineRule="auto" w:line="240" w:before="0" w:after="20"/>
+              <w:jc w:val="left"/>
+              <w:rPr>
+                <w:rFonts w:ascii="Aptos" w:hAnsi="Aptos" w:eastAsia="ＭＳ 明朝" w:cs="Arial"/>
+                <w:kern w:val="0"/>
+                <w:sz w:val="24"/>
+                <w:szCs w:val="24"/>
+                <w:lang w:val="en-US" w:eastAsia="ja-JP" w:bidi="ar-SA"/>
+              </w:rPr>
+            </w:pPr>
+            <w:r>
+              <w:rPr>
+                <w:rFonts w:eastAsia="Segoe UI" w:cs="Segoe UI" w:ascii="Segoe UI" w:hAnsi="Segoe UI"/>
+                <w:color w:val="101820"/>
+                <w:kern w:val="0"/>
+                <w:sz w:val="18"/>
+                <w:szCs w:val="24"/>
+                <w:lang w:val="en-US" w:eastAsia="ja-JP" w:bidi="ar-SA"/>
+              </w:rPr>
+              <w:t xml:space="preserve">Business records, documents and the audit trail are kept; AML ratings, screenings, alerts, cases and report files are kept for </w:t>
+            </w:r>
+            <w:r>
+              <w:rPr>
+                <w:rFonts w:eastAsia="Consolas" w:cs="Consolas" w:ascii="Consolas" w:hAnsi="Consolas"/>
+                <w:color w:val="101820"/>
+                <w:kern w:val="0"/>
+                <w:sz w:val="16"/>
+                <w:szCs w:val="24"/>
+                <w:lang w:val="en-US" w:eastAsia="ja-JP" w:bidi="ar-SA"/>
+              </w:rPr>
+              <w:t>aml.record_retention_years</w:t>
+            </w:r>
+            <w:r>
+              <w:rPr>
+                <w:rFonts w:eastAsia="Segoe UI" w:cs="Segoe UI" w:ascii="Segoe UI" w:hAnsi="Segoe UI"/>
+                <w:color w:val="101820"/>
+                <w:kern w:val="0"/>
+                <w:sz w:val="18"/>
+                <w:szCs w:val="24"/>
+                <w:lang w:val="en-US" w:eastAsia="ja-JP" w:bidi="ar-SA"/>
+              </w:rPr>
+              <w:t xml:space="preserve"> (5) years after the last policy, transaction or case, and Master &gt; Data Privacy refuses to anonymise a client before then or while a case is open</w:t>
+            </w:r>
+          </w:p>
+        </w:tc>
+        <w:tc>
+          <w:tcPr>
+            <w:tcW w:w="3005" w:type="dxa"/>
+            <w:tcBorders>
+              <w:top w:val="single" w:sz="4" w:space="0" w:color="BFC7D1"/>
+              <w:left w:val="single" w:sz="4" w:space="0" w:color="BFC7D1"/>
+              <w:bottom w:val="single" w:sz="4" w:space="0" w:color="BFC7D1"/>
+              <w:right w:val="single" w:sz="4" w:space="0" w:color="BFC7D1"/>
+            </w:tcBorders>
+          </w:tcPr>
+          <w:p>
+            <w:pPr>
+              <w:pStyle w:val="Normal"/>
+              <w:widowControl/>
+              <w:spacing w:lineRule="auto" w:line="240" w:before="0" w:after="20"/>
+              <w:jc w:val="left"/>
+              <w:rPr>
+                <w:rFonts w:ascii="Aptos" w:hAnsi="Aptos" w:eastAsia="ＭＳ 明朝" w:cs="Arial"/>
+                <w:kern w:val="0"/>
+                <w:sz w:val="24"/>
+                <w:szCs w:val="24"/>
+                <w:lang w:val="en-US" w:eastAsia="ja-JP" w:bidi="ar-SA"/>
+              </w:rPr>
+            </w:pPr>
+            <w:r>
+              <w:rPr>
+                <w:rFonts w:eastAsia="Segoe UI" w:cs="Segoe UI" w:ascii="Segoe UI" w:hAnsi="Segoe UI"/>
+                <w:color w:val="101820"/>
+                <w:kern w:val="0"/>
+                <w:sz w:val="18"/>
+                <w:szCs w:val="24"/>
+                <w:lang w:val="en-US" w:eastAsia="ja-JP" w:bidi="ar-SA"/>
+              </w:rPr>
+              <w:t>Set and enforce the retention; keep records of the old system for the remaining period</w:t>
+            </w:r>
+          </w:p>
+        </w:tc>
+      </w:tr>
+      <w:tr>
+        <w:trPr/>
+        <w:tc>
+          <w:tcPr>
+            <w:tcW w:w="3005" w:type="dxa"/>
+            <w:tcBorders>
+              <w:top w:val="single" w:sz="4" w:space="0" w:color="BFC7D1"/>
+              <w:left w:val="single" w:sz="4" w:space="0" w:color="BFC7D1"/>
+              <w:bottom w:val="single" w:sz="4" w:space="0" w:color="BFC7D1"/>
+              <w:right w:val="single" w:sz="4" w:space="0" w:color="BFC7D1"/>
+            </w:tcBorders>
+          </w:tcPr>
+          <w:p>
+            <w:pPr>
+              <w:pStyle w:val="Normal"/>
+              <w:widowControl/>
+              <w:spacing w:lineRule="auto" w:line="240" w:before="0" w:after="20"/>
+              <w:jc w:val="left"/>
+              <w:rPr>
+                <w:rFonts w:ascii="Aptos" w:hAnsi="Aptos" w:eastAsia="ＭＳ 明朝" w:cs="Arial"/>
+                <w:kern w:val="0"/>
+                <w:sz w:val="24"/>
+                <w:szCs w:val="24"/>
+                <w:lang w:val="en-US" w:eastAsia="ja-JP" w:bidi="ar-SA"/>
+              </w:rPr>
+            </w:pPr>
+            <w:r>
+              <w:rPr>
+                <w:rFonts w:eastAsia="Segoe UI" w:cs="Segoe UI" w:ascii="Segoe UI" w:hAnsi="Segoe UI"/>
+                <w:color w:val="101820"/>
+                <w:kern w:val="0"/>
+                <w:sz w:val="18"/>
+                <w:szCs w:val="24"/>
+                <w:lang w:val="en-US" w:eastAsia="ja-JP" w:bidi="ar-SA"/>
+              </w:rPr>
               <w:t>Covered and suspicious transaction reporting to the AMLC.</w:t>
             </w:r>
           </w:p>
@@ -12023,7 +14630,73 @@
                 <w:szCs w:val="24"/>
                 <w:lang w:val="en-US" w:eastAsia="ja-JP" w:bidi="ar-SA"/>
               </w:rPr>
-              <w:t>Transaction data for review: Receipts Register (payment mode, amount, reference), Collection Report, SOA/Premium Receivable, client accounting history (Accounts &gt; All Clients Accounting)</w:t>
+              <w:t xml:space="preserve">Daily monitoring (Compliance &gt; Transaction Alerts): covered transactions (cash above </w:t>
+            </w:r>
+            <w:r>
+              <w:rPr>
+                <w:rFonts w:eastAsia="Consolas" w:cs="Consolas" w:ascii="Consolas" w:hAnsi="Consolas"/>
+                <w:color w:val="101820"/>
+                <w:kern w:val="0"/>
+                <w:sz w:val="16"/>
+                <w:szCs w:val="24"/>
+                <w:lang w:val="en-US" w:eastAsia="ja-JP" w:bidi="ar-SA"/>
+              </w:rPr>
+              <w:t>aml.covered_threshold</w:t>
+            </w:r>
+            <w:r>
+              <w:rPr>
+                <w:rFonts w:eastAsia="Segoe UI" w:cs="Segoe UI" w:ascii="Segoe UI" w:hAnsi="Segoe UI"/>
+                <w:color w:val="101820"/>
+                <w:kern w:val="0"/>
+                <w:sz w:val="18"/>
+                <w:szCs w:val="24"/>
+                <w:lang w:val="en-US" w:eastAsia="ja-JP" w:bidi="ar-SA"/>
+              </w:rPr>
+              <w:t>, PHP 500,000, within one banking day, setting) and configurable red flags (several cash payments below the threshold, early cancellation with return premium, refund or claim paid to a third party, overpayment refunded, payer differs from the client); AML cases with the narrative, grounds of suspicion and due dates in working days (</w:t>
+            </w:r>
+            <w:r>
+              <w:rPr>
+                <w:rFonts w:eastAsia="Consolas" w:cs="Consolas" w:ascii="Consolas" w:hAnsi="Consolas"/>
+                <w:color w:val="101820"/>
+                <w:kern w:val="0"/>
+                <w:sz w:val="16"/>
+                <w:szCs w:val="24"/>
+                <w:lang w:val="en-US" w:eastAsia="ja-JP" w:bidi="ar-SA"/>
+              </w:rPr>
+              <w:t>aml.ctr_due_working_days</w:t>
+            </w:r>
+            <w:r>
+              <w:rPr>
+                <w:rFonts w:eastAsia="Segoe UI" w:cs="Segoe UI" w:ascii="Segoe UI" w:hAnsi="Segoe UI"/>
+                <w:color w:val="101820"/>
+                <w:kern w:val="0"/>
+                <w:sz w:val="18"/>
+                <w:szCs w:val="24"/>
+                <w:lang w:val="en-US" w:eastAsia="ja-JP" w:bidi="ar-SA"/>
+              </w:rPr>
+              <w:t xml:space="preserve"> 5, </w:t>
+            </w:r>
+            <w:r>
+              <w:rPr>
+                <w:rFonts w:eastAsia="Consolas" w:cs="Consolas" w:ascii="Consolas" w:hAnsi="Consolas"/>
+                <w:color w:val="101820"/>
+                <w:kern w:val="0"/>
+                <w:sz w:val="16"/>
+                <w:szCs w:val="24"/>
+                <w:lang w:val="en-US" w:eastAsia="ja-JP" w:bidi="ar-SA"/>
+              </w:rPr>
+              <w:t>aml.str_due_working_days</w:t>
+            </w:r>
+            <w:r>
+              <w:rPr>
+                <w:rFonts w:eastAsia="Segoe UI" w:cs="Segoe UI" w:ascii="Segoe UI" w:hAnsi="Segoe UI"/>
+                <w:color w:val="101820"/>
+                <w:kern w:val="0"/>
+                <w:sz w:val="18"/>
+                <w:szCs w:val="24"/>
+                <w:lang w:val="en-US" w:eastAsia="ja-JP" w:bidi="ar-SA"/>
+              </w:rPr>
+              <w:t xml:space="preserve"> 1); CTR and STR files in the layout BV-AMLC-TXN 1.0 (pipe-delimited header, detail, narrative and trailer records) downloaded from Compliance &gt; AMLC Reports, then the filing and the AMLC acknowledgement recorded</w:t>
             </w:r>
           </w:p>
         </w:tc>
@@ -12060,7 +14733,7 @@
                 <w:szCs w:val="24"/>
                 <w:lang w:val="en-US" w:eastAsia="ja-JP" w:bidi="ar-SA"/>
               </w:rPr>
-              <w:t>Monitor transactions, identify covered and suspicious transactions and report them to the AMLC; the system has no transaction monitoring, sanctions or PEP screening, or AMLC reporting function</w:t>
+              <w:t>Register with the AMLC and set the institution code; confirm the thresholds, filing days, transaction codes and the field layout against the AMLC's current reporting guidelines and validate a test file in the AMLC portal; file the reports through the AMLC portal</w:t>
             </w:r>
           </w:p>
         </w:tc>
@@ -12188,8 +14861,8 @@
       <w:r>
         <w:br w:type="page"/>
       </w:r>
-      <w:bookmarkStart w:id="21" w:name="__RefHeading___Toc144179_3199679052"/>
-      <w:bookmarkEnd w:id="21"/>
+      <w:bookmarkStart w:id="22" w:name="__RefHeading___Toc12278_3960898926"/>
+      <w:bookmarkEnd w:id="22"/>
       <w:r>
         <w:rPr>
           <w:rFonts w:eastAsia="Segoe UI" w:cs="Segoe UI" w:ascii="Segoe UI" w:hAnsi="Segoe UI"/>
@@ -12216,7 +14889,7 @@
           <w:color w:val="101820"/>
           <w:sz w:val="21"/>
         </w:rPr>
-        <w:t>All registrations and filings: IC reports, BIR returns, alphalists and certificates, CAS registration or acknowledgement and the registration of invoices and receipts, NPC registration and breach notifications, AMLC reports.</w:t>
+        <w:t>All registrations and filings: IC reports (from the IC Annual Statement and Production Report workbooks, confirmed by the accountant), BIR returns, alphalists and certificates, CAS registration or acknowledgement and the registration of invoices and receipts, NPC registration and breach notifications, AMLC reports (BrokerVerse prepares the CTR and STR files; the filing in the AMLC portal is the broker's).</w:t>
       </w:r>
     </w:p>
     <w:p>
@@ -12336,9 +15009,9 @@
           <w:spacing w:val="0"/>
         </w:rPr>
       </w:pPr>
-      <w:bookmarkStart w:id="22" w:name="__RefHeading___Toc144181_3199679052"/>
-      <w:bookmarkStart w:id="23" w:name="_Toc233203395"/>
-      <w:bookmarkEnd w:id="22"/>
+      <w:bookmarkStart w:id="23" w:name="__RefHeading___Toc12280_3960898926"/>
+      <w:bookmarkStart w:id="24" w:name="_Toc233203395"/>
+      <w:bookmarkEnd w:id="23"/>
       <w:r>
         <w:rPr>
           <w:rStyle w:val="BookTitle"/>
@@ -12349,7 +15022,7 @@
         </w:rPr>
         <w:t>12.  Document Sign-Off</w:t>
       </w:r>
-      <w:bookmarkEnd w:id="23"/>
+      <w:bookmarkEnd w:id="24"/>
     </w:p>
     <w:p>
       <w:pPr>
@@ -14094,7 +16767,7 @@
       <w:r>
         <w:rPr/>
         <w:drawing>
-          <wp:anchor behindDoc="1" distT="0" distB="0" distL="0" distR="0" simplePos="0" locked="0" layoutInCell="0" allowOverlap="1" relativeHeight="21">
+          <wp:anchor behindDoc="1" distT="0" distB="0" distL="0" distR="0" simplePos="0" locked="0" layoutInCell="0" allowOverlap="1" relativeHeight="27">
             <wp:simplePos x="0" y="0"/>
             <wp:positionH relativeFrom="margin">
               <wp:align>center</wp:align>
@@ -14165,7 +16838,7 @@
     <w:r>
       <w:rPr/>
       <w:drawing>
-        <wp:anchor behindDoc="1" distT="0" distB="0" distL="0" distR="0" simplePos="0" locked="0" layoutInCell="0" allowOverlap="1" relativeHeight="20">
+        <wp:anchor behindDoc="1" distT="0" distB="0" distL="0" distR="0" simplePos="0" locked="0" layoutInCell="0" allowOverlap="1" relativeHeight="26">
           <wp:simplePos x="0" y="0"/>
           <wp:positionH relativeFrom="page">
             <wp:align>left</wp:align>
@@ -14224,7 +16897,7 @@
     <w:r>
       <w:rPr/>
       <w:drawing>
-        <wp:anchor behindDoc="1" distT="0" distB="0" distL="0" distR="0" simplePos="0" locked="0" layoutInCell="0" allowOverlap="1" relativeHeight="20">
+        <wp:anchor behindDoc="1" distT="0" distB="0" distL="0" distR="0" simplePos="0" locked="0" layoutInCell="0" allowOverlap="1" relativeHeight="26">
           <wp:simplePos x="0" y="0"/>
           <wp:positionH relativeFrom="page">
             <wp:align>left</wp:align>

</xml_diff>